<commit_message>
Update container expense form Word doc and PDF with official app logo and branding header
</commit_message>
<xml_diff>
--- a/Container_Expense_Statement_Form.docx
+++ b/Container_Expense_Statement_Form.docx
@@ -2,88 +2,6 @@
 <file path=word/document.xml><?xml version="1.0" encoding="utf-8"?>
 <w:document xmlns:wpc="http://schemas.microsoft.com/office/word/2010/wordprocessingCanvas" xmlns:mo="http://schemas.microsoft.com/office/mac/office/2008/main" xmlns:mc="http://schemas.openxmlformats.org/markup-compatibility/2006" xmlns:mv="urn:schemas-microsoft-com:mac:vml" xmlns:o="urn:schemas-microsoft-com:office:office" xmlns:r="http://schemas.openxmlformats.org/officeDocument/2006/relationships" xmlns:m="http://schemas.openxmlformats.org/officeDocument/2006/math" xmlns:v="urn:schemas-microsoft-com:vml" xmlns:wp14="http://schemas.microsoft.com/office/word/2010/wordprocessingDrawing" xmlns:wp="http://schemas.openxmlformats.org/drawingml/2006/wordprocessingDrawing" xmlns:w10="urn:schemas-microsoft-com:office:word" xmlns:w="http://schemas.openxmlformats.org/wordprocessingml/2006/main" xmlns:w14="http://schemas.microsoft.com/office/word/2010/wordml" xmlns:wpg="http://schemas.microsoft.com/office/word/2010/wordprocessingGroup" xmlns:wpi="http://schemas.microsoft.com/office/word/2010/wordprocessingInk" xmlns:wne="http://schemas.microsoft.com/office/word/2006/wordml" xmlns:wps="http://schemas.microsoft.com/office/word/2010/wordprocessingShape" mc:Ignorable="w14 wp14">
   <w:body>
-    <w:p>
-      <w:pPr>
-        <w:spacing w:before="0" w:after="40"/>
-        <w:jc w:val="center"/>
-      </w:pPr>
-      <w:r>
-        <w:rPr>
-          <w:rFonts w:ascii="Segoe UI" w:hAnsi="Segoe UI" w:cs="Kalpurush"/>
-          <w:b w:val="0"/>
-          <w:i/>
-          <w:color w:val="334155"/>
-          <w:sz w:val="18"/>
-        </w:rPr>
-        <w:t>بِسْمِ اللَّهِ الرَّحْمَٰنِ الرَّحِيمِ  |  বিসমিল্লাহির রাহমানির রাহিম</w:t>
-      </w:r>
-    </w:p>
-    <w:p>
-      <w:pPr>
-        <w:spacing w:before="0" w:after="40"/>
-        <w:jc w:val="center"/>
-      </w:pPr>
-      <w:r>
-        <w:rPr>
-          <w:rFonts w:ascii="Segoe UI" w:hAnsi="Segoe UI" w:cs="Kalpurush"/>
-          <w:b/>
-          <w:i w:val="0"/>
-          <w:color w:val="0F2C59"/>
-          <w:sz w:val="40"/>
-        </w:rPr>
-        <w:t xml:space="preserve">মেসার্স মা মটরস্  </w:t>
-      </w:r>
-      <w:r>
-        <w:rPr>
-          <w:rFonts w:ascii="Segoe UI" w:hAnsi="Segoe UI" w:cs="Kalpurush"/>
-          <w:b/>
-          <w:i w:val="0"/>
-          <w:color w:val="0F2C59"/>
-          <w:sz w:val="36"/>
-        </w:rPr>
-        <w:t>M/S. MAA MOTOR'S</w:t>
-      </w:r>
-    </w:p>
-    <w:p>
-      <w:pPr>
-        <w:spacing w:before="0" w:after="40"/>
-        <w:jc w:val="center"/>
-      </w:pPr>
-      <w:r>
-        <w:rPr>
-          <w:rFonts w:ascii="Segoe UI" w:hAnsi="Segoe UI" w:cs="Kalpurush"/>
-          <w:b/>
-          <w:i w:val="0"/>
-          <w:color w:val="334155"/>
-          <w:sz w:val="19"/>
-        </w:rPr>
-        <w:t>আমদানিকারক ও পাইকারী বিক্রেতা — সকল প্রকার গাড়ির জাপানি নতুন ও রিকন্ডিশন্ড পার্টস</w:t>
-      </w:r>
-    </w:p>
-    <w:p>
-      <w:pPr>
-        <w:spacing w:before="0" w:after="80"/>
-        <w:jc w:val="center"/>
-      </w:pPr>
-      <w:r>
-        <w:rPr>
-          <w:rFonts w:ascii="Segoe UI" w:hAnsi="Segoe UI" w:cs="Kalpurush"/>
-          <w:b w:val="0"/>
-          <w:i w:val="0"/>
-          <w:color w:val="334155"/>
-          <w:sz w:val="17"/>
-        </w:rPr>
-        <w:t>রহমান টাওয়ার, দোকান নং-২২, ১ম রেল গেইট, মুরাদপুর, হাটহাজারী রোড, চট্টগ্রাম।  |  মোবাইল: ০১৮১৮-১৯৫৬৯০</w:t>
-      </w:r>
-    </w:p>
-    <w:p>
-      <w:pPr>
-        <w:spacing w:before="0" w:after="120"/>
-        <w:pBdr>
-          <w:bottom w:val="single" w:sz="18" w:space="1" w:color="0F2C59"/>
-        </w:pBdr>
-      </w:pPr>
-    </w:p>
     <w:tbl>
       <w:tblPr>
         <w:tblW w:type="auto" w:w="0"/>
@@ -92,19 +10,78 @@
         <w:tblLook w:firstColumn="1" w:firstRow="1" w:lastColumn="0" w:lastRow="0" w:noHBand="0" w:noVBand="1" w:val="04A0"/>
       </w:tblPr>
       <w:tblGrid>
-        <w:gridCol w:w="5162"/>
-        <w:gridCol w:w="5162"/>
+        <w:gridCol w:w="3538"/>
+        <w:gridCol w:w="3538"/>
+        <w:gridCol w:w="3538"/>
       </w:tblGrid>
       <w:tr>
         <w:tc>
           <w:tcPr>
-            <w:tcW w:type="dxa" w:w="6480"/>
+            <w:tcW w:type="dxa" w:w="1584"/>
             <w:tcMar>
-              <w:top w:w="60" w:type="dxa"/>
-              <w:bottom w:w="60" w:type="dxa"/>
+              <w:top w:w="100" w:type="dxa"/>
+              <w:bottom w:w="100" w:type="dxa"/>
               <w:left w:w="100" w:type="dxa"/>
-              <w:right w:w="100" w:type="dxa"/>
+              <w:right w:w="60" w:type="dxa"/>
             </w:tcMar>
+            <w:shd w:fill="0284C7"/>
+            <w:tcBorders>
+              <w:top w:val="none" w:sz="4" w:space="0" w:color="auto"/>
+              <w:bottom w:val="none" w:sz="4" w:space="0" w:color="auto"/>
+              <w:left w:val="none" w:sz="4" w:space="0" w:color="auto"/>
+              <w:right w:val="none" w:sz="4" w:space="0" w:color="auto"/>
+            </w:tcBorders>
+          </w:tcPr>
+          <w:p>
+            <w:pPr>
+              <w:jc w:val="center"/>
+            </w:pPr>
+            <w:r>
+              <w:drawing>
+                <wp:inline xmlns:a="http://schemas.openxmlformats.org/drawingml/2006/main" xmlns:pic="http://schemas.openxmlformats.org/drawingml/2006/picture">
+                  <wp:extent cx="777240" cy="777240"/>
+                  <wp:docPr id="1" name="Picture 1"/>
+                  <wp:cNvGraphicFramePr>
+                    <a:graphicFrameLocks noChangeAspect="1"/>
+                  </wp:cNvGraphicFramePr>
+                  <a:graphic>
+                    <a:graphicData uri="http://schemas.openxmlformats.org/drawingml/2006/picture">
+                      <pic:pic>
+                        <pic:nvPicPr>
+                          <pic:cNvPr id="0" name="shop-official-logo.jpg"/>
+                          <pic:cNvPicPr/>
+                        </pic:nvPicPr>
+                        <pic:blipFill>
+                          <a:blip r:embed="rId9"/>
+                          <a:stretch>
+                            <a:fillRect/>
+                          </a:stretch>
+                        </pic:blipFill>
+                        <pic:spPr>
+                          <a:xfrm>
+                            <a:off x="0" y="0"/>
+                            <a:ext cx="777240" cy="777240"/>
+                          </a:xfrm>
+                          <a:prstGeom prst="rect"/>
+                        </pic:spPr>
+                      </pic:pic>
+                    </a:graphicData>
+                  </a:graphic>
+                </wp:inline>
+              </w:drawing>
+            </w:r>
+          </w:p>
+        </w:tc>
+        <w:tc>
+          <w:tcPr>
+            <w:tcW w:type="dxa" w:w="6264"/>
+            <w:tcMar>
+              <w:top w:w="100" w:type="dxa"/>
+              <w:bottom w:w="100" w:type="dxa"/>
+              <w:left w:w="80" w:type="dxa"/>
+              <w:right w:w="80" w:type="dxa"/>
+            </w:tcMar>
+            <w:shd w:fill="0284C7"/>
             <w:tcBorders>
               <w:top w:val="none" w:sz="4" w:space="0" w:color="auto"/>
               <w:bottom w:val="none" w:sz="4" w:space="0" w:color="auto"/>
@@ -122,10 +99,10 @@
                 <w:rFonts w:ascii="Segoe UI" w:hAnsi="Segoe UI" w:cs="Kalpurush"/>
                 <w:b/>
                 <w:i w:val="0"/>
-                <w:color w:val="0F2C59"/>
-                <w:sz w:val="24"/>
+                <w:color w:val="FFFFFF"/>
+                <w:sz w:val="32"/>
               </w:rPr>
-              <w:t>কন্টেইনার চালান ও খালাস সংক্রান্ত খরচ বিবরণী</w:t>
+              <w:t>M/S. MAA-MOTOR'S</w:t>
               <w:br/>
             </w:r>
             <w:r>
@@ -133,29 +110,51 @@
                 <w:rFonts w:ascii="Segoe UI" w:hAnsi="Segoe UI" w:cs="Kalpurush"/>
                 <w:b/>
                 <w:i w:val="0"/>
-                <w:color w:val="334155"/>
+                <w:color w:val="FFFFFF"/>
                 <w:sz w:val="17"/>
               </w:rPr>
-              <w:t>CONTAINER SHIPMENT &amp; CLEARANCE EXPENSE STATEMENT</w:t>
+              <w:t>Proprietor: Mohammed Amran | প্রোঃ মোঃ মোহাম্মদ এমরান</w:t>
+              <w:br/>
+            </w:r>
+            <w:r>
+              <w:rPr>
+                <w:rFonts w:ascii="Segoe UI" w:hAnsi="Segoe UI" w:cs="Kalpurush"/>
+                <w:b w:val="0"/>
+                <w:i w:val="0"/>
+                <w:color w:val="FFFFFF"/>
+                <w:sz w:val="15"/>
+              </w:rPr>
+              <w:t>আমদানিকারক ও পাইকারী বিক্রেতা — দোকান নং-২২, রহমান টাওয়ার, ১ম রেল গেইট, মুরাদপুর, হাটহাজারী রোড, চট্টগ্রাম</w:t>
+              <w:br/>
+            </w:r>
+            <w:r>
+              <w:rPr>
+                <w:rFonts w:ascii="Segoe UI" w:hAnsi="Segoe UI" w:cs="Kalpurush"/>
+                <w:b/>
+                <w:i w:val="0"/>
+                <w:color w:val="FFFFFF"/>
+                <w:sz w:val="16"/>
+              </w:rPr>
+              <w:t>Mobile: 01819-397669, 01815-707934, 01818-195690</w:t>
             </w:r>
           </w:p>
         </w:tc>
         <w:tc>
           <w:tcPr>
-            <w:tcW w:type="dxa" w:w="3845"/>
+            <w:tcW w:type="dxa" w:w="2765"/>
             <w:tcMar>
-              <w:top w:w="60" w:type="dxa"/>
-              <w:bottom w:w="60" w:type="dxa"/>
-              <w:left w:w="100" w:type="dxa"/>
+              <w:top w:w="100" w:type="dxa"/>
+              <w:bottom w:w="100" w:type="dxa"/>
+              <w:left w:w="60" w:type="dxa"/>
               <w:right w:w="100" w:type="dxa"/>
             </w:tcMar>
+            <w:shd w:fill="0369A1"/>
             <w:tcBorders>
-              <w:top w:val="single" w:sz="6" w:space="0" w:color="CBD5E1"/>
-              <w:bottom w:val="single" w:sz="6" w:space="0" w:color="CBD5E1"/>
-              <w:left w:val="single" w:sz="6" w:space="0" w:color="CBD5E1"/>
-              <w:right w:val="single" w:sz="6" w:space="0" w:color="CBD5E1"/>
+              <w:top w:val="none" w:sz="4" w:space="0" w:color="auto"/>
+              <w:bottom w:val="none" w:sz="4" w:space="0" w:color="auto"/>
+              <w:left w:val="none" w:sz="4" w:space="0" w:color="auto"/>
+              <w:right w:val="none" w:sz="4" w:space="0" w:color="auto"/>
             </w:tcBorders>
-            <w:shd w:fill="F8FAFC"/>
           </w:tcPr>
           <w:p>
             <w:pPr>
@@ -167,10 +166,10 @@
                 <w:rFonts w:ascii="Segoe UI" w:hAnsi="Segoe UI" w:cs="Kalpurush"/>
                 <w:b/>
                 <w:i w:val="0"/>
-                <w:color w:val="0F2C59"/>
-                <w:sz w:val="18"/>
+                <w:color w:val="FFFFFF"/>
+                <w:sz w:val="22"/>
               </w:rPr>
-              <w:t>কোটেশন [  ]   চালান [ ✓ ]</w:t>
+              <w:t>CONTAINER REPORT</w:t>
               <w:br/>
             </w:r>
             <w:r>
@@ -178,7 +177,128 @@
                 <w:rFonts w:ascii="Segoe UI" w:hAnsi="Segoe UI" w:cs="Kalpurush"/>
                 <w:b/>
                 <w:i w:val="0"/>
-                <w:color w:val="334155"/>
+                <w:color w:val="FFFFFF"/>
+                <w:sz w:val="16"/>
+              </w:rPr>
+              <w:t>কন্টেইনার চালান ও খালাস খরচ বিবরণী</w:t>
+            </w:r>
+          </w:p>
+        </w:tc>
+      </w:tr>
+    </w:tbl>
+    <w:p>
+      <w:pPr>
+        <w:spacing w:before="0" w:after="60"/>
+      </w:pPr>
+    </w:p>
+    <w:tbl>
+      <w:tblPr>
+        <w:tblW w:type="auto" w:w="0"/>
+        <w:jc w:val="center"/>
+        <w:tblLayout w:type="fixed"/>
+        <w:tblLook w:firstColumn="1" w:firstRow="1" w:lastColumn="0" w:lastRow="0" w:noHBand="0" w:noVBand="1" w:val="04A0"/>
+      </w:tblPr>
+      <w:tblGrid>
+        <w:gridCol w:w="3538"/>
+        <w:gridCol w:w="3538"/>
+        <w:gridCol w:w="3538"/>
+      </w:tblGrid>
+      <w:tr>
+        <w:tc>
+          <w:tcPr>
+            <w:tcW w:type="dxa" w:w="4608"/>
+            <w:tcMar>
+              <w:top w:w="40" w:type="dxa"/>
+              <w:bottom w:w="40" w:type="dxa"/>
+              <w:left w:w="80" w:type="dxa"/>
+              <w:right w:w="80" w:type="dxa"/>
+            </w:tcMar>
+            <w:shd w:fill="F8FAFC"/>
+            <w:tcBorders>
+              <w:top w:val="single" w:sz="4" w:space="0" w:color="CBD5E1"/>
+              <w:bottom w:val="single" w:sz="4" w:space="0" w:color="CBD5E1"/>
+              <w:left w:val="single" w:sz="4" w:space="0" w:color="CBD5E1"/>
+              <w:right w:val="single" w:sz="4" w:space="0" w:color="CBD5E1"/>
+            </w:tcBorders>
+          </w:tcPr>
+          <w:p>
+            <w:pPr>
+              <w:spacing w:before="0" w:after="0"/>
+            </w:pPr>
+            <w:r>
+              <w:rPr>
+                <w:rFonts w:ascii="Segoe UI" w:hAnsi="Segoe UI" w:cs="Kalpurush"/>
+                <w:b w:val="0"/>
+                <w:i/>
+                <w:color w:val="475569"/>
+                <w:sz w:val="16"/>
+              </w:rPr>
+              <w:t>بِسْمِ اللَّهِ الرَّحْمَٰنِ الرَّحِيمِ (বিসমিল্লাহির রাহমানির রাহিম)</w:t>
+            </w:r>
+          </w:p>
+        </w:tc>
+        <w:tc>
+          <w:tcPr>
+            <w:tcW w:type="dxa" w:w="2304"/>
+            <w:tcMar>
+              <w:top w:w="40" w:type="dxa"/>
+              <w:bottom w:w="40" w:type="dxa"/>
+              <w:left w:w="80" w:type="dxa"/>
+              <w:right w:w="80" w:type="dxa"/>
+            </w:tcMar>
+            <w:shd w:fill="F8FAFC"/>
+            <w:tcBorders>
+              <w:top w:val="single" w:sz="4" w:space="0" w:color="CBD5E1"/>
+              <w:bottom w:val="single" w:sz="4" w:space="0" w:color="CBD5E1"/>
+              <w:left w:val="single" w:sz="4" w:space="0" w:color="CBD5E1"/>
+              <w:right w:val="single" w:sz="4" w:space="0" w:color="CBD5E1"/>
+            </w:tcBorders>
+          </w:tcPr>
+          <w:p>
+            <w:pPr>
+              <w:spacing w:before="0" w:after="0"/>
+              <w:jc w:val="center"/>
+            </w:pPr>
+            <w:r>
+              <w:rPr>
+                <w:rFonts w:ascii="Segoe UI" w:hAnsi="Segoe UI" w:cs="Kalpurush"/>
+                <w:b/>
+                <w:i w:val="0"/>
+                <w:color w:val="0369A1"/>
+                <w:sz w:val="17"/>
+              </w:rPr>
+              <w:t>কোটেশন [  ]  চালান [ ✓ ]</w:t>
+            </w:r>
+          </w:p>
+        </w:tc>
+        <w:tc>
+          <w:tcPr>
+            <w:tcW w:type="dxa" w:w="3701"/>
+            <w:tcMar>
+              <w:top w:w="40" w:type="dxa"/>
+              <w:bottom w:w="40" w:type="dxa"/>
+              <w:left w:w="80" w:type="dxa"/>
+              <w:right w:w="80" w:type="dxa"/>
+            </w:tcMar>
+            <w:shd w:fill="F8FAFC"/>
+            <w:tcBorders>
+              <w:top w:val="single" w:sz="4" w:space="0" w:color="CBD5E1"/>
+              <w:bottom w:val="single" w:sz="4" w:space="0" w:color="CBD5E1"/>
+              <w:left w:val="single" w:sz="4" w:space="0" w:color="CBD5E1"/>
+              <w:right w:val="single" w:sz="4" w:space="0" w:color="CBD5E1"/>
+            </w:tcBorders>
+          </w:tcPr>
+          <w:p>
+            <w:pPr>
+              <w:spacing w:before="0" w:after="0"/>
+              <w:jc w:val="right"/>
+            </w:pPr>
+            <w:r>
+              <w:rPr>
+                <w:rFonts w:ascii="Segoe UI" w:hAnsi="Segoe UI" w:cs="Kalpurush"/>
+                <w:b/>
+                <w:i w:val="0"/>
+                <w:color w:val="1E293B"/>
                 <w:sz w:val="17"/>
               </w:rPr>
               <w:t>ডেলিভারি পার্টি: .......................................</w:t>
@@ -189,7 +309,7 @@
     </w:tbl>
     <w:p>
       <w:pPr>
-        <w:spacing w:before="0" w:after="80"/>
+        <w:spacing w:before="0" w:after="60"/>
       </w:pPr>
     </w:p>
     <w:tbl>
@@ -200,20 +320,20 @@
         <w:tblLook w:firstColumn="1" w:firstRow="1" w:lastColumn="0" w:lastRow="0" w:noHBand="0" w:noVBand="1" w:val="04A0"/>
       </w:tblPr>
       <w:tblGrid>
-        <w:gridCol w:w="2581"/>
-        <w:gridCol w:w="2581"/>
-        <w:gridCol w:w="2581"/>
-        <w:gridCol w:w="2581"/>
+        <w:gridCol w:w="2653"/>
+        <w:gridCol w:w="2653"/>
+        <w:gridCol w:w="2653"/>
+        <w:gridCol w:w="2653"/>
       </w:tblGrid>
       <w:tr>
         <w:tc>
           <w:tcPr>
             <w:tcW w:type="dxa" w:w="2592"/>
             <w:tcMar>
-              <w:top w:w="70" w:type="dxa"/>
-              <w:bottom w:w="70" w:type="dxa"/>
-              <w:left w:w="100" w:type="dxa"/>
-              <w:right w:w="100" w:type="dxa"/>
+              <w:top w:w="50" w:type="dxa"/>
+              <w:bottom w:w="50" w:type="dxa"/>
+              <w:left w:w="80" w:type="dxa"/>
+              <w:right w:w="80" w:type="dxa"/>
             </w:tcMar>
             <w:tcBorders>
               <w:top w:val="single" w:sz="4" w:space="0" w:color="CBD5E1"/>
@@ -221,33 +341,32 @@
               <w:left w:val="single" w:sz="4" w:space="0" w:color="CBD5E1"/>
               <w:right w:val="single" w:sz="4" w:space="0" w:color="CBD5E1"/>
             </w:tcBorders>
-            <w:shd w:fill="F1F5F9"/>
+            <w:shd w:fill="F0F9FF"/>
           </w:tcPr>
           <w:p>
             <w:pPr>
               <w:spacing w:before="0" w:after="0"/>
-              <w:jc w:val="left"/>
             </w:pPr>
             <w:r>
               <w:rPr>
                 <w:rFonts w:ascii="Segoe UI" w:hAnsi="Segoe UI" w:cs="Kalpurush"/>
                 <w:b/>
                 <w:i w:val="0"/>
-                <w:color w:val="0F2C59"/>
-                <w:sz w:val="17"/>
+                <w:color w:val="0369A1"/>
+                <w:sz w:val="16"/>
               </w:rPr>
-              <w:t>কন্টেইনার নং (Container No):</w:t>
+              <w:t>কন্টেইনার নং:</w:t>
             </w:r>
           </w:p>
         </w:tc>
         <w:tc>
           <w:tcPr>
-            <w:tcW w:type="dxa" w:w="2664"/>
+            <w:tcW w:type="dxa" w:w="2707"/>
             <w:tcMar>
-              <w:top w:w="70" w:type="dxa"/>
-              <w:bottom w:w="70" w:type="dxa"/>
-              <w:left w:w="100" w:type="dxa"/>
-              <w:right w:w="100" w:type="dxa"/>
+              <w:top w:w="50" w:type="dxa"/>
+              <w:bottom w:w="50" w:type="dxa"/>
+              <w:left w:w="80" w:type="dxa"/>
+              <w:right w:w="80" w:type="dxa"/>
             </w:tcMar>
             <w:tcBorders>
               <w:top w:val="single" w:sz="4" w:space="0" w:color="CBD5E1"/>
@@ -259,15 +378,14 @@
           <w:p>
             <w:pPr>
               <w:spacing w:before="0" w:after="0"/>
-              <w:jc w:val="left"/>
             </w:pPr>
             <w:r>
               <w:rPr>
                 <w:rFonts w:ascii="Segoe UI" w:hAnsi="Segoe UI" w:cs="Kalpurush"/>
                 <w:b w:val="0"/>
                 <w:i w:val="0"/>
-                <w:color w:val="334155"/>
-                <w:sz w:val="17"/>
+                <w:color w:val="1E293B"/>
+                <w:sz w:val="16"/>
               </w:rPr>
             </w:r>
           </w:p>
@@ -276,10 +394,10 @@
           <w:tcPr>
             <w:tcW w:type="dxa" w:w="2592"/>
             <w:tcMar>
-              <w:top w:w="70" w:type="dxa"/>
-              <w:bottom w:w="70" w:type="dxa"/>
-              <w:left w:w="100" w:type="dxa"/>
-              <w:right w:w="100" w:type="dxa"/>
+              <w:top w:w="50" w:type="dxa"/>
+              <w:bottom w:w="50" w:type="dxa"/>
+              <w:left w:w="80" w:type="dxa"/>
+              <w:right w:w="80" w:type="dxa"/>
             </w:tcMar>
             <w:tcBorders>
               <w:top w:val="single" w:sz="4" w:space="0" w:color="CBD5E1"/>
@@ -287,33 +405,32 @@
               <w:left w:val="single" w:sz="4" w:space="0" w:color="CBD5E1"/>
               <w:right w:val="single" w:sz="4" w:space="0" w:color="CBD5E1"/>
             </w:tcBorders>
-            <w:shd w:fill="F1F5F9"/>
+            <w:shd w:fill="F0F9FF"/>
           </w:tcPr>
           <w:p>
             <w:pPr>
               <w:spacing w:before="0" w:after="0"/>
-              <w:jc w:val="left"/>
             </w:pPr>
             <w:r>
               <w:rPr>
                 <w:rFonts w:ascii="Segoe UI" w:hAnsi="Segoe UI" w:cs="Kalpurush"/>
                 <w:b/>
                 <w:i w:val="0"/>
-                <w:color w:val="0F2C59"/>
-                <w:sz w:val="17"/>
+                <w:color w:val="0369A1"/>
+                <w:sz w:val="16"/>
               </w:rPr>
-              <w:t>কন্টেইনার সাইজ (Size):</w:t>
+              <w:t>কন্টেইনার সাইজ:</w:t>
             </w:r>
           </w:p>
         </w:tc>
         <w:tc>
           <w:tcPr>
-            <w:tcW w:type="dxa" w:w="2477"/>
+            <w:tcW w:type="dxa" w:w="2722"/>
             <w:tcMar>
-              <w:top w:w="70" w:type="dxa"/>
-              <w:bottom w:w="70" w:type="dxa"/>
-              <w:left w:w="100" w:type="dxa"/>
-              <w:right w:w="100" w:type="dxa"/>
+              <w:top w:w="50" w:type="dxa"/>
+              <w:bottom w:w="50" w:type="dxa"/>
+              <w:left w:w="80" w:type="dxa"/>
+              <w:right w:w="80" w:type="dxa"/>
             </w:tcMar>
             <w:tcBorders>
               <w:top w:val="single" w:sz="4" w:space="0" w:color="CBD5E1"/>
@@ -325,15 +442,14 @@
           <w:p>
             <w:pPr>
               <w:spacing w:before="0" w:after="0"/>
-              <w:jc w:val="left"/>
             </w:pPr>
             <w:r>
               <w:rPr>
                 <w:rFonts w:ascii="Segoe UI" w:hAnsi="Segoe UI" w:cs="Kalpurush"/>
                 <w:b w:val="0"/>
                 <w:i w:val="0"/>
-                <w:color w:val="334155"/>
-                <w:sz w:val="17"/>
+                <w:color w:val="1E293B"/>
+                <w:sz w:val="16"/>
               </w:rPr>
               <w:t>২০ ফুট [  ]   ৪০ ফুট [ ✓ ]</w:t>
             </w:r>
@@ -345,10 +461,10 @@
           <w:tcPr>
             <w:tcW w:type="dxa" w:w="2592"/>
             <w:tcMar>
-              <w:top w:w="70" w:type="dxa"/>
-              <w:bottom w:w="70" w:type="dxa"/>
-              <w:left w:w="100" w:type="dxa"/>
-              <w:right w:w="100" w:type="dxa"/>
+              <w:top w:w="50" w:type="dxa"/>
+              <w:bottom w:w="50" w:type="dxa"/>
+              <w:left w:w="80" w:type="dxa"/>
+              <w:right w:w="80" w:type="dxa"/>
             </w:tcMar>
             <w:tcBorders>
               <w:top w:val="single" w:sz="4" w:space="0" w:color="CBD5E1"/>
@@ -356,20 +472,19 @@
               <w:left w:val="single" w:sz="4" w:space="0" w:color="CBD5E1"/>
               <w:right w:val="single" w:sz="4" w:space="0" w:color="CBD5E1"/>
             </w:tcBorders>
-            <w:shd w:fill="F1F5F9"/>
+            <w:shd w:fill="F0F9FF"/>
           </w:tcPr>
           <w:p>
             <w:pPr>
               <w:spacing w:before="0" w:after="0"/>
-              <w:jc w:val="left"/>
             </w:pPr>
             <w:r>
               <w:rPr>
                 <w:rFonts w:ascii="Segoe UI" w:hAnsi="Segoe UI" w:cs="Kalpurush"/>
                 <w:b/>
                 <w:i w:val="0"/>
-                <w:color w:val="0F2C59"/>
-                <w:sz w:val="17"/>
+                <w:color w:val="0369A1"/>
+                <w:sz w:val="16"/>
               </w:rPr>
               <w:t>এল/সি নং (L/C No):</w:t>
             </w:r>
@@ -377,12 +492,12 @@
         </w:tc>
         <w:tc>
           <w:tcPr>
-            <w:tcW w:type="dxa" w:w="2664"/>
+            <w:tcW w:type="dxa" w:w="2707"/>
             <w:tcMar>
-              <w:top w:w="70" w:type="dxa"/>
-              <w:bottom w:w="70" w:type="dxa"/>
-              <w:left w:w="100" w:type="dxa"/>
-              <w:right w:w="100" w:type="dxa"/>
+              <w:top w:w="50" w:type="dxa"/>
+              <w:bottom w:w="50" w:type="dxa"/>
+              <w:left w:w="80" w:type="dxa"/>
+              <w:right w:w="80" w:type="dxa"/>
             </w:tcMar>
             <w:tcBorders>
               <w:top w:val="single" w:sz="4" w:space="0" w:color="CBD5E1"/>
@@ -394,15 +509,14 @@
           <w:p>
             <w:pPr>
               <w:spacing w:before="0" w:after="0"/>
-              <w:jc w:val="left"/>
             </w:pPr>
             <w:r>
               <w:rPr>
                 <w:rFonts w:ascii="Segoe UI" w:hAnsi="Segoe UI" w:cs="Kalpurush"/>
                 <w:b w:val="0"/>
                 <w:i w:val="0"/>
-                <w:color w:val="334155"/>
-                <w:sz w:val="17"/>
+                <w:color w:val="1E293B"/>
+                <w:sz w:val="16"/>
               </w:rPr>
             </w:r>
           </w:p>
@@ -411,10 +525,10 @@
           <w:tcPr>
             <w:tcW w:type="dxa" w:w="2592"/>
             <w:tcMar>
-              <w:top w:w="70" w:type="dxa"/>
-              <w:bottom w:w="70" w:type="dxa"/>
-              <w:left w:w="100" w:type="dxa"/>
-              <w:right w:w="100" w:type="dxa"/>
+              <w:top w:w="50" w:type="dxa"/>
+              <w:bottom w:w="50" w:type="dxa"/>
+              <w:left w:w="80" w:type="dxa"/>
+              <w:right w:w="80" w:type="dxa"/>
             </w:tcMar>
             <w:tcBorders>
               <w:top w:val="single" w:sz="4" w:space="0" w:color="CBD5E1"/>
@@ -422,33 +536,32 @@
               <w:left w:val="single" w:sz="4" w:space="0" w:color="CBD5E1"/>
               <w:right w:val="single" w:sz="4" w:space="0" w:color="CBD5E1"/>
             </w:tcBorders>
-            <w:shd w:fill="F1F5F9"/>
+            <w:shd w:fill="F0F9FF"/>
           </w:tcPr>
           <w:p>
             <w:pPr>
               <w:spacing w:before="0" w:after="0"/>
-              <w:jc w:val="left"/>
             </w:pPr>
             <w:r>
               <w:rPr>
                 <w:rFonts w:ascii="Segoe UI" w:hAnsi="Segoe UI" w:cs="Kalpurush"/>
                 <w:b/>
                 <w:i w:val="0"/>
-                <w:color w:val="0F2C59"/>
-                <w:sz w:val="17"/>
+                <w:color w:val="0369A1"/>
+                <w:sz w:val="16"/>
               </w:rPr>
-              <w:t>ইনভয়েস মূল্য (U$D Value):</w:t>
+              <w:t>ইনভয়েস মূল্য (U$D):</w:t>
             </w:r>
           </w:p>
         </w:tc>
         <w:tc>
           <w:tcPr>
-            <w:tcW w:type="dxa" w:w="2477"/>
+            <w:tcW w:type="dxa" w:w="2722"/>
             <w:tcMar>
-              <w:top w:w="70" w:type="dxa"/>
-              <w:bottom w:w="70" w:type="dxa"/>
-              <w:left w:w="100" w:type="dxa"/>
-              <w:right w:w="100" w:type="dxa"/>
+              <w:top w:w="50" w:type="dxa"/>
+              <w:bottom w:w="50" w:type="dxa"/>
+              <w:left w:w="80" w:type="dxa"/>
+              <w:right w:w="80" w:type="dxa"/>
             </w:tcMar>
             <w:tcBorders>
               <w:top w:val="single" w:sz="4" w:space="0" w:color="CBD5E1"/>
@@ -460,15 +573,14 @@
           <w:p>
             <w:pPr>
               <w:spacing w:before="0" w:after="0"/>
-              <w:jc w:val="left"/>
             </w:pPr>
             <w:r>
               <w:rPr>
                 <w:rFonts w:ascii="Segoe UI" w:hAnsi="Segoe UI" w:cs="Kalpurush"/>
                 <w:b w:val="0"/>
                 <w:i w:val="0"/>
-                <w:color w:val="334155"/>
-                <w:sz w:val="17"/>
+                <w:color w:val="1E293B"/>
+                <w:sz w:val="16"/>
               </w:rPr>
               <w:t xml:space="preserve">$ </w:t>
             </w:r>
@@ -480,10 +592,10 @@
           <w:tcPr>
             <w:tcW w:type="dxa" w:w="2592"/>
             <w:tcMar>
-              <w:top w:w="70" w:type="dxa"/>
-              <w:bottom w:w="70" w:type="dxa"/>
-              <w:left w:w="100" w:type="dxa"/>
-              <w:right w:w="100" w:type="dxa"/>
+              <w:top w:w="50" w:type="dxa"/>
+              <w:bottom w:w="50" w:type="dxa"/>
+              <w:left w:w="80" w:type="dxa"/>
+              <w:right w:w="80" w:type="dxa"/>
             </w:tcMar>
             <w:tcBorders>
               <w:top w:val="single" w:sz="4" w:space="0" w:color="CBD5E1"/>
@@ -491,33 +603,32 @@
               <w:left w:val="single" w:sz="4" w:space="0" w:color="CBD5E1"/>
               <w:right w:val="single" w:sz="4" w:space="0" w:color="CBD5E1"/>
             </w:tcBorders>
-            <w:shd w:fill="F1F5F9"/>
+            <w:shd w:fill="F0F9FF"/>
           </w:tcPr>
           <w:p>
             <w:pPr>
               <w:spacing w:before="0" w:after="0"/>
-              <w:jc w:val="left"/>
             </w:pPr>
             <w:r>
               <w:rPr>
                 <w:rFonts w:ascii="Segoe UI" w:hAnsi="Segoe UI" w:cs="Kalpurush"/>
                 <w:b/>
                 <w:i w:val="0"/>
-                <w:color w:val="0F2C59"/>
-                <w:sz w:val="17"/>
+                <w:color w:val="0369A1"/>
+                <w:sz w:val="16"/>
               </w:rPr>
-              <w:t>লোডিং তারিখ (Loading Date):</w:t>
+              <w:t>লোডিং তারিখ:</w:t>
             </w:r>
           </w:p>
         </w:tc>
         <w:tc>
           <w:tcPr>
-            <w:tcW w:type="dxa" w:w="2664"/>
+            <w:tcW w:type="dxa" w:w="2707"/>
             <w:tcMar>
-              <w:top w:w="70" w:type="dxa"/>
-              <w:bottom w:w="70" w:type="dxa"/>
-              <w:left w:w="100" w:type="dxa"/>
-              <w:right w:w="100" w:type="dxa"/>
+              <w:top w:w="50" w:type="dxa"/>
+              <w:bottom w:w="50" w:type="dxa"/>
+              <w:left w:w="80" w:type="dxa"/>
+              <w:right w:w="80" w:type="dxa"/>
             </w:tcMar>
             <w:tcBorders>
               <w:top w:val="single" w:sz="4" w:space="0" w:color="CBD5E1"/>
@@ -529,15 +640,14 @@
           <w:p>
             <w:pPr>
               <w:spacing w:before="0" w:after="0"/>
-              <w:jc w:val="left"/>
             </w:pPr>
             <w:r>
               <w:rPr>
                 <w:rFonts w:ascii="Segoe UI" w:hAnsi="Segoe UI" w:cs="Kalpurush"/>
                 <w:b w:val="0"/>
                 <w:i w:val="0"/>
-                <w:color w:val="334155"/>
-                <w:sz w:val="17"/>
+                <w:color w:val="1E293B"/>
+                <w:sz w:val="16"/>
               </w:rPr>
               <w:t>...... / ...... / ২০......</w:t>
             </w:r>
@@ -547,10 +657,10 @@
           <w:tcPr>
             <w:tcW w:type="dxa" w:w="2592"/>
             <w:tcMar>
-              <w:top w:w="70" w:type="dxa"/>
-              <w:bottom w:w="70" w:type="dxa"/>
-              <w:left w:w="100" w:type="dxa"/>
-              <w:right w:w="100" w:type="dxa"/>
+              <w:top w:w="50" w:type="dxa"/>
+              <w:bottom w:w="50" w:type="dxa"/>
+              <w:left w:w="80" w:type="dxa"/>
+              <w:right w:w="80" w:type="dxa"/>
             </w:tcMar>
             <w:tcBorders>
               <w:top w:val="single" w:sz="4" w:space="0" w:color="CBD5E1"/>
@@ -558,33 +668,32 @@
               <w:left w:val="single" w:sz="4" w:space="0" w:color="CBD5E1"/>
               <w:right w:val="single" w:sz="4" w:space="0" w:color="CBD5E1"/>
             </w:tcBorders>
-            <w:shd w:fill="F1F5F9"/>
+            <w:shd w:fill="F0F9FF"/>
           </w:tcPr>
           <w:p>
             <w:pPr>
               <w:spacing w:before="0" w:after="0"/>
-              <w:jc w:val="left"/>
             </w:pPr>
             <w:r>
               <w:rPr>
                 <w:rFonts w:ascii="Segoe UI" w:hAnsi="Segoe UI" w:cs="Kalpurush"/>
                 <w:b/>
                 <w:i w:val="0"/>
-                <w:color w:val="0F2C59"/>
-                <w:sz w:val="17"/>
+                <w:color w:val="0369A1"/>
+                <w:sz w:val="16"/>
               </w:rPr>
-              <w:t>ডেলিভারি তারিখ (Delivery Date):</w:t>
+              <w:t>ডেলিভারি তারিখ:</w:t>
             </w:r>
           </w:p>
         </w:tc>
         <w:tc>
           <w:tcPr>
-            <w:tcW w:type="dxa" w:w="2477"/>
+            <w:tcW w:type="dxa" w:w="2722"/>
             <w:tcMar>
-              <w:top w:w="70" w:type="dxa"/>
-              <w:bottom w:w="70" w:type="dxa"/>
-              <w:left w:w="100" w:type="dxa"/>
-              <w:right w:w="100" w:type="dxa"/>
+              <w:top w:w="50" w:type="dxa"/>
+              <w:bottom w:w="50" w:type="dxa"/>
+              <w:left w:w="80" w:type="dxa"/>
+              <w:right w:w="80" w:type="dxa"/>
             </w:tcMar>
             <w:tcBorders>
               <w:top w:val="single" w:sz="4" w:space="0" w:color="CBD5E1"/>
@@ -596,15 +705,14 @@
           <w:p>
             <w:pPr>
               <w:spacing w:before="0" w:after="0"/>
-              <w:jc w:val="left"/>
             </w:pPr>
             <w:r>
               <w:rPr>
                 <w:rFonts w:ascii="Segoe UI" w:hAnsi="Segoe UI" w:cs="Kalpurush"/>
                 <w:b w:val="0"/>
                 <w:i w:val="0"/>
-                <w:color w:val="334155"/>
-                <w:sz w:val="17"/>
+                <w:color w:val="1E293B"/>
+                <w:sz w:val="16"/>
               </w:rPr>
               <w:t>...... / ...... / ২০......</w:t>
             </w:r>
@@ -616,10 +724,10 @@
           <w:tcPr>
             <w:tcW w:type="dxa" w:w="2592"/>
             <w:tcMar>
-              <w:top w:w="70" w:type="dxa"/>
-              <w:bottom w:w="70" w:type="dxa"/>
-              <w:left w:w="100" w:type="dxa"/>
-              <w:right w:w="100" w:type="dxa"/>
+              <w:top w:w="50" w:type="dxa"/>
+              <w:bottom w:w="50" w:type="dxa"/>
+              <w:left w:w="80" w:type="dxa"/>
+              <w:right w:w="80" w:type="dxa"/>
             </w:tcMar>
             <w:tcBorders>
               <w:top w:val="single" w:sz="4" w:space="0" w:color="CBD5E1"/>
@@ -627,33 +735,32 @@
               <w:left w:val="single" w:sz="4" w:space="0" w:color="CBD5E1"/>
               <w:right w:val="single" w:sz="4" w:space="0" w:color="CBD5E1"/>
             </w:tcBorders>
-            <w:shd w:fill="F1F5F9"/>
+            <w:shd w:fill="F0F9FF"/>
           </w:tcPr>
           <w:p>
             <w:pPr>
               <w:spacing w:before="0" w:after="0"/>
-              <w:jc w:val="left"/>
             </w:pPr>
             <w:r>
               <w:rPr>
                 <w:rFonts w:ascii="Segoe UI" w:hAnsi="Segoe UI" w:cs="Kalpurush"/>
                 <w:b/>
                 <w:i w:val="0"/>
-                <w:color w:val="0F2C59"/>
-                <w:sz w:val="17"/>
+                <w:color w:val="0369A1"/>
+                <w:sz w:val="16"/>
               </w:rPr>
-              <w:t>কোম্পানী / শিপার (Company):</w:t>
+              <w:t>কোম্পানী / শিপার:</w:t>
             </w:r>
           </w:p>
         </w:tc>
         <w:tc>
           <w:tcPr>
-            <w:tcW w:type="dxa" w:w="2664"/>
+            <w:tcW w:type="dxa" w:w="2707"/>
             <w:tcMar>
-              <w:top w:w="70" w:type="dxa"/>
-              <w:bottom w:w="70" w:type="dxa"/>
-              <w:left w:w="100" w:type="dxa"/>
-              <w:right w:w="100" w:type="dxa"/>
+              <w:top w:w="50" w:type="dxa"/>
+              <w:bottom w:w="50" w:type="dxa"/>
+              <w:left w:w="80" w:type="dxa"/>
+              <w:right w:w="80" w:type="dxa"/>
             </w:tcMar>
             <w:tcBorders>
               <w:top w:val="single" w:sz="4" w:space="0" w:color="CBD5E1"/>
@@ -665,15 +772,14 @@
           <w:p>
             <w:pPr>
               <w:spacing w:before="0" w:after="0"/>
-              <w:jc w:val="left"/>
             </w:pPr>
             <w:r>
               <w:rPr>
                 <w:rFonts w:ascii="Segoe UI" w:hAnsi="Segoe UI" w:cs="Kalpurush"/>
                 <w:b w:val="0"/>
                 <w:i w:val="0"/>
-                <w:color w:val="334155"/>
-                <w:sz w:val="17"/>
+                <w:color w:val="1E293B"/>
+                <w:sz w:val="16"/>
               </w:rPr>
             </w:r>
           </w:p>
@@ -682,10 +788,10 @@
           <w:tcPr>
             <w:tcW w:type="dxa" w:w="2592"/>
             <w:tcMar>
-              <w:top w:w="70" w:type="dxa"/>
-              <w:bottom w:w="70" w:type="dxa"/>
-              <w:left w:w="100" w:type="dxa"/>
-              <w:right w:w="100" w:type="dxa"/>
+              <w:top w:w="50" w:type="dxa"/>
+              <w:bottom w:w="50" w:type="dxa"/>
+              <w:left w:w="80" w:type="dxa"/>
+              <w:right w:w="80" w:type="dxa"/>
             </w:tcMar>
             <w:tcBorders>
               <w:top w:val="single" w:sz="4" w:space="0" w:color="CBD5E1"/>
@@ -693,33 +799,32 @@
               <w:left w:val="single" w:sz="4" w:space="0" w:color="CBD5E1"/>
               <w:right w:val="single" w:sz="4" w:space="0" w:color="CBD5E1"/>
             </w:tcBorders>
-            <w:shd w:fill="F1F5F9"/>
+            <w:shd w:fill="F0F9FF"/>
           </w:tcPr>
           <w:p>
             <w:pPr>
               <w:spacing w:before="0" w:after="0"/>
-              <w:jc w:val="left"/>
             </w:pPr>
             <w:r>
               <w:rPr>
                 <w:rFonts w:ascii="Segoe UI" w:hAnsi="Segoe UI" w:cs="Kalpurush"/>
                 <w:b/>
                 <w:i w:val="0"/>
-                <w:color w:val="0F2C59"/>
-                <w:sz w:val="17"/>
+                <w:color w:val="0369A1"/>
+                <w:sz w:val="16"/>
               </w:rPr>
-              <w:t>আগমন বন্দর / ডিপো (Port/Depot):</w:t>
+              <w:t>আগমন বন্দর / ডিপো:</w:t>
             </w:r>
           </w:p>
         </w:tc>
         <w:tc>
           <w:tcPr>
-            <w:tcW w:type="dxa" w:w="2477"/>
+            <w:tcW w:type="dxa" w:w="2722"/>
             <w:tcMar>
-              <w:top w:w="70" w:type="dxa"/>
-              <w:bottom w:w="70" w:type="dxa"/>
-              <w:left w:w="100" w:type="dxa"/>
-              <w:right w:w="100" w:type="dxa"/>
+              <w:top w:w="50" w:type="dxa"/>
+              <w:bottom w:w="50" w:type="dxa"/>
+              <w:left w:w="80" w:type="dxa"/>
+              <w:right w:w="80" w:type="dxa"/>
             </w:tcMar>
             <w:tcBorders>
               <w:top w:val="single" w:sz="4" w:space="0" w:color="CBD5E1"/>
@@ -731,15 +836,14 @@
           <w:p>
             <w:pPr>
               <w:spacing w:before="0" w:after="0"/>
-              <w:jc w:val="left"/>
             </w:pPr>
             <w:r>
               <w:rPr>
                 <w:rFonts w:ascii="Segoe UI" w:hAnsi="Segoe UI" w:cs="Kalpurush"/>
                 <w:b w:val="0"/>
                 <w:i w:val="0"/>
-                <w:color w:val="334155"/>
-                <w:sz w:val="17"/>
+                <w:color w:val="1E293B"/>
+                <w:sz w:val="16"/>
               </w:rPr>
               <w:t>চট্টগ্রাম বন্দর [  ]   কমলাপুর আইসিডি [ ✓ ]</w:t>
             </w:r>
@@ -749,7 +853,7 @@
     </w:tbl>
     <w:p>
       <w:pPr>
-        <w:spacing w:before="0" w:after="80"/>
+        <w:spacing w:before="0" w:after="60"/>
       </w:pPr>
     </w:p>
     <w:tbl>
@@ -760,27 +864,27 @@
         <w:tblLook w:firstColumn="1" w:firstRow="1" w:lastColumn="0" w:lastRow="0" w:noHBand="0" w:noVBand="1" w:val="04A0"/>
       </w:tblPr>
       <w:tblGrid>
-        <w:gridCol w:w="2581"/>
-        <w:gridCol w:w="2581"/>
-        <w:gridCol w:w="2581"/>
-        <w:gridCol w:w="2581"/>
+        <w:gridCol w:w="2653"/>
+        <w:gridCol w:w="2653"/>
+        <w:gridCol w:w="2653"/>
+        <w:gridCol w:w="2653"/>
       </w:tblGrid>
       <w:tr>
         <w:tc>
           <w:tcPr>
-            <w:tcW w:type="dxa" w:w="648"/>
+            <w:tcW w:type="dxa" w:w="605"/>
             <w:tcMar>
-              <w:top w:w="80" w:type="dxa"/>
-              <w:bottom w:w="80" w:type="dxa"/>
-              <w:left w:w="100" w:type="dxa"/>
-              <w:right w:w="100" w:type="dxa"/>
+              <w:top w:w="70" w:type="dxa"/>
+              <w:bottom w:w="70" w:type="dxa"/>
+              <w:left w:w="80" w:type="dxa"/>
+              <w:right w:w="80" w:type="dxa"/>
             </w:tcMar>
-            <w:shd w:fill="0F2C59"/>
+            <w:shd w:fill="0369A1"/>
             <w:tcBorders>
-              <w:top w:val="single" w:sz="6" w:space="0" w:color="0F2C59"/>
-              <w:bottom w:val="single" w:sz="6" w:space="0" w:color="0F2C59"/>
-              <w:left w:val="single" w:sz="6" w:space="0" w:color="0F2C59"/>
-              <w:right w:val="single" w:sz="6" w:space="0" w:color="0F2C59"/>
+              <w:top w:val="single" w:sz="6" w:space="0" w:color="0369A1"/>
+              <w:bottom w:val="single" w:sz="6" w:space="0" w:color="0369A1"/>
+              <w:left w:val="single" w:sz="6" w:space="0" w:color="0369A1"/>
+              <w:right w:val="single" w:sz="6" w:space="0" w:color="0369A1"/>
             </w:tcBorders>
           </w:tcPr>
           <w:p>
@@ -794,7 +898,7 @@
                 <w:b/>
                 <w:i w:val="0"/>
                 <w:color w:val="FFFFFF"/>
-                <w:sz w:val="17"/>
+                <w:sz w:val="16"/>
               </w:rPr>
               <w:t>ক্র.</w:t>
             </w:r>
@@ -802,19 +906,19 @@
         </w:tc>
         <w:tc>
           <w:tcPr>
-            <w:tcW w:type="dxa" w:w="6264"/>
+            <w:tcW w:type="dxa" w:w="6552"/>
             <w:tcMar>
-              <w:top w:w="80" w:type="dxa"/>
-              <w:bottom w:w="80" w:type="dxa"/>
-              <w:left w:w="100" w:type="dxa"/>
-              <w:right w:w="100" w:type="dxa"/>
+              <w:top w:w="70" w:type="dxa"/>
+              <w:bottom w:w="70" w:type="dxa"/>
+              <w:left w:w="80" w:type="dxa"/>
+              <w:right w:w="80" w:type="dxa"/>
             </w:tcMar>
-            <w:shd w:fill="0F2C59"/>
+            <w:shd w:fill="0369A1"/>
             <w:tcBorders>
-              <w:top w:val="single" w:sz="6" w:space="0" w:color="0F2C59"/>
-              <w:bottom w:val="single" w:sz="6" w:space="0" w:color="0F2C59"/>
-              <w:left w:val="single" w:sz="6" w:space="0" w:color="0F2C59"/>
-              <w:right w:val="single" w:sz="6" w:space="0" w:color="0F2C59"/>
+              <w:top w:val="single" w:sz="6" w:space="0" w:color="0369A1"/>
+              <w:bottom w:val="single" w:sz="6" w:space="0" w:color="0369A1"/>
+              <w:left w:val="single" w:sz="6" w:space="0" w:color="0369A1"/>
+              <w:right w:val="single" w:sz="6" w:space="0" w:color="0369A1"/>
             </w:tcBorders>
           </w:tcPr>
           <w:p>
@@ -828,7 +932,7 @@
                 <w:b/>
                 <w:i w:val="0"/>
                 <w:color w:val="FFFFFF"/>
-                <w:sz w:val="17"/>
+                <w:sz w:val="16"/>
               </w:rPr>
               <w:t>খরচের খাত ও কাজের বিবরণ (Expense Particulars)</w:t>
             </w:r>
@@ -836,19 +940,19 @@
         </w:tc>
         <w:tc>
           <w:tcPr>
-            <w:tcW w:type="dxa" w:w="1829"/>
+            <w:tcW w:type="dxa" w:w="1800"/>
             <w:tcMar>
-              <w:top w:w="80" w:type="dxa"/>
-              <w:bottom w:w="80" w:type="dxa"/>
-              <w:left w:w="100" w:type="dxa"/>
-              <w:right w:w="100" w:type="dxa"/>
+              <w:top w:w="70" w:type="dxa"/>
+              <w:bottom w:w="70" w:type="dxa"/>
+              <w:left w:w="80" w:type="dxa"/>
+              <w:right w:w="80" w:type="dxa"/>
             </w:tcMar>
-            <w:shd w:fill="0F2C59"/>
+            <w:shd w:fill="0369A1"/>
             <w:tcBorders>
-              <w:top w:val="single" w:sz="6" w:space="0" w:color="0F2C59"/>
-              <w:bottom w:val="single" w:sz="6" w:space="0" w:color="0F2C59"/>
-              <w:left w:val="single" w:sz="6" w:space="0" w:color="0F2C59"/>
-              <w:right w:val="single" w:sz="6" w:space="0" w:color="0F2C59"/>
+              <w:top w:val="single" w:sz="6" w:space="0" w:color="0369A1"/>
+              <w:bottom w:val="single" w:sz="6" w:space="0" w:color="0369A1"/>
+              <w:left w:val="single" w:sz="6" w:space="0" w:color="0369A1"/>
+              <w:right w:val="single" w:sz="6" w:space="0" w:color="0369A1"/>
             </w:tcBorders>
           </w:tcPr>
           <w:p>
@@ -862,7 +966,7 @@
                 <w:b/>
                 <w:i w:val="0"/>
                 <w:color w:val="FFFFFF"/>
-                <w:sz w:val="17"/>
+                <w:sz w:val="16"/>
               </w:rPr>
               <w:t>পরিমাণ (টাকা)</w:t>
             </w:r>
@@ -870,19 +974,19 @@
         </w:tc>
         <w:tc>
           <w:tcPr>
-            <w:tcW w:type="dxa" w:w="1584"/>
+            <w:tcW w:type="dxa" w:w="1656"/>
             <w:tcMar>
-              <w:top w:w="80" w:type="dxa"/>
-              <w:bottom w:w="80" w:type="dxa"/>
-              <w:left w:w="100" w:type="dxa"/>
-              <w:right w:w="100" w:type="dxa"/>
+              <w:top w:w="70" w:type="dxa"/>
+              <w:bottom w:w="70" w:type="dxa"/>
+              <w:left w:w="80" w:type="dxa"/>
+              <w:right w:w="80" w:type="dxa"/>
             </w:tcMar>
-            <w:shd w:fill="0F2C59"/>
+            <w:shd w:fill="0369A1"/>
             <w:tcBorders>
-              <w:top w:val="single" w:sz="6" w:space="0" w:color="0F2C59"/>
-              <w:bottom w:val="single" w:sz="6" w:space="0" w:color="0F2C59"/>
-              <w:left w:val="single" w:sz="6" w:space="0" w:color="0F2C59"/>
-              <w:right w:val="single" w:sz="6" w:space="0" w:color="0F2C59"/>
+              <w:top w:val="single" w:sz="6" w:space="0" w:color="0369A1"/>
+              <w:bottom w:val="single" w:sz="6" w:space="0" w:color="0369A1"/>
+              <w:left w:val="single" w:sz="6" w:space="0" w:color="0369A1"/>
+              <w:right w:val="single" w:sz="6" w:space="0" w:color="0369A1"/>
             </w:tcBorders>
           </w:tcPr>
           <w:p>
@@ -896,7 +1000,7 @@
                 <w:b/>
                 <w:i w:val="0"/>
                 <w:color w:val="FFFFFF"/>
-                <w:sz w:val="17"/>
+                <w:sz w:val="16"/>
               </w:rPr>
               <w:t>মন্তব্য / ভাউচার</w:t>
             </w:r>
@@ -906,12 +1010,12 @@
       <w:tr>
         <w:tc>
           <w:tcPr>
-            <w:tcW w:type="dxa" w:w="648"/>
+            <w:tcW w:type="dxa" w:w="605"/>
             <w:tcMar>
-              <w:top w:w="45" w:type="dxa"/>
-              <w:bottom w:w="45" w:type="dxa"/>
-              <w:left w:w="60" w:type="dxa"/>
-              <w:right w:w="60" w:type="dxa"/>
+              <w:top w:w="35" w:type="dxa"/>
+              <w:bottom w:w="35" w:type="dxa"/>
+              <w:left w:w="50" w:type="dxa"/>
+              <w:right w:w="50" w:type="dxa"/>
             </w:tcMar>
             <w:shd w:fill="FFFFFF"/>
             <w:tcBorders>
@@ -931,8 +1035,8 @@
                 <w:rFonts w:ascii="Segoe UI" w:hAnsi="Segoe UI" w:cs="Kalpurush"/>
                 <w:b/>
                 <w:i w:val="0"/>
-                <w:color w:val="0F2C59"/>
-                <w:sz w:val="16"/>
+                <w:color w:val="0369A1"/>
+                <w:sz w:val="15"/>
               </w:rPr>
               <w:t>১</w:t>
             </w:r>
@@ -940,12 +1044,12 @@
         </w:tc>
         <w:tc>
           <w:tcPr>
-            <w:tcW w:type="dxa" w:w="6264"/>
+            <w:tcW w:type="dxa" w:w="6552"/>
             <w:tcMar>
-              <w:top w:w="45" w:type="dxa"/>
-              <w:bottom w:w="45" w:type="dxa"/>
-              <w:left w:w="100" w:type="dxa"/>
-              <w:right w:w="100" w:type="dxa"/>
+              <w:top w:w="35" w:type="dxa"/>
+              <w:bottom w:w="35" w:type="dxa"/>
+              <w:left w:w="80" w:type="dxa"/>
+              <w:right w:w="80" w:type="dxa"/>
             </w:tcMar>
             <w:shd w:fill="FFFFFF"/>
             <w:tcBorders>
@@ -958,15 +1062,14 @@
           <w:p>
             <w:pPr>
               <w:spacing w:before="0" w:after="0"/>
-              <w:jc w:val="left"/>
             </w:pPr>
             <w:r>
               <w:rPr>
                 <w:rFonts w:ascii="Segoe UI" w:hAnsi="Segoe UI" w:cs="Kalpurush"/>
                 <w:b w:val="0"/>
                 <w:i w:val="0"/>
-                <w:color w:val="334155"/>
-                <w:sz w:val="16"/>
+                <w:color w:val="1E293B"/>
+                <w:sz w:val="15"/>
               </w:rPr>
               <w:t>UAE প্রাথমিক খরচ (বকশিশ, চা-নাস্তা, স্কেল / ওয়েব্রিজ ফি ও এডভান্স/AD সমন্বয়)</w:t>
             </w:r>
@@ -974,12 +1077,12 @@
         </w:tc>
         <w:tc>
           <w:tcPr>
-            <w:tcW w:type="dxa" w:w="1829"/>
+            <w:tcW w:type="dxa" w:w="1800"/>
             <w:tcMar>
-              <w:top w:w="45" w:type="dxa"/>
-              <w:bottom w:w="45" w:type="dxa"/>
-              <w:left w:w="100" w:type="dxa"/>
-              <w:right w:w="100" w:type="dxa"/>
+              <w:top w:w="35" w:type="dxa"/>
+              <w:bottom w:w="35" w:type="dxa"/>
+              <w:left w:w="80" w:type="dxa"/>
+              <w:right w:w="80" w:type="dxa"/>
             </w:tcMar>
             <w:shd w:fill="FFFFFF"/>
             <w:tcBorders>
@@ -999,20 +1102,20 @@
                 <w:rFonts w:ascii="Segoe UI" w:hAnsi="Segoe UI" w:cs="Kalpurush"/>
                 <w:b w:val="0"/>
                 <w:i w:val="0"/>
-                <w:color w:val="334155"/>
-                <w:sz w:val="16"/>
+                <w:color w:val="1E293B"/>
+                <w:sz w:val="15"/>
               </w:rPr>
             </w:r>
           </w:p>
         </w:tc>
         <w:tc>
           <w:tcPr>
-            <w:tcW w:type="dxa" w:w="1584"/>
+            <w:tcW w:type="dxa" w:w="1656"/>
             <w:tcMar>
-              <w:top w:w="45" w:type="dxa"/>
-              <w:bottom w:w="45" w:type="dxa"/>
-              <w:left w:w="60" w:type="dxa"/>
-              <w:right w:w="60" w:type="dxa"/>
+              <w:top w:w="35" w:type="dxa"/>
+              <w:bottom w:w="35" w:type="dxa"/>
+              <w:left w:w="50" w:type="dxa"/>
+              <w:right w:w="50" w:type="dxa"/>
             </w:tcMar>
             <w:shd w:fill="FFFFFF"/>
             <w:tcBorders>
@@ -1032,8 +1135,8 @@
                 <w:rFonts w:ascii="Segoe UI" w:hAnsi="Segoe UI" w:cs="Kalpurush"/>
                 <w:b w:val="0"/>
                 <w:i w:val="0"/>
-                <w:color w:val="334155"/>
-                <w:sz w:val="16"/>
+                <w:color w:val="1E293B"/>
+                <w:sz w:val="15"/>
               </w:rPr>
             </w:r>
           </w:p>
@@ -1042,12 +1145,12 @@
       <w:tr>
         <w:tc>
           <w:tcPr>
-            <w:tcW w:type="dxa" w:w="648"/>
+            <w:tcW w:type="dxa" w:w="605"/>
             <w:tcMar>
-              <w:top w:w="45" w:type="dxa"/>
-              <w:bottom w:w="45" w:type="dxa"/>
-              <w:left w:w="60" w:type="dxa"/>
-              <w:right w:w="60" w:type="dxa"/>
+              <w:top w:w="35" w:type="dxa"/>
+              <w:bottom w:w="35" w:type="dxa"/>
+              <w:left w:w="50" w:type="dxa"/>
+              <w:right w:w="50" w:type="dxa"/>
             </w:tcMar>
             <w:shd w:fill="F8FAFC"/>
             <w:tcBorders>
@@ -1067,8 +1170,8 @@
                 <w:rFonts w:ascii="Segoe UI" w:hAnsi="Segoe UI" w:cs="Kalpurush"/>
                 <w:b/>
                 <w:i w:val="0"/>
-                <w:color w:val="0F2C59"/>
-                <w:sz w:val="16"/>
+                <w:color w:val="0369A1"/>
+                <w:sz w:val="15"/>
               </w:rPr>
               <w:t>২</w:t>
             </w:r>
@@ -1076,12 +1179,12 @@
         </w:tc>
         <w:tc>
           <w:tcPr>
-            <w:tcW w:type="dxa" w:w="6264"/>
+            <w:tcW w:type="dxa" w:w="6552"/>
             <w:tcMar>
-              <w:top w:w="45" w:type="dxa"/>
-              <w:bottom w:w="45" w:type="dxa"/>
-              <w:left w:w="100" w:type="dxa"/>
-              <w:right w:w="100" w:type="dxa"/>
+              <w:top w:w="35" w:type="dxa"/>
+              <w:bottom w:w="35" w:type="dxa"/>
+              <w:left w:w="80" w:type="dxa"/>
+              <w:right w:w="80" w:type="dxa"/>
             </w:tcMar>
             <w:shd w:fill="F8FAFC"/>
             <w:tcBorders>
@@ -1094,15 +1197,14 @@
           <w:p>
             <w:pPr>
               <w:spacing w:before="0" w:after="0"/>
-              <w:jc w:val="left"/>
             </w:pPr>
             <w:r>
               <w:rPr>
                 <w:rFonts w:ascii="Segoe UI" w:hAnsi="Segoe UI" w:cs="Kalpurush"/>
                 <w:b w:val="0"/>
                 <w:i w:val="0"/>
-                <w:color w:val="334155"/>
-                <w:sz w:val="16"/>
+                <w:color w:val="1E293B"/>
+                <w:sz w:val="15"/>
               </w:rPr>
               <w:t>UAE লোডিং, শিপিং লাইন চার্জ, L/C কমিশন ও বৈদেশিক ব্যাংক পেমেন্ট</w:t>
             </w:r>
@@ -1110,12 +1212,12 @@
         </w:tc>
         <w:tc>
           <w:tcPr>
-            <w:tcW w:type="dxa" w:w="1829"/>
+            <w:tcW w:type="dxa" w:w="1800"/>
             <w:tcMar>
-              <w:top w:w="45" w:type="dxa"/>
-              <w:bottom w:w="45" w:type="dxa"/>
-              <w:left w:w="100" w:type="dxa"/>
-              <w:right w:w="100" w:type="dxa"/>
+              <w:top w:w="35" w:type="dxa"/>
+              <w:bottom w:w="35" w:type="dxa"/>
+              <w:left w:w="80" w:type="dxa"/>
+              <w:right w:w="80" w:type="dxa"/>
             </w:tcMar>
             <w:shd w:fill="F8FAFC"/>
             <w:tcBorders>
@@ -1135,20 +1237,20 @@
                 <w:rFonts w:ascii="Segoe UI" w:hAnsi="Segoe UI" w:cs="Kalpurush"/>
                 <w:b w:val="0"/>
                 <w:i w:val="0"/>
-                <w:color w:val="334155"/>
-                <w:sz w:val="16"/>
+                <w:color w:val="1E293B"/>
+                <w:sz w:val="15"/>
               </w:rPr>
             </w:r>
           </w:p>
         </w:tc>
         <w:tc>
           <w:tcPr>
-            <w:tcW w:type="dxa" w:w="1584"/>
+            <w:tcW w:type="dxa" w:w="1656"/>
             <w:tcMar>
-              <w:top w:w="45" w:type="dxa"/>
-              <w:bottom w:w="45" w:type="dxa"/>
-              <w:left w:w="60" w:type="dxa"/>
-              <w:right w:w="60" w:type="dxa"/>
+              <w:top w:w="35" w:type="dxa"/>
+              <w:bottom w:w="35" w:type="dxa"/>
+              <w:left w:w="50" w:type="dxa"/>
+              <w:right w:w="50" w:type="dxa"/>
             </w:tcMar>
             <w:shd w:fill="F8FAFC"/>
             <w:tcBorders>
@@ -1168,8 +1270,8 @@
                 <w:rFonts w:ascii="Segoe UI" w:hAnsi="Segoe UI" w:cs="Kalpurush"/>
                 <w:b w:val="0"/>
                 <w:i w:val="0"/>
-                <w:color w:val="334155"/>
-                <w:sz w:val="16"/>
+                <w:color w:val="1E293B"/>
+                <w:sz w:val="15"/>
               </w:rPr>
             </w:r>
           </w:p>
@@ -1178,12 +1280,12 @@
       <w:tr>
         <w:tc>
           <w:tcPr>
-            <w:tcW w:type="dxa" w:w="648"/>
+            <w:tcW w:type="dxa" w:w="605"/>
             <w:tcMar>
-              <w:top w:w="45" w:type="dxa"/>
-              <w:bottom w:w="45" w:type="dxa"/>
-              <w:left w:w="60" w:type="dxa"/>
-              <w:right w:w="60" w:type="dxa"/>
+              <w:top w:w="35" w:type="dxa"/>
+              <w:bottom w:w="35" w:type="dxa"/>
+              <w:left w:w="50" w:type="dxa"/>
+              <w:right w:w="50" w:type="dxa"/>
             </w:tcMar>
             <w:shd w:fill="FFFFFF"/>
             <w:tcBorders>
@@ -1203,8 +1305,8 @@
                 <w:rFonts w:ascii="Segoe UI" w:hAnsi="Segoe UI" w:cs="Kalpurush"/>
                 <w:b/>
                 <w:i w:val="0"/>
-                <w:color w:val="0F2C59"/>
-                <w:sz w:val="16"/>
+                <w:color w:val="0369A1"/>
+                <w:sz w:val="15"/>
               </w:rPr>
               <w:t>৩</w:t>
             </w:r>
@@ -1212,12 +1314,12 @@
         </w:tc>
         <w:tc>
           <w:tcPr>
-            <w:tcW w:type="dxa" w:w="6264"/>
+            <w:tcW w:type="dxa" w:w="6552"/>
             <w:tcMar>
-              <w:top w:w="45" w:type="dxa"/>
-              <w:bottom w:w="45" w:type="dxa"/>
-              <w:left w:w="100" w:type="dxa"/>
-              <w:right w:w="100" w:type="dxa"/>
+              <w:top w:w="35" w:type="dxa"/>
+              <w:bottom w:w="35" w:type="dxa"/>
+              <w:left w:w="80" w:type="dxa"/>
+              <w:right w:w="80" w:type="dxa"/>
             </w:tcMar>
             <w:shd w:fill="FFFFFF"/>
             <w:tcBorders>
@@ -1230,28 +1332,27 @@
           <w:p>
             <w:pPr>
               <w:spacing w:before="0" w:after="0"/>
-              <w:jc w:val="left"/>
             </w:pPr>
             <w:r>
               <w:rPr>
                 <w:rFonts w:ascii="Segoe UI" w:hAnsi="Segoe UI" w:cs="Kalpurush"/>
                 <w:b w:val="0"/>
                 <w:i w:val="0"/>
-                <w:color w:val="334155"/>
-                <w:sz w:val="16"/>
+                <w:color w:val="1E293B"/>
+                <w:sz w:val="15"/>
               </w:rPr>
-              <w:t>ব্যাংক চার্জ ও মার্জিন (ইসলামী ব্যাংক L/C মার্জিন / আরিয়ান বা অন্যান্য সংশ্লিষ্ট ফি)</w:t>
+              <w:t>ব্যাংক চার্জ ও মার্জিন (ইসলামী ব্যাংক L/C মার্জিন / আরিয়ান বা অন্যান্য ফি)</w:t>
             </w:r>
           </w:p>
         </w:tc>
         <w:tc>
           <w:tcPr>
-            <w:tcW w:type="dxa" w:w="1829"/>
+            <w:tcW w:type="dxa" w:w="1800"/>
             <w:tcMar>
-              <w:top w:w="45" w:type="dxa"/>
-              <w:bottom w:w="45" w:type="dxa"/>
-              <w:left w:w="100" w:type="dxa"/>
-              <w:right w:w="100" w:type="dxa"/>
+              <w:top w:w="35" w:type="dxa"/>
+              <w:bottom w:w="35" w:type="dxa"/>
+              <w:left w:w="80" w:type="dxa"/>
+              <w:right w:w="80" w:type="dxa"/>
             </w:tcMar>
             <w:shd w:fill="FFFFFF"/>
             <w:tcBorders>
@@ -1271,20 +1372,20 @@
                 <w:rFonts w:ascii="Segoe UI" w:hAnsi="Segoe UI" w:cs="Kalpurush"/>
                 <w:b w:val="0"/>
                 <w:i w:val="0"/>
-                <w:color w:val="334155"/>
-                <w:sz w:val="16"/>
+                <w:color w:val="1E293B"/>
+                <w:sz w:val="15"/>
               </w:rPr>
             </w:r>
           </w:p>
         </w:tc>
         <w:tc>
           <w:tcPr>
-            <w:tcW w:type="dxa" w:w="1584"/>
+            <w:tcW w:type="dxa" w:w="1656"/>
             <w:tcMar>
-              <w:top w:w="45" w:type="dxa"/>
-              <w:bottom w:w="45" w:type="dxa"/>
-              <w:left w:w="60" w:type="dxa"/>
-              <w:right w:w="60" w:type="dxa"/>
+              <w:top w:w="35" w:type="dxa"/>
+              <w:bottom w:w="35" w:type="dxa"/>
+              <w:left w:w="50" w:type="dxa"/>
+              <w:right w:w="50" w:type="dxa"/>
             </w:tcMar>
             <w:shd w:fill="FFFFFF"/>
             <w:tcBorders>
@@ -1304,8 +1405,8 @@
                 <w:rFonts w:ascii="Segoe UI" w:hAnsi="Segoe UI" w:cs="Kalpurush"/>
                 <w:b w:val="0"/>
                 <w:i w:val="0"/>
-                <w:color w:val="334155"/>
-                <w:sz w:val="16"/>
+                <w:color w:val="1E293B"/>
+                <w:sz w:val="15"/>
               </w:rPr>
             </w:r>
           </w:p>
@@ -1314,12 +1415,12 @@
       <w:tr>
         <w:tc>
           <w:tcPr>
-            <w:tcW w:type="dxa" w:w="648"/>
+            <w:tcW w:type="dxa" w:w="605"/>
             <w:tcMar>
-              <w:top w:w="45" w:type="dxa"/>
-              <w:bottom w:w="45" w:type="dxa"/>
-              <w:left w:w="60" w:type="dxa"/>
-              <w:right w:w="60" w:type="dxa"/>
+              <w:top w:w="35" w:type="dxa"/>
+              <w:bottom w:w="35" w:type="dxa"/>
+              <w:left w:w="50" w:type="dxa"/>
+              <w:right w:w="50" w:type="dxa"/>
             </w:tcMar>
             <w:shd w:fill="F8FAFC"/>
             <w:tcBorders>
@@ -1339,8 +1440,8 @@
                 <w:rFonts w:ascii="Segoe UI" w:hAnsi="Segoe UI" w:cs="Kalpurush"/>
                 <w:b/>
                 <w:i w:val="0"/>
-                <w:color w:val="0F2C59"/>
-                <w:sz w:val="16"/>
+                <w:color w:val="0369A1"/>
+                <w:sz w:val="15"/>
               </w:rPr>
               <w:t>৪</w:t>
             </w:r>
@@ -1348,12 +1449,12 @@
         </w:tc>
         <w:tc>
           <w:tcPr>
-            <w:tcW w:type="dxa" w:w="6264"/>
+            <w:tcW w:type="dxa" w:w="6552"/>
             <w:tcMar>
-              <w:top w:w="45" w:type="dxa"/>
-              <w:bottom w:w="45" w:type="dxa"/>
-              <w:left w:w="100" w:type="dxa"/>
-              <w:right w:w="100" w:type="dxa"/>
+              <w:top w:w="35" w:type="dxa"/>
+              <w:bottom w:w="35" w:type="dxa"/>
+              <w:left w:w="80" w:type="dxa"/>
+              <w:right w:w="80" w:type="dxa"/>
             </w:tcMar>
             <w:shd w:fill="F8FAFC"/>
             <w:tcBorders>
@@ -1366,15 +1467,14 @@
           <w:p>
             <w:pPr>
               <w:spacing w:before="0" w:after="0"/>
-              <w:jc w:val="left"/>
             </w:pPr>
             <w:r>
               <w:rPr>
                 <w:rFonts w:ascii="Segoe UI" w:hAnsi="Segoe UI" w:cs="Kalpurush"/>
                 <w:b w:val="0"/>
                 <w:i w:val="0"/>
-                <w:color w:val="334155"/>
-                <w:sz w:val="16"/>
+                <w:color w:val="1E293B"/>
+                <w:sz w:val="15"/>
               </w:rPr>
               <w:t>কাস্টমস ক্লিয়ারেন্স সার্টিফিকেট ফি (খালেক বা নাসির এজেন্ট)</w:t>
             </w:r>
@@ -1382,12 +1482,12 @@
         </w:tc>
         <w:tc>
           <w:tcPr>
-            <w:tcW w:type="dxa" w:w="1829"/>
+            <w:tcW w:type="dxa" w:w="1800"/>
             <w:tcMar>
-              <w:top w:w="45" w:type="dxa"/>
-              <w:bottom w:w="45" w:type="dxa"/>
-              <w:left w:w="100" w:type="dxa"/>
-              <w:right w:w="100" w:type="dxa"/>
+              <w:top w:w="35" w:type="dxa"/>
+              <w:bottom w:w="35" w:type="dxa"/>
+              <w:left w:w="80" w:type="dxa"/>
+              <w:right w:w="80" w:type="dxa"/>
             </w:tcMar>
             <w:shd w:fill="F8FAFC"/>
             <w:tcBorders>
@@ -1407,20 +1507,20 @@
                 <w:rFonts w:ascii="Segoe UI" w:hAnsi="Segoe UI" w:cs="Kalpurush"/>
                 <w:b w:val="0"/>
                 <w:i w:val="0"/>
-                <w:color w:val="334155"/>
-                <w:sz w:val="16"/>
+                <w:color w:val="1E293B"/>
+                <w:sz w:val="15"/>
               </w:rPr>
             </w:r>
           </w:p>
         </w:tc>
         <w:tc>
           <w:tcPr>
-            <w:tcW w:type="dxa" w:w="1584"/>
+            <w:tcW w:type="dxa" w:w="1656"/>
             <w:tcMar>
-              <w:top w:w="45" w:type="dxa"/>
-              <w:bottom w:w="45" w:type="dxa"/>
-              <w:left w:w="60" w:type="dxa"/>
-              <w:right w:w="60" w:type="dxa"/>
+              <w:top w:w="35" w:type="dxa"/>
+              <w:bottom w:w="35" w:type="dxa"/>
+              <w:left w:w="50" w:type="dxa"/>
+              <w:right w:w="50" w:type="dxa"/>
             </w:tcMar>
             <w:shd w:fill="F8FAFC"/>
             <w:tcBorders>
@@ -1440,8 +1540,8 @@
                 <w:rFonts w:ascii="Segoe UI" w:hAnsi="Segoe UI" w:cs="Kalpurush"/>
                 <w:b w:val="0"/>
                 <w:i w:val="0"/>
-                <w:color w:val="334155"/>
-                <w:sz w:val="16"/>
+                <w:color w:val="1E293B"/>
+                <w:sz w:val="15"/>
               </w:rPr>
             </w:r>
           </w:p>
@@ -1450,12 +1550,12 @@
       <w:tr>
         <w:tc>
           <w:tcPr>
-            <w:tcW w:type="dxa" w:w="648"/>
+            <w:tcW w:type="dxa" w:w="605"/>
             <w:tcMar>
-              <w:top w:w="45" w:type="dxa"/>
-              <w:bottom w:w="45" w:type="dxa"/>
-              <w:left w:w="60" w:type="dxa"/>
-              <w:right w:w="60" w:type="dxa"/>
+              <w:top w:w="35" w:type="dxa"/>
+              <w:bottom w:w="35" w:type="dxa"/>
+              <w:left w:w="50" w:type="dxa"/>
+              <w:right w:w="50" w:type="dxa"/>
             </w:tcMar>
             <w:shd w:fill="FFFFFF"/>
             <w:tcBorders>
@@ -1475,8 +1575,8 @@
                 <w:rFonts w:ascii="Segoe UI" w:hAnsi="Segoe UI" w:cs="Kalpurush"/>
                 <w:b/>
                 <w:i w:val="0"/>
-                <w:color w:val="0F2C59"/>
-                <w:sz w:val="16"/>
+                <w:color w:val="0369A1"/>
+                <w:sz w:val="15"/>
               </w:rPr>
               <w:t>৫</w:t>
             </w:r>
@@ -1484,12 +1584,12 @@
         </w:tc>
         <w:tc>
           <w:tcPr>
-            <w:tcW w:type="dxa" w:w="6264"/>
+            <w:tcW w:type="dxa" w:w="6552"/>
             <w:tcMar>
-              <w:top w:w="45" w:type="dxa"/>
-              <w:bottom w:w="45" w:type="dxa"/>
-              <w:left w:w="100" w:type="dxa"/>
-              <w:right w:w="100" w:type="dxa"/>
+              <w:top w:w="35" w:type="dxa"/>
+              <w:bottom w:w="35" w:type="dxa"/>
+              <w:left w:w="80" w:type="dxa"/>
+              <w:right w:w="80" w:type="dxa"/>
             </w:tcMar>
             <w:shd w:fill="FFFFFF"/>
             <w:tcBorders>
@@ -1502,15 +1602,14 @@
           <w:p>
             <w:pPr>
               <w:spacing w:before="0" w:after="0"/>
-              <w:jc w:val="left"/>
             </w:pPr>
             <w:r>
               <w:rPr>
                 <w:rFonts w:ascii="Segoe UI" w:hAnsi="Segoe UI" w:cs="Kalpurush"/>
                 <w:b w:val="0"/>
                 <w:i w:val="0"/>
-                <w:color w:val="334155"/>
-                <w:sz w:val="16"/>
+                <w:color w:val="1E293B"/>
+                <w:sz w:val="15"/>
               </w:rPr>
               <w:t>পোর্ট ইয়ার্ড কন্টেইনার মুভমেন্ট / ঠেলা ও গেট পারমিশন চার্জ</w:t>
             </w:r>
@@ -1518,12 +1617,12 @@
         </w:tc>
         <w:tc>
           <w:tcPr>
-            <w:tcW w:type="dxa" w:w="1829"/>
+            <w:tcW w:type="dxa" w:w="1800"/>
             <w:tcMar>
-              <w:top w:w="45" w:type="dxa"/>
-              <w:bottom w:w="45" w:type="dxa"/>
-              <w:left w:w="100" w:type="dxa"/>
-              <w:right w:w="100" w:type="dxa"/>
+              <w:top w:w="35" w:type="dxa"/>
+              <w:bottom w:w="35" w:type="dxa"/>
+              <w:left w:w="80" w:type="dxa"/>
+              <w:right w:w="80" w:type="dxa"/>
             </w:tcMar>
             <w:shd w:fill="FFFFFF"/>
             <w:tcBorders>
@@ -1543,20 +1642,20 @@
                 <w:rFonts w:ascii="Segoe UI" w:hAnsi="Segoe UI" w:cs="Kalpurush"/>
                 <w:b w:val="0"/>
                 <w:i w:val="0"/>
-                <w:color w:val="334155"/>
-                <w:sz w:val="16"/>
+                <w:color w:val="1E293B"/>
+                <w:sz w:val="15"/>
               </w:rPr>
             </w:r>
           </w:p>
         </w:tc>
         <w:tc>
           <w:tcPr>
-            <w:tcW w:type="dxa" w:w="1584"/>
+            <w:tcW w:type="dxa" w:w="1656"/>
             <w:tcMar>
-              <w:top w:w="45" w:type="dxa"/>
-              <w:bottom w:w="45" w:type="dxa"/>
-              <w:left w:w="60" w:type="dxa"/>
-              <w:right w:w="60" w:type="dxa"/>
+              <w:top w:w="35" w:type="dxa"/>
+              <w:bottom w:w="35" w:type="dxa"/>
+              <w:left w:w="50" w:type="dxa"/>
+              <w:right w:w="50" w:type="dxa"/>
             </w:tcMar>
             <w:shd w:fill="FFFFFF"/>
             <w:tcBorders>
@@ -1576,8 +1675,8 @@
                 <w:rFonts w:ascii="Segoe UI" w:hAnsi="Segoe UI" w:cs="Kalpurush"/>
                 <w:b w:val="0"/>
                 <w:i w:val="0"/>
-                <w:color w:val="334155"/>
-                <w:sz w:val="16"/>
+                <w:color w:val="1E293B"/>
+                <w:sz w:val="15"/>
               </w:rPr>
             </w:r>
           </w:p>
@@ -1586,12 +1685,12 @@
       <w:tr>
         <w:tc>
           <w:tcPr>
-            <w:tcW w:type="dxa" w:w="648"/>
+            <w:tcW w:type="dxa" w:w="605"/>
             <w:tcMar>
-              <w:top w:w="45" w:type="dxa"/>
-              <w:bottom w:w="45" w:type="dxa"/>
-              <w:left w:w="60" w:type="dxa"/>
-              <w:right w:w="60" w:type="dxa"/>
+              <w:top w:w="35" w:type="dxa"/>
+              <w:bottom w:w="35" w:type="dxa"/>
+              <w:left w:w="50" w:type="dxa"/>
+              <w:right w:w="50" w:type="dxa"/>
             </w:tcMar>
             <w:shd w:fill="F8FAFC"/>
             <w:tcBorders>
@@ -1611,8 +1710,8 @@
                 <w:rFonts w:ascii="Segoe UI" w:hAnsi="Segoe UI" w:cs="Kalpurush"/>
                 <w:b/>
                 <w:i w:val="0"/>
-                <w:color w:val="0F2C59"/>
-                <w:sz w:val="16"/>
+                <w:color w:val="0369A1"/>
+                <w:sz w:val="15"/>
               </w:rPr>
               <w:t>৬</w:t>
             </w:r>
@@ -1620,12 +1719,12 @@
         </w:tc>
         <w:tc>
           <w:tcPr>
-            <w:tcW w:type="dxa" w:w="6264"/>
+            <w:tcW w:type="dxa" w:w="6552"/>
             <w:tcMar>
-              <w:top w:w="45" w:type="dxa"/>
-              <w:bottom w:w="45" w:type="dxa"/>
-              <w:left w:w="100" w:type="dxa"/>
-              <w:right w:w="100" w:type="dxa"/>
+              <w:top w:w="35" w:type="dxa"/>
+              <w:bottom w:w="35" w:type="dxa"/>
+              <w:left w:w="80" w:type="dxa"/>
+              <w:right w:w="80" w:type="dxa"/>
             </w:tcMar>
             <w:shd w:fill="F8FAFC"/>
             <w:tcBorders>
@@ -1638,15 +1737,14 @@
           <w:p>
             <w:pPr>
               <w:spacing w:before="0" w:after="0"/>
-              <w:jc w:val="left"/>
             </w:pPr>
             <w:r>
               <w:rPr>
                 <w:rFonts w:ascii="Segoe UI" w:hAnsi="Segoe UI" w:cs="Kalpurush"/>
                 <w:b w:val="0"/>
                 <w:i w:val="0"/>
-                <w:color w:val="334155"/>
-                <w:sz w:val="16"/>
+                <w:color w:val="1E293B"/>
+                <w:sz w:val="15"/>
               </w:rPr>
               <w:t>কাস্টমস পরীক্ষণ (Customs Examination) ও ঢাকা যাতায়াত খরচ</w:t>
             </w:r>
@@ -1654,12 +1752,12 @@
         </w:tc>
         <w:tc>
           <w:tcPr>
-            <w:tcW w:type="dxa" w:w="1829"/>
+            <w:tcW w:type="dxa" w:w="1800"/>
             <w:tcMar>
-              <w:top w:w="45" w:type="dxa"/>
-              <w:bottom w:w="45" w:type="dxa"/>
-              <w:left w:w="100" w:type="dxa"/>
-              <w:right w:w="100" w:type="dxa"/>
+              <w:top w:w="35" w:type="dxa"/>
+              <w:bottom w:w="35" w:type="dxa"/>
+              <w:left w:w="80" w:type="dxa"/>
+              <w:right w:w="80" w:type="dxa"/>
             </w:tcMar>
             <w:shd w:fill="F8FAFC"/>
             <w:tcBorders>
@@ -1679,20 +1777,20 @@
                 <w:rFonts w:ascii="Segoe UI" w:hAnsi="Segoe UI" w:cs="Kalpurush"/>
                 <w:b w:val="0"/>
                 <w:i w:val="0"/>
-                <w:color w:val="334155"/>
-                <w:sz w:val="16"/>
+                <w:color w:val="1E293B"/>
+                <w:sz w:val="15"/>
               </w:rPr>
             </w:r>
           </w:p>
         </w:tc>
         <w:tc>
           <w:tcPr>
-            <w:tcW w:type="dxa" w:w="1584"/>
+            <w:tcW w:type="dxa" w:w="1656"/>
             <w:tcMar>
-              <w:top w:w="45" w:type="dxa"/>
-              <w:bottom w:w="45" w:type="dxa"/>
-              <w:left w:w="60" w:type="dxa"/>
-              <w:right w:w="60" w:type="dxa"/>
+              <w:top w:w="35" w:type="dxa"/>
+              <w:bottom w:w="35" w:type="dxa"/>
+              <w:left w:w="50" w:type="dxa"/>
+              <w:right w:w="50" w:type="dxa"/>
             </w:tcMar>
             <w:shd w:fill="F8FAFC"/>
             <w:tcBorders>
@@ -1712,8 +1810,8 @@
                 <w:rFonts w:ascii="Segoe UI" w:hAnsi="Segoe UI" w:cs="Kalpurush"/>
                 <w:b w:val="0"/>
                 <w:i w:val="0"/>
-                <w:color w:val="334155"/>
-                <w:sz w:val="16"/>
+                <w:color w:val="1E293B"/>
+                <w:sz w:val="15"/>
               </w:rPr>
             </w:r>
           </w:p>
@@ -1722,12 +1820,12 @@
       <w:tr>
         <w:tc>
           <w:tcPr>
-            <w:tcW w:type="dxa" w:w="648"/>
+            <w:tcW w:type="dxa" w:w="605"/>
             <w:tcMar>
-              <w:top w:w="45" w:type="dxa"/>
-              <w:bottom w:w="45" w:type="dxa"/>
-              <w:left w:w="60" w:type="dxa"/>
-              <w:right w:w="60" w:type="dxa"/>
+              <w:top w:w="35" w:type="dxa"/>
+              <w:bottom w:w="35" w:type="dxa"/>
+              <w:left w:w="50" w:type="dxa"/>
+              <w:right w:w="50" w:type="dxa"/>
             </w:tcMar>
             <w:shd w:fill="FFFFFF"/>
             <w:tcBorders>
@@ -1747,8 +1845,8 @@
                 <w:rFonts w:ascii="Segoe UI" w:hAnsi="Segoe UI" w:cs="Kalpurush"/>
                 <w:b/>
                 <w:i w:val="0"/>
-                <w:color w:val="0F2C59"/>
-                <w:sz w:val="16"/>
+                <w:color w:val="0369A1"/>
+                <w:sz w:val="15"/>
               </w:rPr>
               <w:t>৭</w:t>
             </w:r>
@@ -1756,12 +1854,12 @@
         </w:tc>
         <w:tc>
           <w:tcPr>
-            <w:tcW w:type="dxa" w:w="6264"/>
+            <w:tcW w:type="dxa" w:w="6552"/>
             <w:tcMar>
-              <w:top w:w="45" w:type="dxa"/>
-              <w:bottom w:w="45" w:type="dxa"/>
-              <w:left w:w="100" w:type="dxa"/>
-              <w:right w:w="100" w:type="dxa"/>
+              <w:top w:w="35" w:type="dxa"/>
+              <w:bottom w:w="35" w:type="dxa"/>
+              <w:left w:w="80" w:type="dxa"/>
+              <w:right w:w="80" w:type="dxa"/>
             </w:tcMar>
             <w:shd w:fill="FFFFFF"/>
             <w:tcBorders>
@@ -1774,15 +1872,14 @@
           <w:p>
             <w:pPr>
               <w:spacing w:before="0" w:after="0"/>
-              <w:jc w:val="left"/>
             </w:pPr>
             <w:r>
               <w:rPr>
                 <w:rFonts w:ascii="Segoe UI" w:hAnsi="Segoe UI" w:cs="Kalpurush"/>
                 <w:b w:val="0"/>
                 <w:i w:val="0"/>
-                <w:color w:val="334155"/>
-                <w:sz w:val="16"/>
+                <w:color w:val="1E293B"/>
+                <w:sz w:val="15"/>
               </w:rPr>
               <w:t>গোডাউন যাতায়াত ও খালাস তদারকি চা-নাস্তা খরচ</w:t>
             </w:r>
@@ -1790,12 +1887,12 @@
         </w:tc>
         <w:tc>
           <w:tcPr>
-            <w:tcW w:type="dxa" w:w="1829"/>
+            <w:tcW w:type="dxa" w:w="1800"/>
             <w:tcMar>
-              <w:top w:w="45" w:type="dxa"/>
-              <w:bottom w:w="45" w:type="dxa"/>
-              <w:left w:w="100" w:type="dxa"/>
-              <w:right w:w="100" w:type="dxa"/>
+              <w:top w:w="35" w:type="dxa"/>
+              <w:bottom w:w="35" w:type="dxa"/>
+              <w:left w:w="80" w:type="dxa"/>
+              <w:right w:w="80" w:type="dxa"/>
             </w:tcMar>
             <w:shd w:fill="FFFFFF"/>
             <w:tcBorders>
@@ -1815,20 +1912,20 @@
                 <w:rFonts w:ascii="Segoe UI" w:hAnsi="Segoe UI" w:cs="Kalpurush"/>
                 <w:b w:val="0"/>
                 <w:i w:val="0"/>
-                <w:color w:val="334155"/>
-                <w:sz w:val="16"/>
+                <w:color w:val="1E293B"/>
+                <w:sz w:val="15"/>
               </w:rPr>
             </w:r>
           </w:p>
         </w:tc>
         <w:tc>
           <w:tcPr>
-            <w:tcW w:type="dxa" w:w="1584"/>
+            <w:tcW w:type="dxa" w:w="1656"/>
             <w:tcMar>
-              <w:top w:w="45" w:type="dxa"/>
-              <w:bottom w:w="45" w:type="dxa"/>
-              <w:left w:w="60" w:type="dxa"/>
-              <w:right w:w="60" w:type="dxa"/>
+              <w:top w:w="35" w:type="dxa"/>
+              <w:bottom w:w="35" w:type="dxa"/>
+              <w:left w:w="50" w:type="dxa"/>
+              <w:right w:w="50" w:type="dxa"/>
             </w:tcMar>
             <w:shd w:fill="FFFFFF"/>
             <w:tcBorders>
@@ -1848,8 +1945,8 @@
                 <w:rFonts w:ascii="Segoe UI" w:hAnsi="Segoe UI" w:cs="Kalpurush"/>
                 <w:b w:val="0"/>
                 <w:i w:val="0"/>
-                <w:color w:val="334155"/>
-                <w:sz w:val="16"/>
+                <w:color w:val="1E293B"/>
+                <w:sz w:val="15"/>
               </w:rPr>
             </w:r>
           </w:p>
@@ -1858,12 +1955,12 @@
       <w:tr>
         <w:tc>
           <w:tcPr>
-            <w:tcW w:type="dxa" w:w="648"/>
+            <w:tcW w:type="dxa" w:w="605"/>
             <w:tcMar>
-              <w:top w:w="45" w:type="dxa"/>
-              <w:bottom w:w="45" w:type="dxa"/>
-              <w:left w:w="60" w:type="dxa"/>
-              <w:right w:w="60" w:type="dxa"/>
+              <w:top w:w="35" w:type="dxa"/>
+              <w:bottom w:w="35" w:type="dxa"/>
+              <w:left w:w="50" w:type="dxa"/>
+              <w:right w:w="50" w:type="dxa"/>
             </w:tcMar>
             <w:shd w:fill="F8FAFC"/>
             <w:tcBorders>
@@ -1883,8 +1980,8 @@
                 <w:rFonts w:ascii="Segoe UI" w:hAnsi="Segoe UI" w:cs="Kalpurush"/>
                 <w:b/>
                 <w:i w:val="0"/>
-                <w:color w:val="0F2C59"/>
-                <w:sz w:val="16"/>
+                <w:color w:val="0369A1"/>
+                <w:sz w:val="15"/>
               </w:rPr>
               <w:t>৮</w:t>
             </w:r>
@@ -1892,12 +1989,12 @@
         </w:tc>
         <w:tc>
           <w:tcPr>
-            <w:tcW w:type="dxa" w:w="6264"/>
+            <w:tcW w:type="dxa" w:w="6552"/>
             <w:tcMar>
-              <w:top w:w="45" w:type="dxa"/>
-              <w:bottom w:w="45" w:type="dxa"/>
-              <w:left w:w="100" w:type="dxa"/>
-              <w:right w:w="100" w:type="dxa"/>
+              <w:top w:w="35" w:type="dxa"/>
+              <w:bottom w:w="35" w:type="dxa"/>
+              <w:left w:w="80" w:type="dxa"/>
+              <w:right w:w="80" w:type="dxa"/>
             </w:tcMar>
             <w:shd w:fill="F8FAFC"/>
             <w:tcBorders>
@@ -1910,15 +2007,14 @@
           <w:p>
             <w:pPr>
               <w:spacing w:before="0" w:after="0"/>
-              <w:jc w:val="left"/>
             </w:pPr>
             <w:r>
               <w:rPr>
                 <w:rFonts w:ascii="Segoe UI" w:hAnsi="Segoe UI" w:cs="Kalpurush"/>
                 <w:b w:val="0"/>
                 <w:i w:val="0"/>
-                <w:color w:val="334155"/>
-                <w:sz w:val="16"/>
+                <w:color w:val="1E293B"/>
+                <w:sz w:val="15"/>
               </w:rPr>
               <w:t>লোকাল পরিবহন কাভার্ড ভ্যান ভাড়া, খালাস লেবার ও ক্রেন চার্জ</w:t>
             </w:r>
@@ -1926,12 +2022,12 @@
         </w:tc>
         <w:tc>
           <w:tcPr>
-            <w:tcW w:type="dxa" w:w="1829"/>
+            <w:tcW w:type="dxa" w:w="1800"/>
             <w:tcMar>
-              <w:top w:w="45" w:type="dxa"/>
-              <w:bottom w:w="45" w:type="dxa"/>
-              <w:left w:w="100" w:type="dxa"/>
-              <w:right w:w="100" w:type="dxa"/>
+              <w:top w:w="35" w:type="dxa"/>
+              <w:bottom w:w="35" w:type="dxa"/>
+              <w:left w:w="80" w:type="dxa"/>
+              <w:right w:w="80" w:type="dxa"/>
             </w:tcMar>
             <w:shd w:fill="F8FAFC"/>
             <w:tcBorders>
@@ -1951,20 +2047,20 @@
                 <w:rFonts w:ascii="Segoe UI" w:hAnsi="Segoe UI" w:cs="Kalpurush"/>
                 <w:b w:val="0"/>
                 <w:i w:val="0"/>
-                <w:color w:val="334155"/>
-                <w:sz w:val="16"/>
+                <w:color w:val="1E293B"/>
+                <w:sz w:val="15"/>
               </w:rPr>
             </w:r>
           </w:p>
         </w:tc>
         <w:tc>
           <w:tcPr>
-            <w:tcW w:type="dxa" w:w="1584"/>
+            <w:tcW w:type="dxa" w:w="1656"/>
             <w:tcMar>
-              <w:top w:w="45" w:type="dxa"/>
-              <w:bottom w:w="45" w:type="dxa"/>
-              <w:left w:w="60" w:type="dxa"/>
-              <w:right w:w="60" w:type="dxa"/>
+              <w:top w:w="35" w:type="dxa"/>
+              <w:bottom w:w="35" w:type="dxa"/>
+              <w:left w:w="50" w:type="dxa"/>
+              <w:right w:w="50" w:type="dxa"/>
             </w:tcMar>
             <w:shd w:fill="F8FAFC"/>
             <w:tcBorders>
@@ -1984,8 +2080,8 @@
                 <w:rFonts w:ascii="Segoe UI" w:hAnsi="Segoe UI" w:cs="Kalpurush"/>
                 <w:b w:val="0"/>
                 <w:i w:val="0"/>
-                <w:color w:val="334155"/>
-                <w:sz w:val="16"/>
+                <w:color w:val="1E293B"/>
+                <w:sz w:val="15"/>
               </w:rPr>
             </w:r>
           </w:p>
@@ -1994,12 +2090,12 @@
       <w:tr>
         <w:tc>
           <w:tcPr>
-            <w:tcW w:type="dxa" w:w="648"/>
+            <w:tcW w:type="dxa" w:w="605"/>
             <w:tcMar>
-              <w:top w:w="45" w:type="dxa"/>
-              <w:bottom w:w="45" w:type="dxa"/>
-              <w:left w:w="60" w:type="dxa"/>
-              <w:right w:w="60" w:type="dxa"/>
+              <w:top w:w="35" w:type="dxa"/>
+              <w:bottom w:w="35" w:type="dxa"/>
+              <w:left w:w="50" w:type="dxa"/>
+              <w:right w:w="50" w:type="dxa"/>
             </w:tcMar>
             <w:shd w:fill="FFFFFF"/>
             <w:tcBorders>
@@ -2019,8 +2115,8 @@
                 <w:rFonts w:ascii="Segoe UI" w:hAnsi="Segoe UI" w:cs="Kalpurush"/>
                 <w:b/>
                 <w:i w:val="0"/>
-                <w:color w:val="0F2C59"/>
-                <w:sz w:val="16"/>
+                <w:color w:val="0369A1"/>
+                <w:sz w:val="15"/>
               </w:rPr>
               <w:t>৯</w:t>
             </w:r>
@@ -2028,12 +2124,12 @@
         </w:tc>
         <w:tc>
           <w:tcPr>
-            <w:tcW w:type="dxa" w:w="6264"/>
+            <w:tcW w:type="dxa" w:w="6552"/>
             <w:tcMar>
-              <w:top w:w="45" w:type="dxa"/>
-              <w:bottom w:w="45" w:type="dxa"/>
-              <w:left w:w="100" w:type="dxa"/>
-              <w:right w:w="100" w:type="dxa"/>
+              <w:top w:w="35" w:type="dxa"/>
+              <w:bottom w:w="35" w:type="dxa"/>
+              <w:left w:w="80" w:type="dxa"/>
+              <w:right w:w="80" w:type="dxa"/>
             </w:tcMar>
             <w:shd w:fill="FFFFFF"/>
             <w:tcBorders>
@@ -2046,15 +2142,14 @@
           <w:p>
             <w:pPr>
               <w:spacing w:before="0" w:after="0"/>
-              <w:jc w:val="left"/>
             </w:pPr>
             <w:r>
               <w:rPr>
                 <w:rFonts w:ascii="Segoe UI" w:hAnsi="Segoe UI" w:cs="Kalpurush"/>
                 <w:b w:val="0"/>
                 <w:i w:val="0"/>
-                <w:color w:val="334155"/>
-                <w:sz w:val="16"/>
+                <w:color w:val="1E293B"/>
+                <w:sz w:val="15"/>
               </w:rPr>
               <w:t>অস্থায়ী গোডাউন ভাড়া (আম্বিয়া আনিস + জাহেদ আনিস স্পেস বাবদ)</w:t>
             </w:r>
@@ -2062,12 +2157,12 @@
         </w:tc>
         <w:tc>
           <w:tcPr>
-            <w:tcW w:type="dxa" w:w="1829"/>
+            <w:tcW w:type="dxa" w:w="1800"/>
             <w:tcMar>
-              <w:top w:w="45" w:type="dxa"/>
-              <w:bottom w:w="45" w:type="dxa"/>
-              <w:left w:w="100" w:type="dxa"/>
-              <w:right w:w="100" w:type="dxa"/>
+              <w:top w:w="35" w:type="dxa"/>
+              <w:bottom w:w="35" w:type="dxa"/>
+              <w:left w:w="80" w:type="dxa"/>
+              <w:right w:w="80" w:type="dxa"/>
             </w:tcMar>
             <w:shd w:fill="FFFFFF"/>
             <w:tcBorders>
@@ -2087,20 +2182,20 @@
                 <w:rFonts w:ascii="Segoe UI" w:hAnsi="Segoe UI" w:cs="Kalpurush"/>
                 <w:b w:val="0"/>
                 <w:i w:val="0"/>
-                <w:color w:val="334155"/>
-                <w:sz w:val="16"/>
+                <w:color w:val="1E293B"/>
+                <w:sz w:val="15"/>
               </w:rPr>
             </w:r>
           </w:p>
         </w:tc>
         <w:tc>
           <w:tcPr>
-            <w:tcW w:type="dxa" w:w="1584"/>
+            <w:tcW w:type="dxa" w:w="1656"/>
             <w:tcMar>
-              <w:top w:w="45" w:type="dxa"/>
-              <w:bottom w:w="45" w:type="dxa"/>
-              <w:left w:w="60" w:type="dxa"/>
-              <w:right w:w="60" w:type="dxa"/>
+              <w:top w:w="35" w:type="dxa"/>
+              <w:bottom w:w="35" w:type="dxa"/>
+              <w:left w:w="50" w:type="dxa"/>
+              <w:right w:w="50" w:type="dxa"/>
             </w:tcMar>
             <w:shd w:fill="FFFFFF"/>
             <w:tcBorders>
@@ -2120,8 +2215,8 @@
                 <w:rFonts w:ascii="Segoe UI" w:hAnsi="Segoe UI" w:cs="Kalpurush"/>
                 <w:b w:val="0"/>
                 <w:i w:val="0"/>
-                <w:color w:val="334155"/>
-                <w:sz w:val="16"/>
+                <w:color w:val="1E293B"/>
+                <w:sz w:val="15"/>
               </w:rPr>
             </w:r>
           </w:p>
@@ -2130,12 +2225,12 @@
       <w:tr>
         <w:tc>
           <w:tcPr>
-            <w:tcW w:type="dxa" w:w="648"/>
+            <w:tcW w:type="dxa" w:w="605"/>
             <w:tcMar>
-              <w:top w:w="45" w:type="dxa"/>
-              <w:bottom w:w="45" w:type="dxa"/>
-              <w:left w:w="60" w:type="dxa"/>
-              <w:right w:w="60" w:type="dxa"/>
+              <w:top w:w="35" w:type="dxa"/>
+              <w:bottom w:w="35" w:type="dxa"/>
+              <w:left w:w="50" w:type="dxa"/>
+              <w:right w:w="50" w:type="dxa"/>
             </w:tcMar>
             <w:shd w:fill="F8FAFC"/>
             <w:tcBorders>
@@ -2155,8 +2250,8 @@
                 <w:rFonts w:ascii="Segoe UI" w:hAnsi="Segoe UI" w:cs="Kalpurush"/>
                 <w:b/>
                 <w:i w:val="0"/>
-                <w:color w:val="0F2C59"/>
-                <w:sz w:val="16"/>
+                <w:color w:val="0369A1"/>
+                <w:sz w:val="15"/>
               </w:rPr>
               <w:t>১০</w:t>
             </w:r>
@@ -2164,12 +2259,12 @@
         </w:tc>
         <w:tc>
           <w:tcPr>
-            <w:tcW w:type="dxa" w:w="6264"/>
+            <w:tcW w:type="dxa" w:w="6552"/>
             <w:tcMar>
-              <w:top w:w="45" w:type="dxa"/>
-              <w:bottom w:w="45" w:type="dxa"/>
-              <w:left w:w="100" w:type="dxa"/>
-              <w:right w:w="100" w:type="dxa"/>
+              <w:top w:w="35" w:type="dxa"/>
+              <w:bottom w:w="35" w:type="dxa"/>
+              <w:left w:w="80" w:type="dxa"/>
+              <w:right w:w="80" w:type="dxa"/>
             </w:tcMar>
             <w:shd w:fill="F8FAFC"/>
             <w:tcBorders>
@@ -2182,15 +2277,14 @@
           <w:p>
             <w:pPr>
               <w:spacing w:before="0" w:after="0"/>
-              <w:jc w:val="left"/>
             </w:pPr>
             <w:r>
               <w:rPr>
                 <w:rFonts w:ascii="Segoe UI" w:hAnsi="Segoe UI" w:cs="Kalpurush"/>
                 <w:b w:val="0"/>
                 <w:i w:val="0"/>
-                <w:color w:val="334155"/>
-                <w:sz w:val="16"/>
+                <w:color w:val="1E293B"/>
+                <w:sz w:val="15"/>
               </w:rPr>
               <w:t>C&amp;F কমিশন, বন্দর মাশুল (Port Bill), শিপিং বিল, ডক লেবার বিল ও হ্যান্ডলিং চার্জ</w:t>
             </w:r>
@@ -2198,12 +2292,12 @@
         </w:tc>
         <w:tc>
           <w:tcPr>
-            <w:tcW w:type="dxa" w:w="1829"/>
+            <w:tcW w:type="dxa" w:w="1800"/>
             <w:tcMar>
-              <w:top w:w="45" w:type="dxa"/>
-              <w:bottom w:w="45" w:type="dxa"/>
-              <w:left w:w="100" w:type="dxa"/>
-              <w:right w:w="100" w:type="dxa"/>
+              <w:top w:w="35" w:type="dxa"/>
+              <w:bottom w:w="35" w:type="dxa"/>
+              <w:left w:w="80" w:type="dxa"/>
+              <w:right w:w="80" w:type="dxa"/>
             </w:tcMar>
             <w:shd w:fill="F8FAFC"/>
             <w:tcBorders>
@@ -2223,20 +2317,20 @@
                 <w:rFonts w:ascii="Segoe UI" w:hAnsi="Segoe UI" w:cs="Kalpurush"/>
                 <w:b w:val="0"/>
                 <w:i w:val="0"/>
-                <w:color w:val="334155"/>
-                <w:sz w:val="16"/>
+                <w:color w:val="1E293B"/>
+                <w:sz w:val="15"/>
               </w:rPr>
             </w:r>
           </w:p>
         </w:tc>
         <w:tc>
           <w:tcPr>
-            <w:tcW w:type="dxa" w:w="1584"/>
+            <w:tcW w:type="dxa" w:w="1656"/>
             <w:tcMar>
-              <w:top w:w="45" w:type="dxa"/>
-              <w:bottom w:w="45" w:type="dxa"/>
-              <w:left w:w="60" w:type="dxa"/>
-              <w:right w:w="60" w:type="dxa"/>
+              <w:top w:w="35" w:type="dxa"/>
+              <w:bottom w:w="35" w:type="dxa"/>
+              <w:left w:w="50" w:type="dxa"/>
+              <w:right w:w="50" w:type="dxa"/>
             </w:tcMar>
             <w:shd w:fill="F8FAFC"/>
             <w:tcBorders>
@@ -2256,8 +2350,8 @@
                 <w:rFonts w:ascii="Segoe UI" w:hAnsi="Segoe UI" w:cs="Kalpurush"/>
                 <w:b w:val="0"/>
                 <w:i w:val="0"/>
-                <w:color w:val="334155"/>
-                <w:sz w:val="16"/>
+                <w:color w:val="1E293B"/>
+                <w:sz w:val="15"/>
               </w:rPr>
             </w:r>
           </w:p>
@@ -2266,12 +2360,12 @@
       <w:tr>
         <w:tc>
           <w:tcPr>
-            <w:tcW w:type="dxa" w:w="648"/>
+            <w:tcW w:type="dxa" w:w="605"/>
             <w:tcMar>
-              <w:top w:w="45" w:type="dxa"/>
-              <w:bottom w:w="45" w:type="dxa"/>
-              <w:left w:w="60" w:type="dxa"/>
-              <w:right w:w="60" w:type="dxa"/>
+              <w:top w:w="35" w:type="dxa"/>
+              <w:bottom w:w="35" w:type="dxa"/>
+              <w:left w:w="50" w:type="dxa"/>
+              <w:right w:w="50" w:type="dxa"/>
             </w:tcMar>
             <w:shd w:fill="FFFFFF"/>
             <w:tcBorders>
@@ -2291,8 +2385,8 @@
                 <w:rFonts w:ascii="Segoe UI" w:hAnsi="Segoe UI" w:cs="Kalpurush"/>
                 <w:b/>
                 <w:i w:val="0"/>
-                <w:color w:val="0F2C59"/>
-                <w:sz w:val="16"/>
+                <w:color w:val="0369A1"/>
+                <w:sz w:val="15"/>
               </w:rPr>
               <w:t>১১</w:t>
             </w:r>
@@ -2300,12 +2394,12 @@
         </w:tc>
         <w:tc>
           <w:tcPr>
-            <w:tcW w:type="dxa" w:w="6264"/>
+            <w:tcW w:type="dxa" w:w="6552"/>
             <w:tcMar>
-              <w:top w:w="45" w:type="dxa"/>
-              <w:bottom w:w="45" w:type="dxa"/>
-              <w:left w:w="100" w:type="dxa"/>
-              <w:right w:w="100" w:type="dxa"/>
+              <w:top w:w="35" w:type="dxa"/>
+              <w:bottom w:w="35" w:type="dxa"/>
+              <w:left w:w="80" w:type="dxa"/>
+              <w:right w:w="80" w:type="dxa"/>
             </w:tcMar>
             <w:shd w:fill="FFFFFF"/>
             <w:tcBorders>
@@ -2318,15 +2412,14 @@
           <w:p>
             <w:pPr>
               <w:spacing w:before="0" w:after="0"/>
-              <w:jc w:val="left"/>
             </w:pPr>
             <w:r>
               <w:rPr>
                 <w:rFonts w:ascii="Segoe UI" w:hAnsi="Segoe UI" w:cs="Kalpurush"/>
                 <w:b w:val="0"/>
                 <w:i w:val="0"/>
-                <w:color w:val="334155"/>
-                <w:sz w:val="16"/>
+                <w:color w:val="1E293B"/>
+                <w:sz w:val="15"/>
               </w:rPr>
               <w:t>ঘাট খেয়া পারাপার ও চ্যানেল পরিবহন খরচ</w:t>
             </w:r>
@@ -2334,12 +2427,12 @@
         </w:tc>
         <w:tc>
           <w:tcPr>
-            <w:tcW w:type="dxa" w:w="1829"/>
+            <w:tcW w:type="dxa" w:w="1800"/>
             <w:tcMar>
-              <w:top w:w="45" w:type="dxa"/>
-              <w:bottom w:w="45" w:type="dxa"/>
-              <w:left w:w="100" w:type="dxa"/>
-              <w:right w:w="100" w:type="dxa"/>
+              <w:top w:w="35" w:type="dxa"/>
+              <w:bottom w:w="35" w:type="dxa"/>
+              <w:left w:w="80" w:type="dxa"/>
+              <w:right w:w="80" w:type="dxa"/>
             </w:tcMar>
             <w:shd w:fill="FFFFFF"/>
             <w:tcBorders>
@@ -2359,20 +2452,20 @@
                 <w:rFonts w:ascii="Segoe UI" w:hAnsi="Segoe UI" w:cs="Kalpurush"/>
                 <w:b w:val="0"/>
                 <w:i w:val="0"/>
-                <w:color w:val="334155"/>
-                <w:sz w:val="16"/>
+                <w:color w:val="1E293B"/>
+                <w:sz w:val="15"/>
               </w:rPr>
             </w:r>
           </w:p>
         </w:tc>
         <w:tc>
           <w:tcPr>
-            <w:tcW w:type="dxa" w:w="1584"/>
+            <w:tcW w:type="dxa" w:w="1656"/>
             <w:tcMar>
-              <w:top w:w="45" w:type="dxa"/>
-              <w:bottom w:w="45" w:type="dxa"/>
-              <w:left w:w="60" w:type="dxa"/>
-              <w:right w:w="60" w:type="dxa"/>
+              <w:top w:w="35" w:type="dxa"/>
+              <w:bottom w:w="35" w:type="dxa"/>
+              <w:left w:w="50" w:type="dxa"/>
+              <w:right w:w="50" w:type="dxa"/>
             </w:tcMar>
             <w:shd w:fill="FFFFFF"/>
             <w:tcBorders>
@@ -2392,8 +2485,8 @@
                 <w:rFonts w:ascii="Segoe UI" w:hAnsi="Segoe UI" w:cs="Kalpurush"/>
                 <w:b w:val="0"/>
                 <w:i w:val="0"/>
-                <w:color w:val="334155"/>
-                <w:sz w:val="16"/>
+                <w:color w:val="1E293B"/>
+                <w:sz w:val="15"/>
               </w:rPr>
             </w:r>
           </w:p>
@@ -2402,12 +2495,12 @@
       <w:tr>
         <w:tc>
           <w:tcPr>
-            <w:tcW w:type="dxa" w:w="648"/>
+            <w:tcW w:type="dxa" w:w="605"/>
             <w:tcMar>
-              <w:top w:w="45" w:type="dxa"/>
-              <w:bottom w:w="45" w:type="dxa"/>
-              <w:left w:w="60" w:type="dxa"/>
-              <w:right w:w="60" w:type="dxa"/>
+              <w:top w:w="35" w:type="dxa"/>
+              <w:bottom w:w="35" w:type="dxa"/>
+              <w:left w:w="50" w:type="dxa"/>
+              <w:right w:w="50" w:type="dxa"/>
             </w:tcMar>
             <w:shd w:fill="F8FAFC"/>
             <w:tcBorders>
@@ -2427,8 +2520,8 @@
                 <w:rFonts w:ascii="Segoe UI" w:hAnsi="Segoe UI" w:cs="Kalpurush"/>
                 <w:b/>
                 <w:i w:val="0"/>
-                <w:color w:val="0F2C59"/>
-                <w:sz w:val="16"/>
+                <w:color w:val="0369A1"/>
+                <w:sz w:val="15"/>
               </w:rPr>
               <w:t>১২</w:t>
             </w:r>
@@ -2436,12 +2529,12 @@
         </w:tc>
         <w:tc>
           <w:tcPr>
-            <w:tcW w:type="dxa" w:w="6264"/>
+            <w:tcW w:type="dxa" w:w="6552"/>
             <w:tcMar>
-              <w:top w:w="45" w:type="dxa"/>
-              <w:bottom w:w="45" w:type="dxa"/>
-              <w:left w:w="100" w:type="dxa"/>
-              <w:right w:w="100" w:type="dxa"/>
+              <w:top w:w="35" w:type="dxa"/>
+              <w:bottom w:w="35" w:type="dxa"/>
+              <w:left w:w="80" w:type="dxa"/>
+              <w:right w:w="80" w:type="dxa"/>
             </w:tcMar>
             <w:shd w:fill="F8FAFC"/>
             <w:tcBorders>
@@ -2454,15 +2547,14 @@
           <w:p>
             <w:pPr>
               <w:spacing w:before="0" w:after="0"/>
-              <w:jc w:val="left"/>
             </w:pPr>
             <w:r>
               <w:rPr>
                 <w:rFonts w:ascii="Segoe UI" w:hAnsi="Segoe UI" w:cs="Kalpurush"/>
                 <w:b w:val="0"/>
                 <w:i w:val="0"/>
-                <w:color w:val="334155"/>
-                <w:sz w:val="16"/>
+                <w:color w:val="1E293B"/>
+                <w:sz w:val="15"/>
               </w:rPr>
               <w:t>বিবিধ আনুষঙ্গিক খরচ (অন্যান্য)</w:t>
             </w:r>
@@ -2470,12 +2562,12 @@
         </w:tc>
         <w:tc>
           <w:tcPr>
-            <w:tcW w:type="dxa" w:w="1829"/>
+            <w:tcW w:type="dxa" w:w="1800"/>
             <w:tcMar>
-              <w:top w:w="45" w:type="dxa"/>
-              <w:bottom w:w="45" w:type="dxa"/>
-              <w:left w:w="100" w:type="dxa"/>
-              <w:right w:w="100" w:type="dxa"/>
+              <w:top w:w="35" w:type="dxa"/>
+              <w:bottom w:w="35" w:type="dxa"/>
+              <w:left w:w="80" w:type="dxa"/>
+              <w:right w:w="80" w:type="dxa"/>
             </w:tcMar>
             <w:shd w:fill="F8FAFC"/>
             <w:tcBorders>
@@ -2495,20 +2587,20 @@
                 <w:rFonts w:ascii="Segoe UI" w:hAnsi="Segoe UI" w:cs="Kalpurush"/>
                 <w:b w:val="0"/>
                 <w:i w:val="0"/>
-                <w:color w:val="334155"/>
-                <w:sz w:val="16"/>
+                <w:color w:val="1E293B"/>
+                <w:sz w:val="15"/>
               </w:rPr>
             </w:r>
           </w:p>
         </w:tc>
         <w:tc>
           <w:tcPr>
-            <w:tcW w:type="dxa" w:w="1584"/>
+            <w:tcW w:type="dxa" w:w="1656"/>
             <w:tcMar>
-              <w:top w:w="45" w:type="dxa"/>
-              <w:bottom w:w="45" w:type="dxa"/>
-              <w:left w:w="60" w:type="dxa"/>
-              <w:right w:w="60" w:type="dxa"/>
+              <w:top w:w="35" w:type="dxa"/>
+              <w:bottom w:w="35" w:type="dxa"/>
+              <w:left w:w="50" w:type="dxa"/>
+              <w:right w:w="50" w:type="dxa"/>
             </w:tcMar>
             <w:shd w:fill="F8FAFC"/>
             <w:tcBorders>
@@ -2528,8 +2620,8 @@
                 <w:rFonts w:ascii="Segoe UI" w:hAnsi="Segoe UI" w:cs="Kalpurush"/>
                 <w:b w:val="0"/>
                 <w:i w:val="0"/>
-                <w:color w:val="334155"/>
-                <w:sz w:val="16"/>
+                <w:color w:val="1E293B"/>
+                <w:sz w:val="15"/>
               </w:rPr>
             </w:r>
           </w:p>
@@ -2538,12 +2630,12 @@
       <w:tr>
         <w:tc>
           <w:tcPr>
-            <w:tcW w:type="dxa" w:w="648"/>
+            <w:tcW w:type="dxa" w:w="605"/>
             <w:tcMar>
-              <w:top w:w="45" w:type="dxa"/>
-              <w:bottom w:w="45" w:type="dxa"/>
-              <w:left w:w="60" w:type="dxa"/>
-              <w:right w:w="60" w:type="dxa"/>
+              <w:top w:w="35" w:type="dxa"/>
+              <w:bottom w:w="35" w:type="dxa"/>
+              <w:left w:w="50" w:type="dxa"/>
+              <w:right w:w="50" w:type="dxa"/>
             </w:tcMar>
             <w:shd w:fill="FFFFFF"/>
             <w:tcBorders>
@@ -2563,8 +2655,8 @@
                 <w:rFonts w:ascii="Segoe UI" w:hAnsi="Segoe UI" w:cs="Kalpurush"/>
                 <w:b/>
                 <w:i w:val="0"/>
-                <w:color w:val="0F2C59"/>
-                <w:sz w:val="16"/>
+                <w:color w:val="0369A1"/>
+                <w:sz w:val="15"/>
               </w:rPr>
               <w:t>১৩</w:t>
             </w:r>
@@ -2572,12 +2664,12 @@
         </w:tc>
         <w:tc>
           <w:tcPr>
-            <w:tcW w:type="dxa" w:w="6264"/>
+            <w:tcW w:type="dxa" w:w="6552"/>
             <w:tcMar>
-              <w:top w:w="45" w:type="dxa"/>
-              <w:bottom w:w="45" w:type="dxa"/>
-              <w:left w:w="100" w:type="dxa"/>
-              <w:right w:w="100" w:type="dxa"/>
+              <w:top w:w="35" w:type="dxa"/>
+              <w:bottom w:w="35" w:type="dxa"/>
+              <w:left w:w="80" w:type="dxa"/>
+              <w:right w:w="80" w:type="dxa"/>
             </w:tcMar>
             <w:shd w:fill="FFFFFF"/>
             <w:tcBorders>
@@ -2590,15 +2682,14 @@
           <w:p>
             <w:pPr>
               <w:spacing w:before="0" w:after="0"/>
-              <w:jc w:val="left"/>
             </w:pPr>
             <w:r>
               <w:rPr>
                 <w:rFonts w:ascii="Segoe UI" w:hAnsi="Segoe UI" w:cs="Kalpurush"/>
                 <w:b w:val="0"/>
                 <w:i w:val="0"/>
-                <w:color w:val="334155"/>
-                <w:sz w:val="16"/>
+                <w:color w:val="1E293B"/>
+                <w:sz w:val="15"/>
               </w:rPr>
               <w:t>অতিরিক্ত খাত (প্রয়োজন অনুযায়ী কাস্টম এন্ট্রি)</w:t>
             </w:r>
@@ -2606,12 +2697,12 @@
         </w:tc>
         <w:tc>
           <w:tcPr>
-            <w:tcW w:type="dxa" w:w="1829"/>
+            <w:tcW w:type="dxa" w:w="1800"/>
             <w:tcMar>
-              <w:top w:w="45" w:type="dxa"/>
-              <w:bottom w:w="45" w:type="dxa"/>
-              <w:left w:w="100" w:type="dxa"/>
-              <w:right w:w="100" w:type="dxa"/>
+              <w:top w:w="35" w:type="dxa"/>
+              <w:bottom w:w="35" w:type="dxa"/>
+              <w:left w:w="80" w:type="dxa"/>
+              <w:right w:w="80" w:type="dxa"/>
             </w:tcMar>
             <w:shd w:fill="FFFFFF"/>
             <w:tcBorders>
@@ -2631,20 +2722,20 @@
                 <w:rFonts w:ascii="Segoe UI" w:hAnsi="Segoe UI" w:cs="Kalpurush"/>
                 <w:b w:val="0"/>
                 <w:i w:val="0"/>
-                <w:color w:val="334155"/>
-                <w:sz w:val="16"/>
+                <w:color w:val="1E293B"/>
+                <w:sz w:val="15"/>
               </w:rPr>
             </w:r>
           </w:p>
         </w:tc>
         <w:tc>
           <w:tcPr>
-            <w:tcW w:type="dxa" w:w="1584"/>
+            <w:tcW w:type="dxa" w:w="1656"/>
             <w:tcMar>
-              <w:top w:w="45" w:type="dxa"/>
-              <w:bottom w:w="45" w:type="dxa"/>
-              <w:left w:w="60" w:type="dxa"/>
-              <w:right w:w="60" w:type="dxa"/>
+              <w:top w:w="35" w:type="dxa"/>
+              <w:bottom w:w="35" w:type="dxa"/>
+              <w:left w:w="50" w:type="dxa"/>
+              <w:right w:w="50" w:type="dxa"/>
             </w:tcMar>
             <w:shd w:fill="FFFFFF"/>
             <w:tcBorders>
@@ -2664,8 +2755,8 @@
                 <w:rFonts w:ascii="Segoe UI" w:hAnsi="Segoe UI" w:cs="Kalpurush"/>
                 <w:b w:val="0"/>
                 <w:i w:val="0"/>
-                <w:color w:val="334155"/>
-                <w:sz w:val="16"/>
+                <w:color w:val="1E293B"/>
+                <w:sz w:val="15"/>
               </w:rPr>
             </w:r>
           </w:p>
@@ -2674,17 +2765,17 @@
       <w:tr>
         <w:tc>
           <w:tcPr>
-            <w:tcW w:type="dxa" w:w="5162"/>
+            <w:tcW w:type="dxa" w:w="5306"/>
             <w:gridSpan w:val="2"/>
             <w:tcMar>
-              <w:top w:w="60" w:type="dxa"/>
-              <w:bottom w:w="60" w:type="dxa"/>
-              <w:left w:w="100" w:type="dxa"/>
-              <w:right w:w="100" w:type="dxa"/>
+              <w:top w:w="50" w:type="dxa"/>
+              <w:bottom w:w="50" w:type="dxa"/>
+              <w:left w:w="80" w:type="dxa"/>
+              <w:right w:w="80" w:type="dxa"/>
             </w:tcMar>
-            <w:shd w:fill="E2E8F0"/>
+            <w:shd w:fill="E0F2FE"/>
             <w:tcBorders>
-              <w:top w:val="single" w:sz="6" w:space="0" w:color="0F2C59"/>
+              <w:top w:val="single" w:sz="6" w:space="0" w:color="0369A1"/>
               <w:bottom w:val="single" w:sz="6" w:space="0" w:color="94A3B8"/>
               <w:left w:val="single" w:sz="6" w:space="0" w:color="CBD5E1"/>
               <w:right w:val="single" w:sz="6" w:space="0" w:color="CBD5E1"/>
@@ -2700,8 +2791,8 @@
                 <w:rFonts w:ascii="Segoe UI" w:hAnsi="Segoe UI" w:cs="Kalpurush"/>
                 <w:b/>
                 <w:i w:val="0"/>
-                <w:color w:val="0F2C59"/>
-                <w:sz w:val="17"/>
+                <w:color w:val="0369A1"/>
+                <w:sz w:val="16"/>
               </w:rPr>
               <w:t>প্রতি কন্টেইনার সর্বমোট খালাস খরচ (TOTAL EXPENSES):</w:t>
             </w:r>
@@ -2709,16 +2800,16 @@
         </w:tc>
         <w:tc>
           <w:tcPr>
-            <w:tcW w:type="dxa" w:w="2581"/>
+            <w:tcW w:type="dxa" w:w="2653"/>
             <w:tcMar>
-              <w:top w:w="60" w:type="dxa"/>
-              <w:bottom w:w="60" w:type="dxa"/>
-              <w:left w:w="100" w:type="dxa"/>
-              <w:right w:w="100" w:type="dxa"/>
+              <w:top w:w="50" w:type="dxa"/>
+              <w:bottom w:w="50" w:type="dxa"/>
+              <w:left w:w="80" w:type="dxa"/>
+              <w:right w:w="80" w:type="dxa"/>
             </w:tcMar>
-            <w:shd w:fill="E2E8F0"/>
+            <w:shd w:fill="E0F2FE"/>
             <w:tcBorders>
-              <w:top w:val="single" w:sz="6" w:space="0" w:color="0F2C59"/>
+              <w:top w:val="single" w:sz="6" w:space="0" w:color="0369A1"/>
               <w:bottom w:val="single" w:sz="6" w:space="0" w:color="94A3B8"/>
               <w:left w:val="single" w:sz="6" w:space="0" w:color="CBD5E1"/>
               <w:right w:val="single" w:sz="6" w:space="0" w:color="CBD5E1"/>
@@ -2734,8 +2825,8 @@
                 <w:rFonts w:ascii="Segoe UI" w:hAnsi="Segoe UI" w:cs="Kalpurush"/>
                 <w:b/>
                 <w:i w:val="0"/>
-                <w:color w:val="0F2C59"/>
-                <w:sz w:val="17"/>
+                <w:color w:val="0369A1"/>
+                <w:sz w:val="16"/>
               </w:rPr>
               <w:t>= TK</w:t>
             </w:r>
@@ -2743,16 +2834,16 @@
         </w:tc>
         <w:tc>
           <w:tcPr>
-            <w:tcW w:type="dxa" w:w="2581"/>
+            <w:tcW w:type="dxa" w:w="2653"/>
             <w:tcMar>
-              <w:top w:w="60" w:type="dxa"/>
-              <w:bottom w:w="60" w:type="dxa"/>
-              <w:left w:w="60" w:type="dxa"/>
-              <w:right w:w="60" w:type="dxa"/>
+              <w:top w:w="50" w:type="dxa"/>
+              <w:bottom w:w="50" w:type="dxa"/>
+              <w:left w:w="50" w:type="dxa"/>
+              <w:right w:w="50" w:type="dxa"/>
             </w:tcMar>
-            <w:shd w:fill="E2E8F0"/>
+            <w:shd w:fill="E0F2FE"/>
             <w:tcBorders>
-              <w:top w:val="single" w:sz="6" w:space="0" w:color="0F2C59"/>
+              <w:top w:val="single" w:sz="6" w:space="0" w:color="0369A1"/>
               <w:bottom w:val="single" w:sz="6" w:space="0" w:color="94A3B8"/>
               <w:left w:val="single" w:sz="6" w:space="0" w:color="CBD5E1"/>
               <w:right w:val="single" w:sz="6" w:space="0" w:color="CBD5E1"/>
@@ -2767,8 +2858,8 @@
                 <w:rFonts w:ascii="Segoe UI" w:hAnsi="Segoe UI" w:cs="Kalpurush"/>
                 <w:b/>
                 <w:i w:val="0"/>
-                <w:color w:val="334155"/>
-                <w:sz w:val="15"/>
+                <w:color w:val="0369A1"/>
+                <w:sz w:val="14"/>
               </w:rPr>
               <w:t>সর্বমোট ব্যয়</w:t>
             </w:r>
@@ -2778,13 +2869,13 @@
       <w:tr>
         <w:tc>
           <w:tcPr>
-            <w:tcW w:type="dxa" w:w="5162"/>
+            <w:tcW w:type="dxa" w:w="5306"/>
             <w:gridSpan w:val="2"/>
             <w:tcMar>
-              <w:top w:w="60" w:type="dxa"/>
-              <w:bottom w:w="60" w:type="dxa"/>
-              <w:left w:w="100" w:type="dxa"/>
-              <w:right w:w="100" w:type="dxa"/>
+              <w:top w:w="50" w:type="dxa"/>
+              <w:bottom w:w="50" w:type="dxa"/>
+              <w:left w:w="80" w:type="dxa"/>
+              <w:right w:w="80" w:type="dxa"/>
             </w:tcMar>
             <w:shd w:fill="F0FDF4"/>
             <w:tcBorders>
@@ -2805,7 +2896,7 @@
                 <w:b/>
                 <w:i w:val="0"/>
                 <w:color w:val="166534"/>
-                <w:sz w:val="17"/>
+                <w:sz w:val="16"/>
               </w:rPr>
               <w:t>বাদ: প্রাপ্ত নগদ / ব্যাংক অগ্রিম জমা (Less: Advance Received):</w:t>
             </w:r>
@@ -2813,12 +2904,12 @@
         </w:tc>
         <w:tc>
           <w:tcPr>
-            <w:tcW w:type="dxa" w:w="2581"/>
+            <w:tcW w:type="dxa" w:w="2653"/>
             <w:tcMar>
-              <w:top w:w="60" w:type="dxa"/>
-              <w:bottom w:w="60" w:type="dxa"/>
-              <w:left w:w="100" w:type="dxa"/>
-              <w:right w:w="100" w:type="dxa"/>
+              <w:top w:w="50" w:type="dxa"/>
+              <w:bottom w:w="50" w:type="dxa"/>
+              <w:left w:w="80" w:type="dxa"/>
+              <w:right w:w="80" w:type="dxa"/>
             </w:tcMar>
             <w:shd w:fill="F0FDF4"/>
             <w:tcBorders>
@@ -2838,19 +2929,19 @@
                 <w:b/>
                 <w:i w:val="0"/>
                 <w:color w:val="166534"/>
-                <w:sz w:val="17"/>
+                <w:sz w:val="16"/>
               </w:rPr>
             </w:r>
           </w:p>
         </w:tc>
         <w:tc>
           <w:tcPr>
-            <w:tcW w:type="dxa" w:w="2581"/>
+            <w:tcW w:type="dxa" w:w="2653"/>
             <w:tcMar>
-              <w:top w:w="60" w:type="dxa"/>
-              <w:bottom w:w="60" w:type="dxa"/>
-              <w:left w:w="60" w:type="dxa"/>
-              <w:right w:w="60" w:type="dxa"/>
+              <w:top w:w="50" w:type="dxa"/>
+              <w:bottom w:w="50" w:type="dxa"/>
+              <w:left w:w="50" w:type="dxa"/>
+              <w:right w:w="50" w:type="dxa"/>
             </w:tcMar>
             <w:shd w:fill="F0FDF4"/>
             <w:tcBorders>
@@ -2870,7 +2961,7 @@
                 <w:b/>
                 <w:i w:val="0"/>
                 <w:color w:val="166534"/>
-                <w:sz w:val="15"/>
+                <w:sz w:val="14"/>
               </w:rPr>
               <w:t>জমা / ক্রেডিট (+)</w:t>
             </w:r>
@@ -2880,18 +2971,18 @@
       <w:tr>
         <w:tc>
           <w:tcPr>
-            <w:tcW w:type="dxa" w:w="5162"/>
+            <w:tcW w:type="dxa" w:w="5306"/>
             <w:gridSpan w:val="2"/>
             <w:tcMar>
-              <w:top w:w="60" w:type="dxa"/>
-              <w:bottom w:w="60" w:type="dxa"/>
-              <w:left w:w="100" w:type="dxa"/>
-              <w:right w:w="100" w:type="dxa"/>
+              <w:top w:w="55" w:type="dxa"/>
+              <w:bottom w:w="55" w:type="dxa"/>
+              <w:left w:w="80" w:type="dxa"/>
+              <w:right w:w="80" w:type="dxa"/>
             </w:tcMar>
             <w:shd w:fill="FEF2F2"/>
             <w:tcBorders>
               <w:top w:val="single" w:sz="6" w:space="0" w:color="94A3B8"/>
-              <w:bottom w:val="single" w:sz="6" w:space="0" w:color="0F2C59"/>
+              <w:bottom w:val="single" w:sz="6" w:space="0" w:color="DC2626"/>
               <w:left w:val="single" w:sz="6" w:space="0" w:color="CBD5E1"/>
               <w:right w:val="single" w:sz="6" w:space="0" w:color="CBD5E1"/>
             </w:tcBorders>
@@ -2906,8 +2997,8 @@
                 <w:rFonts w:ascii="Segoe UI" w:hAnsi="Segoe UI" w:cs="Kalpurush"/>
                 <w:b/>
                 <w:i w:val="0"/>
-                <w:color w:val="C53030"/>
-                <w:sz w:val="18"/>
+                <w:color w:val="DC2626"/>
+                <w:sz w:val="17"/>
               </w:rPr>
               <w:t>সর্বমোট নিট অবশিষ্ট বকেয়া / ব্যালেন্স (TOTAL NET BALANCE DUE):</w:t>
             </w:r>
@@ -2915,17 +3006,17 @@
         </w:tc>
         <w:tc>
           <w:tcPr>
-            <w:tcW w:type="dxa" w:w="2581"/>
+            <w:tcW w:type="dxa" w:w="2653"/>
             <w:tcMar>
-              <w:top w:w="60" w:type="dxa"/>
-              <w:bottom w:w="60" w:type="dxa"/>
-              <w:left w:w="100" w:type="dxa"/>
-              <w:right w:w="100" w:type="dxa"/>
+              <w:top w:w="55" w:type="dxa"/>
+              <w:bottom w:w="55" w:type="dxa"/>
+              <w:left w:w="80" w:type="dxa"/>
+              <w:right w:w="80" w:type="dxa"/>
             </w:tcMar>
             <w:shd w:fill="FEF2F2"/>
             <w:tcBorders>
               <w:top w:val="single" w:sz="6" w:space="0" w:color="94A3B8"/>
-              <w:bottom w:val="single" w:sz="6" w:space="0" w:color="0F2C59"/>
+              <w:bottom w:val="single" w:sz="6" w:space="0" w:color="DC2626"/>
               <w:left w:val="single" w:sz="6" w:space="0" w:color="CBD5E1"/>
               <w:right w:val="single" w:sz="6" w:space="0" w:color="CBD5E1"/>
             </w:tcBorders>
@@ -2939,8 +3030,8 @@
                 <w:rFonts w:ascii="Segoe UI" w:hAnsi="Segoe UI" w:cs="Kalpurush"/>
                 <w:b/>
                 <w:i w:val="0"/>
-                <w:color w:val="C53030"/>
-                <w:sz w:val="18"/>
+                <w:color w:val="DC2626"/>
+                <w:sz w:val="17"/>
               </w:rPr>
               <w:t>= TK</w:t>
             </w:r>
@@ -2948,17 +3039,17 @@
         </w:tc>
         <w:tc>
           <w:tcPr>
-            <w:tcW w:type="dxa" w:w="2581"/>
+            <w:tcW w:type="dxa" w:w="2653"/>
             <w:tcMar>
-              <w:top w:w="60" w:type="dxa"/>
-              <w:bottom w:w="60" w:type="dxa"/>
-              <w:left w:w="60" w:type="dxa"/>
-              <w:right w:w="60" w:type="dxa"/>
+              <w:top w:w="55" w:type="dxa"/>
+              <w:bottom w:w="55" w:type="dxa"/>
+              <w:left w:w="50" w:type="dxa"/>
+              <w:right w:w="50" w:type="dxa"/>
             </w:tcMar>
             <w:shd w:fill="FEF2F2"/>
             <w:tcBorders>
               <w:top w:val="single" w:sz="6" w:space="0" w:color="94A3B8"/>
-              <w:bottom w:val="single" w:sz="6" w:space="0" w:color="0F2C59"/>
+              <w:bottom w:val="single" w:sz="6" w:space="0" w:color="DC2626"/>
               <w:left w:val="single" w:sz="6" w:space="0" w:color="CBD5E1"/>
               <w:right w:val="single" w:sz="6" w:space="0" w:color="CBD5E1"/>
             </w:tcBorders>
@@ -2972,10 +3063,10 @@
                 <w:rFonts w:ascii="Segoe UI" w:hAnsi="Segoe UI" w:cs="Kalpurush"/>
                 <w:b/>
                 <w:i w:val="0"/>
-                <w:color w:val="C53030"/>
-                <w:sz w:val="15"/>
+                <w:color w:val="DC2626"/>
+                <w:sz w:val="14"/>
               </w:rPr>
-              <w:t>নিট প্রদেয় / বকেয়া</w:t>
+              <w:t>নিট বকেয়া (-)</w:t>
             </w:r>
           </w:p>
         </w:tc>
@@ -2983,15 +3074,15 @@
     </w:tbl>
     <w:p>
       <w:pPr>
-        <w:spacing w:before="100" w:after="200"/>
+        <w:spacing w:before="80" w:after="160"/>
       </w:pPr>
       <w:r>
         <w:rPr>
           <w:rFonts w:ascii="Segoe UI" w:hAnsi="Segoe UI" w:cs="Kalpurush"/>
           <w:b/>
           <w:i w:val="0"/>
-          <w:color w:val="0F2C59"/>
-          <w:sz w:val="17"/>
+          <w:color w:val="0369A1"/>
+          <w:sz w:val="16"/>
         </w:rPr>
         <w:t xml:space="preserve">কথায় (In Words): </w:t>
       </w:r>
@@ -3000,8 +3091,8 @@
           <w:rFonts w:ascii="Segoe UI" w:hAnsi="Segoe UI" w:cs="Kalpurush"/>
           <w:b w:val="0"/>
           <w:i w:val="0"/>
-          <w:color w:val="334155"/>
-          <w:sz w:val="17"/>
+          <w:color w:val="475569"/>
+          <w:sz w:val="16"/>
         </w:rPr>
         <w:t>................................................................................................................................................................... টাকা মাত্র।</w:t>
       </w:r>
@@ -3014,14 +3105,14 @@
         <w:tblLook w:firstColumn="1" w:firstRow="1" w:lastColumn="0" w:lastRow="0" w:noHBand="0" w:noVBand="1" w:val="04A0"/>
       </w:tblPr>
       <w:tblGrid>
-        <w:gridCol w:w="3442"/>
-        <w:gridCol w:w="3442"/>
-        <w:gridCol w:w="3442"/>
+        <w:gridCol w:w="3538"/>
+        <w:gridCol w:w="3538"/>
+        <w:gridCol w:w="3538"/>
       </w:tblGrid>
       <w:tr>
         <w:tc>
           <w:tcPr>
-            <w:tcW w:type="dxa" w:w="3442"/>
+            <w:tcW w:type="dxa" w:w="3528"/>
             <w:tcBorders>
               <w:top w:val="none" w:sz="4" w:space="0" w:color="auto"/>
               <w:bottom w:val="none" w:sz="4" w:space="0" w:color="auto"/>
@@ -3038,8 +3129,8 @@
                 <w:rFonts w:ascii="Segoe UI" w:hAnsi="Segoe UI" w:cs="Kalpurush"/>
                 <w:b w:val="0"/>
                 <w:i w:val="0"/>
-                <w:color w:val="334155"/>
-                <w:sz w:val="17"/>
+                <w:color w:val="475569"/>
+                <w:sz w:val="16"/>
               </w:rPr>
               <w:t>...................................................</w:t>
               <w:br/>
@@ -3049,8 +3140,8 @@
                 <w:rFonts w:ascii="Segoe UI" w:hAnsi="Segoe UI" w:cs="Kalpurush"/>
                 <w:b/>
                 <w:i w:val="0"/>
-                <w:color w:val="0F2C59"/>
-                <w:sz w:val="17"/>
+                <w:color w:val="0369A1"/>
+                <w:sz w:val="16"/>
               </w:rPr>
               <w:t>প্রস্তুতকারকের স্বাক্ষর</w:t>
               <w:br/>
@@ -3060,8 +3151,8 @@
                 <w:rFonts w:ascii="Segoe UI" w:hAnsi="Segoe UI" w:cs="Kalpurush"/>
                 <w:b w:val="0"/>
                 <w:i/>
-                <w:color w:val="334155"/>
-                <w:sz w:val="15"/>
+                <w:color w:val="475569"/>
+                <w:sz w:val="14"/>
               </w:rPr>
               <w:t>(Prepared By)</w:t>
             </w:r>
@@ -3069,7 +3160,7 @@
         </w:tc>
         <w:tc>
           <w:tcPr>
-            <w:tcW w:type="dxa" w:w="3442"/>
+            <w:tcW w:type="dxa" w:w="3528"/>
             <w:tcBorders>
               <w:top w:val="none" w:sz="4" w:space="0" w:color="auto"/>
               <w:bottom w:val="none" w:sz="4" w:space="0" w:color="auto"/>
@@ -3086,8 +3177,8 @@
                 <w:rFonts w:ascii="Segoe UI" w:hAnsi="Segoe UI" w:cs="Kalpurush"/>
                 <w:b w:val="0"/>
                 <w:i w:val="0"/>
-                <w:color w:val="334155"/>
-                <w:sz w:val="17"/>
+                <w:color w:val="475569"/>
+                <w:sz w:val="16"/>
               </w:rPr>
               <w:t>...................................................</w:t>
               <w:br/>
@@ -3097,8 +3188,8 @@
                 <w:rFonts w:ascii="Segoe UI" w:hAnsi="Segoe UI" w:cs="Kalpurush"/>
                 <w:b/>
                 <w:i w:val="0"/>
-                <w:color w:val="0F2C59"/>
-                <w:sz w:val="17"/>
+                <w:color w:val="0369A1"/>
+                <w:sz w:val="16"/>
               </w:rPr>
               <w:t>হিসাবরক্ষক / যাচাইকারী</w:t>
               <w:br/>
@@ -3108,8 +3199,8 @@
                 <w:rFonts w:ascii="Segoe UI" w:hAnsi="Segoe UI" w:cs="Kalpurush"/>
                 <w:b w:val="0"/>
                 <w:i/>
-                <w:color w:val="334155"/>
-                <w:sz w:val="15"/>
+                <w:color w:val="475569"/>
+                <w:sz w:val="14"/>
               </w:rPr>
               <w:t>(Verified &amp; Checked By)</w:t>
             </w:r>
@@ -3117,7 +3208,7 @@
         </w:tc>
         <w:tc>
           <w:tcPr>
-            <w:tcW w:type="dxa" w:w="3442"/>
+            <w:tcW w:type="dxa" w:w="3557"/>
             <w:tcBorders>
               <w:top w:val="none" w:sz="4" w:space="0" w:color="auto"/>
               <w:bottom w:val="none" w:sz="4" w:space="0" w:color="auto"/>
@@ -3134,8 +3225,8 @@
                 <w:rFonts w:ascii="Segoe UI" w:hAnsi="Segoe UI" w:cs="Kalpurush"/>
                 <w:b w:val="0"/>
                 <w:i w:val="0"/>
-                <w:color w:val="334155"/>
-                <w:sz w:val="17"/>
+                <w:color w:val="475569"/>
+                <w:sz w:val="16"/>
               </w:rPr>
               <w:t>...................................................</w:t>
               <w:br/>
@@ -3145,8 +3236,8 @@
                 <w:rFonts w:ascii="Segoe UI" w:hAnsi="Segoe UI" w:cs="Kalpurush"/>
                 <w:b/>
                 <w:i w:val="0"/>
-                <w:color w:val="0F2C59"/>
-                <w:sz w:val="18"/>
+                <w:color w:val="0369A1"/>
+                <w:sz w:val="17"/>
               </w:rPr>
               <w:t>মেসার্স মা মটরস্</w:t>
               <w:br/>
@@ -3156,8 +3247,8 @@
                 <w:rFonts w:ascii="Segoe UI" w:hAnsi="Segoe UI" w:cs="Kalpurush"/>
                 <w:b/>
                 <w:i w:val="0"/>
-                <w:color w:val="334155"/>
-                <w:sz w:val="16"/>
+                <w:color w:val="1E293B"/>
+                <w:sz w:val="15"/>
               </w:rPr>
               <w:t>মোঃ এমরান (আইডি-৯৯২৯)</w:t>
               <w:br/>
@@ -3167,8 +3258,8 @@
                 <w:rFonts w:ascii="Segoe UI" w:hAnsi="Segoe UI" w:cs="Kalpurush"/>
                 <w:b w:val="0"/>
                 <w:i/>
-                <w:color w:val="334155"/>
-                <w:sz w:val="15"/>
+                <w:color w:val="475569"/>
+                <w:sz w:val="14"/>
               </w:rPr>
               <w:t>স্বত্বাধিকারী / অনুমোদিত স্বাক্ষর</w:t>
             </w:r>
@@ -3178,7 +3269,7 @@
     </w:tbl>
     <w:sectPr>
       <w:pgSz w:w="11909" w:h="16834"/>
-      <w:pgMar w:top="648" w:right="792" w:bottom="648" w:left="792" w:header="720" w:footer="720" w:gutter="0"/>
+      <w:pgMar w:top="504" w:right="648" w:bottom="504" w:left="648" w:header="720" w:footer="720" w:gutter="0"/>
       <w:cols w:space="720"/>
       <w:docGrid w:linePitch="360"/>
     </w:sectPr>

</xml_diff>

<commit_message>
Optimize container expense form with dotted writing guidelines and full page height balance
</commit_message>
<xml_diff>
--- a/Container_Expense_Statement_Form.docx
+++ b/Container_Expense_Statement_Form.docx
@@ -206,10 +206,10 @@
       <w:tr>
         <w:tc>
           <w:tcPr>
-            <w:tcW w:type="dxa" w:w="4608"/>
+            <w:tcW w:type="dxa" w:w="4464"/>
             <w:tcMar>
-              <w:top w:w="40" w:type="dxa"/>
-              <w:bottom w:w="40" w:type="dxa"/>
+              <w:top w:w="50" w:type="dxa"/>
+              <w:bottom w:w="50" w:type="dxa"/>
               <w:left w:w="80" w:type="dxa"/>
               <w:right w:w="80" w:type="dxa"/>
             </w:tcMar>
@@ -230,7 +230,7 @@
                 <w:rFonts w:ascii="Segoe UI" w:hAnsi="Segoe UI" w:cs="Kalpurush"/>
                 <w:b w:val="0"/>
                 <w:i/>
-                <w:color w:val="475569"/>
+                <w:color w:val="64748B"/>
                 <w:sz w:val="16"/>
               </w:rPr>
               <w:t>بِسْمِ اللَّهِ الرَّحْمَٰنِ الرَّحِيمِ (বিসমিল্লাহির রাহমানির রাহিম)</w:t>
@@ -241,8 +241,8 @@
           <w:tcPr>
             <w:tcW w:type="dxa" w:w="2304"/>
             <w:tcMar>
-              <w:top w:w="40" w:type="dxa"/>
-              <w:bottom w:w="40" w:type="dxa"/>
+              <w:top w:w="50" w:type="dxa"/>
+              <w:bottom w:w="50" w:type="dxa"/>
               <w:left w:w="80" w:type="dxa"/>
               <w:right w:w="80" w:type="dxa"/>
             </w:tcMar>
@@ -273,10 +273,10 @@
         </w:tc>
         <w:tc>
           <w:tcPr>
-            <w:tcW w:type="dxa" w:w="3701"/>
+            <w:tcW w:type="dxa" w:w="3845"/>
             <w:tcMar>
-              <w:top w:w="40" w:type="dxa"/>
-              <w:bottom w:w="40" w:type="dxa"/>
+              <w:top w:w="50" w:type="dxa"/>
+              <w:bottom w:w="50" w:type="dxa"/>
               <w:left w:w="80" w:type="dxa"/>
               <w:right w:w="80" w:type="dxa"/>
             </w:tcMar>
@@ -301,7 +301,17 @@
                 <w:color w:val="1E293B"/>
                 <w:sz w:val="17"/>
               </w:rPr>
-              <w:t>ডেলিভারি পার্টি: .......................................</w:t>
+              <w:t xml:space="preserve">ডেলিভারি পার্টি: </w:t>
+            </w:r>
+            <w:r>
+              <w:rPr>
+                <w:rFonts w:ascii="Segoe UI" w:hAnsi="Segoe UI" w:cs="Kalpurush"/>
+                <w:b w:val="0"/>
+                <w:i w:val="0"/>
+                <w:color w:val="94A3B8"/>
+                <w:sz w:val="17"/>
+              </w:rPr>
+              <w:t>............................................</w:t>
             </w:r>
           </w:p>
         </w:tc>
@@ -328,10 +338,10 @@
       <w:tr>
         <w:tc>
           <w:tcPr>
-            <w:tcW w:type="dxa" w:w="2592"/>
+            <w:tcW w:type="dxa" w:w="2520"/>
             <w:tcMar>
-              <w:top w:w="50" w:type="dxa"/>
-              <w:bottom w:w="50" w:type="dxa"/>
+              <w:top w:w="65" w:type="dxa"/>
+              <w:bottom w:w="65" w:type="dxa"/>
               <w:left w:w="80" w:type="dxa"/>
               <w:right w:w="80" w:type="dxa"/>
             </w:tcMar>
@@ -361,10 +371,10 @@
         </w:tc>
         <w:tc>
           <w:tcPr>
-            <w:tcW w:type="dxa" w:w="2707"/>
+            <w:tcW w:type="dxa" w:w="2779"/>
             <w:tcMar>
-              <w:top w:w="50" w:type="dxa"/>
-              <w:bottom w:w="50" w:type="dxa"/>
+              <w:top w:w="65" w:type="dxa"/>
+              <w:bottom w:w="65" w:type="dxa"/>
               <w:left w:w="80" w:type="dxa"/>
               <w:right w:w="80" w:type="dxa"/>
             </w:tcMar>
@@ -384,18 +394,19 @@
                 <w:rFonts w:ascii="Segoe UI" w:hAnsi="Segoe UI" w:cs="Kalpurush"/>
                 <w:b w:val="0"/>
                 <w:i w:val="0"/>
-                <w:color w:val="1E293B"/>
+                <w:color w:val="94A3B8"/>
                 <w:sz w:val="16"/>
               </w:rPr>
+              <w:t>...............................................................</w:t>
             </w:r>
           </w:p>
         </w:tc>
         <w:tc>
           <w:tcPr>
-            <w:tcW w:type="dxa" w:w="2592"/>
+            <w:tcW w:type="dxa" w:w="2520"/>
             <w:tcMar>
-              <w:top w:w="50" w:type="dxa"/>
-              <w:bottom w:w="50" w:type="dxa"/>
+              <w:top w:w="65" w:type="dxa"/>
+              <w:bottom w:w="65" w:type="dxa"/>
               <w:left w:w="80" w:type="dxa"/>
               <w:right w:w="80" w:type="dxa"/>
             </w:tcMar>
@@ -425,10 +436,10 @@
         </w:tc>
         <w:tc>
           <w:tcPr>
-            <w:tcW w:type="dxa" w:w="2722"/>
+            <w:tcW w:type="dxa" w:w="2794"/>
             <w:tcMar>
-              <w:top w:w="50" w:type="dxa"/>
-              <w:bottom w:w="50" w:type="dxa"/>
+              <w:top w:w="65" w:type="dxa"/>
+              <w:bottom w:w="65" w:type="dxa"/>
               <w:left w:w="80" w:type="dxa"/>
               <w:right w:w="80" w:type="dxa"/>
             </w:tcMar>
@@ -446,7 +457,7 @@
             <w:r>
               <w:rPr>
                 <w:rFonts w:ascii="Segoe UI" w:hAnsi="Segoe UI" w:cs="Kalpurush"/>
-                <w:b w:val="0"/>
+                <w:b/>
                 <w:i w:val="0"/>
                 <w:color w:val="1E293B"/>
                 <w:sz w:val="16"/>
@@ -459,10 +470,10 @@
       <w:tr>
         <w:tc>
           <w:tcPr>
-            <w:tcW w:type="dxa" w:w="2592"/>
+            <w:tcW w:type="dxa" w:w="2520"/>
             <w:tcMar>
-              <w:top w:w="50" w:type="dxa"/>
-              <w:bottom w:w="50" w:type="dxa"/>
+              <w:top w:w="65" w:type="dxa"/>
+              <w:bottom w:w="65" w:type="dxa"/>
               <w:left w:w="80" w:type="dxa"/>
               <w:right w:w="80" w:type="dxa"/>
             </w:tcMar>
@@ -492,10 +503,10 @@
         </w:tc>
         <w:tc>
           <w:tcPr>
-            <w:tcW w:type="dxa" w:w="2707"/>
+            <w:tcW w:type="dxa" w:w="2779"/>
             <w:tcMar>
-              <w:top w:w="50" w:type="dxa"/>
-              <w:bottom w:w="50" w:type="dxa"/>
+              <w:top w:w="65" w:type="dxa"/>
+              <w:bottom w:w="65" w:type="dxa"/>
               <w:left w:w="80" w:type="dxa"/>
               <w:right w:w="80" w:type="dxa"/>
             </w:tcMar>
@@ -515,18 +526,19 @@
                 <w:rFonts w:ascii="Segoe UI" w:hAnsi="Segoe UI" w:cs="Kalpurush"/>
                 <w:b w:val="0"/>
                 <w:i w:val="0"/>
-                <w:color w:val="1E293B"/>
+                <w:color w:val="94A3B8"/>
                 <w:sz w:val="16"/>
               </w:rPr>
+              <w:t>...............................................................</w:t>
             </w:r>
           </w:p>
         </w:tc>
         <w:tc>
           <w:tcPr>
-            <w:tcW w:type="dxa" w:w="2592"/>
+            <w:tcW w:type="dxa" w:w="2520"/>
             <w:tcMar>
-              <w:top w:w="50" w:type="dxa"/>
-              <w:bottom w:w="50" w:type="dxa"/>
+              <w:top w:w="65" w:type="dxa"/>
+              <w:bottom w:w="65" w:type="dxa"/>
               <w:left w:w="80" w:type="dxa"/>
               <w:right w:w="80" w:type="dxa"/>
             </w:tcMar>
@@ -556,10 +568,10 @@
         </w:tc>
         <w:tc>
           <w:tcPr>
-            <w:tcW w:type="dxa" w:w="2722"/>
+            <w:tcW w:type="dxa" w:w="2794"/>
             <w:tcMar>
-              <w:top w:w="50" w:type="dxa"/>
-              <w:bottom w:w="50" w:type="dxa"/>
+              <w:top w:w="65" w:type="dxa"/>
+              <w:bottom w:w="65" w:type="dxa"/>
               <w:left w:w="80" w:type="dxa"/>
               <w:right w:w="80" w:type="dxa"/>
             </w:tcMar>
@@ -579,10 +591,10 @@
                 <w:rFonts w:ascii="Segoe UI" w:hAnsi="Segoe UI" w:cs="Kalpurush"/>
                 <w:b w:val="0"/>
                 <w:i w:val="0"/>
-                <w:color w:val="1E293B"/>
+                <w:color w:val="94A3B8"/>
                 <w:sz w:val="16"/>
               </w:rPr>
-              <w:t xml:space="preserve">$ </w:t>
+              <w:t>$ .........................................................</w:t>
             </w:r>
           </w:p>
         </w:tc>
@@ -590,10 +602,10 @@
       <w:tr>
         <w:tc>
           <w:tcPr>
-            <w:tcW w:type="dxa" w:w="2592"/>
+            <w:tcW w:type="dxa" w:w="2520"/>
             <w:tcMar>
-              <w:top w:w="50" w:type="dxa"/>
-              <w:bottom w:w="50" w:type="dxa"/>
+              <w:top w:w="65" w:type="dxa"/>
+              <w:bottom w:w="65" w:type="dxa"/>
               <w:left w:w="80" w:type="dxa"/>
               <w:right w:w="80" w:type="dxa"/>
             </w:tcMar>
@@ -623,10 +635,10 @@
         </w:tc>
         <w:tc>
           <w:tcPr>
-            <w:tcW w:type="dxa" w:w="2707"/>
+            <w:tcW w:type="dxa" w:w="2779"/>
             <w:tcMar>
-              <w:top w:w="50" w:type="dxa"/>
-              <w:bottom w:w="50" w:type="dxa"/>
+              <w:top w:w="65" w:type="dxa"/>
+              <w:bottom w:w="65" w:type="dxa"/>
               <w:left w:w="80" w:type="dxa"/>
               <w:right w:w="80" w:type="dxa"/>
             </w:tcMar>
@@ -644,7 +656,7 @@
             <w:r>
               <w:rPr>
                 <w:rFonts w:ascii="Segoe UI" w:hAnsi="Segoe UI" w:cs="Kalpurush"/>
-                <w:b w:val="0"/>
+                <w:b/>
                 <w:i w:val="0"/>
                 <w:color w:val="1E293B"/>
                 <w:sz w:val="16"/>
@@ -655,10 +667,10 @@
         </w:tc>
         <w:tc>
           <w:tcPr>
-            <w:tcW w:type="dxa" w:w="2592"/>
+            <w:tcW w:type="dxa" w:w="2520"/>
             <w:tcMar>
-              <w:top w:w="50" w:type="dxa"/>
-              <w:bottom w:w="50" w:type="dxa"/>
+              <w:top w:w="65" w:type="dxa"/>
+              <w:bottom w:w="65" w:type="dxa"/>
               <w:left w:w="80" w:type="dxa"/>
               <w:right w:w="80" w:type="dxa"/>
             </w:tcMar>
@@ -688,10 +700,10 @@
         </w:tc>
         <w:tc>
           <w:tcPr>
-            <w:tcW w:type="dxa" w:w="2722"/>
+            <w:tcW w:type="dxa" w:w="2794"/>
             <w:tcMar>
-              <w:top w:w="50" w:type="dxa"/>
-              <w:bottom w:w="50" w:type="dxa"/>
+              <w:top w:w="65" w:type="dxa"/>
+              <w:bottom w:w="65" w:type="dxa"/>
               <w:left w:w="80" w:type="dxa"/>
               <w:right w:w="80" w:type="dxa"/>
             </w:tcMar>
@@ -709,7 +721,7 @@
             <w:r>
               <w:rPr>
                 <w:rFonts w:ascii="Segoe UI" w:hAnsi="Segoe UI" w:cs="Kalpurush"/>
-                <w:b w:val="0"/>
+                <w:b/>
                 <w:i w:val="0"/>
                 <w:color w:val="1E293B"/>
                 <w:sz w:val="16"/>
@@ -722,10 +734,10 @@
       <w:tr>
         <w:tc>
           <w:tcPr>
-            <w:tcW w:type="dxa" w:w="2592"/>
+            <w:tcW w:type="dxa" w:w="2520"/>
             <w:tcMar>
-              <w:top w:w="50" w:type="dxa"/>
-              <w:bottom w:w="50" w:type="dxa"/>
+              <w:top w:w="65" w:type="dxa"/>
+              <w:bottom w:w="65" w:type="dxa"/>
               <w:left w:w="80" w:type="dxa"/>
               <w:right w:w="80" w:type="dxa"/>
             </w:tcMar>
@@ -755,10 +767,10 @@
         </w:tc>
         <w:tc>
           <w:tcPr>
-            <w:tcW w:type="dxa" w:w="2707"/>
+            <w:tcW w:type="dxa" w:w="2779"/>
             <w:tcMar>
-              <w:top w:w="50" w:type="dxa"/>
-              <w:bottom w:w="50" w:type="dxa"/>
+              <w:top w:w="65" w:type="dxa"/>
+              <w:bottom w:w="65" w:type="dxa"/>
               <w:left w:w="80" w:type="dxa"/>
               <w:right w:w="80" w:type="dxa"/>
             </w:tcMar>
@@ -778,18 +790,19 @@
                 <w:rFonts w:ascii="Segoe UI" w:hAnsi="Segoe UI" w:cs="Kalpurush"/>
                 <w:b w:val="0"/>
                 <w:i w:val="0"/>
-                <w:color w:val="1E293B"/>
+                <w:color w:val="94A3B8"/>
                 <w:sz w:val="16"/>
               </w:rPr>
+              <w:t>...............................................................</w:t>
             </w:r>
           </w:p>
         </w:tc>
         <w:tc>
           <w:tcPr>
-            <w:tcW w:type="dxa" w:w="2592"/>
+            <w:tcW w:type="dxa" w:w="2520"/>
             <w:tcMar>
-              <w:top w:w="50" w:type="dxa"/>
-              <w:bottom w:w="50" w:type="dxa"/>
+              <w:top w:w="65" w:type="dxa"/>
+              <w:bottom w:w="65" w:type="dxa"/>
               <w:left w:w="80" w:type="dxa"/>
               <w:right w:w="80" w:type="dxa"/>
             </w:tcMar>
@@ -819,10 +832,10 @@
         </w:tc>
         <w:tc>
           <w:tcPr>
-            <w:tcW w:type="dxa" w:w="2722"/>
+            <w:tcW w:type="dxa" w:w="2794"/>
             <w:tcMar>
-              <w:top w:w="50" w:type="dxa"/>
-              <w:bottom w:w="50" w:type="dxa"/>
+              <w:top w:w="65" w:type="dxa"/>
+              <w:bottom w:w="65" w:type="dxa"/>
               <w:left w:w="80" w:type="dxa"/>
               <w:right w:w="80" w:type="dxa"/>
             </w:tcMar>
@@ -840,7 +853,7 @@
             <w:r>
               <w:rPr>
                 <w:rFonts w:ascii="Segoe UI" w:hAnsi="Segoe UI" w:cs="Kalpurush"/>
-                <w:b w:val="0"/>
+                <w:b/>
                 <w:i w:val="0"/>
                 <w:color w:val="1E293B"/>
                 <w:sz w:val="16"/>
@@ -874,8 +887,8 @@
           <w:tcPr>
             <w:tcW w:type="dxa" w:w="605"/>
             <w:tcMar>
-              <w:top w:w="70" w:type="dxa"/>
-              <w:bottom w:w="70" w:type="dxa"/>
+              <w:top w:w="80" w:type="dxa"/>
+              <w:bottom w:w="80" w:type="dxa"/>
               <w:left w:w="80" w:type="dxa"/>
               <w:right w:w="80" w:type="dxa"/>
             </w:tcMar>
@@ -908,8 +921,8 @@
           <w:tcPr>
             <w:tcW w:type="dxa" w:w="6552"/>
             <w:tcMar>
-              <w:top w:w="70" w:type="dxa"/>
-              <w:bottom w:w="70" w:type="dxa"/>
+              <w:top w:w="80" w:type="dxa"/>
+              <w:bottom w:w="80" w:type="dxa"/>
               <w:left w:w="80" w:type="dxa"/>
               <w:right w:w="80" w:type="dxa"/>
             </w:tcMar>
@@ -942,8 +955,8 @@
           <w:tcPr>
             <w:tcW w:type="dxa" w:w="1800"/>
             <w:tcMar>
-              <w:top w:w="70" w:type="dxa"/>
-              <w:bottom w:w="70" w:type="dxa"/>
+              <w:top w:w="80" w:type="dxa"/>
+              <w:bottom w:w="80" w:type="dxa"/>
               <w:left w:w="80" w:type="dxa"/>
               <w:right w:w="80" w:type="dxa"/>
             </w:tcMar>
@@ -976,8 +989,8 @@
           <w:tcPr>
             <w:tcW w:type="dxa" w:w="1656"/>
             <w:tcMar>
-              <w:top w:w="70" w:type="dxa"/>
-              <w:bottom w:w="70" w:type="dxa"/>
+              <w:top w:w="80" w:type="dxa"/>
+              <w:bottom w:w="80" w:type="dxa"/>
               <w:left w:w="80" w:type="dxa"/>
               <w:right w:w="80" w:type="dxa"/>
             </w:tcMar>
@@ -1012,8 +1025,8 @@
           <w:tcPr>
             <w:tcW w:type="dxa" w:w="605"/>
             <w:tcMar>
-              <w:top w:w="35" w:type="dxa"/>
-              <w:bottom w:w="35" w:type="dxa"/>
+              <w:top w:w="55" w:type="dxa"/>
+              <w:bottom w:w="55" w:type="dxa"/>
               <w:left w:w="50" w:type="dxa"/>
               <w:right w:w="50" w:type="dxa"/>
             </w:tcMar>
@@ -1046,8 +1059,8 @@
           <w:tcPr>
             <w:tcW w:type="dxa" w:w="6552"/>
             <w:tcMar>
-              <w:top w:w="35" w:type="dxa"/>
-              <w:bottom w:w="35" w:type="dxa"/>
+              <w:top w:w="55" w:type="dxa"/>
+              <w:bottom w:w="55" w:type="dxa"/>
               <w:left w:w="80" w:type="dxa"/>
               <w:right w:w="80" w:type="dxa"/>
             </w:tcMar>
@@ -1079,8 +1092,8 @@
           <w:tcPr>
             <w:tcW w:type="dxa" w:w="1800"/>
             <w:tcMar>
-              <w:top w:w="35" w:type="dxa"/>
-              <w:bottom w:w="35" w:type="dxa"/>
+              <w:top w:w="55" w:type="dxa"/>
+              <w:bottom w:w="55" w:type="dxa"/>
               <w:left w:w="80" w:type="dxa"/>
               <w:right w:w="80" w:type="dxa"/>
             </w:tcMar>
@@ -1102,9 +1115,10 @@
                 <w:rFonts w:ascii="Segoe UI" w:hAnsi="Segoe UI" w:cs="Kalpurush"/>
                 <w:b w:val="0"/>
                 <w:i w:val="0"/>
-                <w:color w:val="1E293B"/>
+                <w:color w:val="94A3B8"/>
                 <w:sz w:val="15"/>
               </w:rPr>
+              <w:t>..............................</w:t>
             </w:r>
           </w:p>
         </w:tc>
@@ -1112,8 +1126,8 @@
           <w:tcPr>
             <w:tcW w:type="dxa" w:w="1656"/>
             <w:tcMar>
-              <w:top w:w="35" w:type="dxa"/>
-              <w:bottom w:w="35" w:type="dxa"/>
+              <w:top w:w="55" w:type="dxa"/>
+              <w:bottom w:w="55" w:type="dxa"/>
               <w:left w:w="50" w:type="dxa"/>
               <w:right w:w="50" w:type="dxa"/>
             </w:tcMar>
@@ -1135,9 +1149,10 @@
                 <w:rFonts w:ascii="Segoe UI" w:hAnsi="Segoe UI" w:cs="Kalpurush"/>
                 <w:b w:val="0"/>
                 <w:i w:val="0"/>
-                <w:color w:val="1E293B"/>
+                <w:color w:val="94A3B8"/>
                 <w:sz w:val="15"/>
               </w:rPr>
+              <w:t>......................</w:t>
             </w:r>
           </w:p>
         </w:tc>
@@ -1147,8 +1162,8 @@
           <w:tcPr>
             <w:tcW w:type="dxa" w:w="605"/>
             <w:tcMar>
-              <w:top w:w="35" w:type="dxa"/>
-              <w:bottom w:w="35" w:type="dxa"/>
+              <w:top w:w="55" w:type="dxa"/>
+              <w:bottom w:w="55" w:type="dxa"/>
               <w:left w:w="50" w:type="dxa"/>
               <w:right w:w="50" w:type="dxa"/>
             </w:tcMar>
@@ -1181,8 +1196,8 @@
           <w:tcPr>
             <w:tcW w:type="dxa" w:w="6552"/>
             <w:tcMar>
-              <w:top w:w="35" w:type="dxa"/>
-              <w:bottom w:w="35" w:type="dxa"/>
+              <w:top w:w="55" w:type="dxa"/>
+              <w:bottom w:w="55" w:type="dxa"/>
               <w:left w:w="80" w:type="dxa"/>
               <w:right w:w="80" w:type="dxa"/>
             </w:tcMar>
@@ -1214,8 +1229,8 @@
           <w:tcPr>
             <w:tcW w:type="dxa" w:w="1800"/>
             <w:tcMar>
-              <w:top w:w="35" w:type="dxa"/>
-              <w:bottom w:w="35" w:type="dxa"/>
+              <w:top w:w="55" w:type="dxa"/>
+              <w:bottom w:w="55" w:type="dxa"/>
               <w:left w:w="80" w:type="dxa"/>
               <w:right w:w="80" w:type="dxa"/>
             </w:tcMar>
@@ -1237,9 +1252,10 @@
                 <w:rFonts w:ascii="Segoe UI" w:hAnsi="Segoe UI" w:cs="Kalpurush"/>
                 <w:b w:val="0"/>
                 <w:i w:val="0"/>
-                <w:color w:val="1E293B"/>
+                <w:color w:val="94A3B8"/>
                 <w:sz w:val="15"/>
               </w:rPr>
+              <w:t>..............................</w:t>
             </w:r>
           </w:p>
         </w:tc>
@@ -1247,8 +1263,8 @@
           <w:tcPr>
             <w:tcW w:type="dxa" w:w="1656"/>
             <w:tcMar>
-              <w:top w:w="35" w:type="dxa"/>
-              <w:bottom w:w="35" w:type="dxa"/>
+              <w:top w:w="55" w:type="dxa"/>
+              <w:bottom w:w="55" w:type="dxa"/>
               <w:left w:w="50" w:type="dxa"/>
               <w:right w:w="50" w:type="dxa"/>
             </w:tcMar>
@@ -1270,9 +1286,10 @@
                 <w:rFonts w:ascii="Segoe UI" w:hAnsi="Segoe UI" w:cs="Kalpurush"/>
                 <w:b w:val="0"/>
                 <w:i w:val="0"/>
-                <w:color w:val="1E293B"/>
+                <w:color w:val="94A3B8"/>
                 <w:sz w:val="15"/>
               </w:rPr>
+              <w:t>......................</w:t>
             </w:r>
           </w:p>
         </w:tc>
@@ -1282,8 +1299,8 @@
           <w:tcPr>
             <w:tcW w:type="dxa" w:w="605"/>
             <w:tcMar>
-              <w:top w:w="35" w:type="dxa"/>
-              <w:bottom w:w="35" w:type="dxa"/>
+              <w:top w:w="55" w:type="dxa"/>
+              <w:bottom w:w="55" w:type="dxa"/>
               <w:left w:w="50" w:type="dxa"/>
               <w:right w:w="50" w:type="dxa"/>
             </w:tcMar>
@@ -1316,8 +1333,8 @@
           <w:tcPr>
             <w:tcW w:type="dxa" w:w="6552"/>
             <w:tcMar>
-              <w:top w:w="35" w:type="dxa"/>
-              <w:bottom w:w="35" w:type="dxa"/>
+              <w:top w:w="55" w:type="dxa"/>
+              <w:bottom w:w="55" w:type="dxa"/>
               <w:left w:w="80" w:type="dxa"/>
               <w:right w:w="80" w:type="dxa"/>
             </w:tcMar>
@@ -1349,8 +1366,8 @@
           <w:tcPr>
             <w:tcW w:type="dxa" w:w="1800"/>
             <w:tcMar>
-              <w:top w:w="35" w:type="dxa"/>
-              <w:bottom w:w="35" w:type="dxa"/>
+              <w:top w:w="55" w:type="dxa"/>
+              <w:bottom w:w="55" w:type="dxa"/>
               <w:left w:w="80" w:type="dxa"/>
               <w:right w:w="80" w:type="dxa"/>
             </w:tcMar>
@@ -1372,9 +1389,10 @@
                 <w:rFonts w:ascii="Segoe UI" w:hAnsi="Segoe UI" w:cs="Kalpurush"/>
                 <w:b w:val="0"/>
                 <w:i w:val="0"/>
-                <w:color w:val="1E293B"/>
+                <w:color w:val="94A3B8"/>
                 <w:sz w:val="15"/>
               </w:rPr>
+              <w:t>..............................</w:t>
             </w:r>
           </w:p>
         </w:tc>
@@ -1382,8 +1400,8 @@
           <w:tcPr>
             <w:tcW w:type="dxa" w:w="1656"/>
             <w:tcMar>
-              <w:top w:w="35" w:type="dxa"/>
-              <w:bottom w:w="35" w:type="dxa"/>
+              <w:top w:w="55" w:type="dxa"/>
+              <w:bottom w:w="55" w:type="dxa"/>
               <w:left w:w="50" w:type="dxa"/>
               <w:right w:w="50" w:type="dxa"/>
             </w:tcMar>
@@ -1405,9 +1423,10 @@
                 <w:rFonts w:ascii="Segoe UI" w:hAnsi="Segoe UI" w:cs="Kalpurush"/>
                 <w:b w:val="0"/>
                 <w:i w:val="0"/>
-                <w:color w:val="1E293B"/>
+                <w:color w:val="94A3B8"/>
                 <w:sz w:val="15"/>
               </w:rPr>
+              <w:t>......................</w:t>
             </w:r>
           </w:p>
         </w:tc>
@@ -1417,8 +1436,8 @@
           <w:tcPr>
             <w:tcW w:type="dxa" w:w="605"/>
             <w:tcMar>
-              <w:top w:w="35" w:type="dxa"/>
-              <w:bottom w:w="35" w:type="dxa"/>
+              <w:top w:w="55" w:type="dxa"/>
+              <w:bottom w:w="55" w:type="dxa"/>
               <w:left w:w="50" w:type="dxa"/>
               <w:right w:w="50" w:type="dxa"/>
             </w:tcMar>
@@ -1451,8 +1470,8 @@
           <w:tcPr>
             <w:tcW w:type="dxa" w:w="6552"/>
             <w:tcMar>
-              <w:top w:w="35" w:type="dxa"/>
-              <w:bottom w:w="35" w:type="dxa"/>
+              <w:top w:w="55" w:type="dxa"/>
+              <w:bottom w:w="55" w:type="dxa"/>
               <w:left w:w="80" w:type="dxa"/>
               <w:right w:w="80" w:type="dxa"/>
             </w:tcMar>
@@ -1484,8 +1503,8 @@
           <w:tcPr>
             <w:tcW w:type="dxa" w:w="1800"/>
             <w:tcMar>
-              <w:top w:w="35" w:type="dxa"/>
-              <w:bottom w:w="35" w:type="dxa"/>
+              <w:top w:w="55" w:type="dxa"/>
+              <w:bottom w:w="55" w:type="dxa"/>
               <w:left w:w="80" w:type="dxa"/>
               <w:right w:w="80" w:type="dxa"/>
             </w:tcMar>
@@ -1507,9 +1526,10 @@
                 <w:rFonts w:ascii="Segoe UI" w:hAnsi="Segoe UI" w:cs="Kalpurush"/>
                 <w:b w:val="0"/>
                 <w:i w:val="0"/>
-                <w:color w:val="1E293B"/>
+                <w:color w:val="94A3B8"/>
                 <w:sz w:val="15"/>
               </w:rPr>
+              <w:t>..............................</w:t>
             </w:r>
           </w:p>
         </w:tc>
@@ -1517,8 +1537,8 @@
           <w:tcPr>
             <w:tcW w:type="dxa" w:w="1656"/>
             <w:tcMar>
-              <w:top w:w="35" w:type="dxa"/>
-              <w:bottom w:w="35" w:type="dxa"/>
+              <w:top w:w="55" w:type="dxa"/>
+              <w:bottom w:w="55" w:type="dxa"/>
               <w:left w:w="50" w:type="dxa"/>
               <w:right w:w="50" w:type="dxa"/>
             </w:tcMar>
@@ -1540,9 +1560,10 @@
                 <w:rFonts w:ascii="Segoe UI" w:hAnsi="Segoe UI" w:cs="Kalpurush"/>
                 <w:b w:val="0"/>
                 <w:i w:val="0"/>
-                <w:color w:val="1E293B"/>
+                <w:color w:val="94A3B8"/>
                 <w:sz w:val="15"/>
               </w:rPr>
+              <w:t>......................</w:t>
             </w:r>
           </w:p>
         </w:tc>
@@ -1552,8 +1573,8 @@
           <w:tcPr>
             <w:tcW w:type="dxa" w:w="605"/>
             <w:tcMar>
-              <w:top w:w="35" w:type="dxa"/>
-              <w:bottom w:w="35" w:type="dxa"/>
+              <w:top w:w="55" w:type="dxa"/>
+              <w:bottom w:w="55" w:type="dxa"/>
               <w:left w:w="50" w:type="dxa"/>
               <w:right w:w="50" w:type="dxa"/>
             </w:tcMar>
@@ -1586,8 +1607,8 @@
           <w:tcPr>
             <w:tcW w:type="dxa" w:w="6552"/>
             <w:tcMar>
-              <w:top w:w="35" w:type="dxa"/>
-              <w:bottom w:w="35" w:type="dxa"/>
+              <w:top w:w="55" w:type="dxa"/>
+              <w:bottom w:w="55" w:type="dxa"/>
               <w:left w:w="80" w:type="dxa"/>
               <w:right w:w="80" w:type="dxa"/>
             </w:tcMar>
@@ -1619,8 +1640,8 @@
           <w:tcPr>
             <w:tcW w:type="dxa" w:w="1800"/>
             <w:tcMar>
-              <w:top w:w="35" w:type="dxa"/>
-              <w:bottom w:w="35" w:type="dxa"/>
+              <w:top w:w="55" w:type="dxa"/>
+              <w:bottom w:w="55" w:type="dxa"/>
               <w:left w:w="80" w:type="dxa"/>
               <w:right w:w="80" w:type="dxa"/>
             </w:tcMar>
@@ -1642,9 +1663,10 @@
                 <w:rFonts w:ascii="Segoe UI" w:hAnsi="Segoe UI" w:cs="Kalpurush"/>
                 <w:b w:val="0"/>
                 <w:i w:val="0"/>
-                <w:color w:val="1E293B"/>
+                <w:color w:val="94A3B8"/>
                 <w:sz w:val="15"/>
               </w:rPr>
+              <w:t>..............................</w:t>
             </w:r>
           </w:p>
         </w:tc>
@@ -1652,8 +1674,8 @@
           <w:tcPr>
             <w:tcW w:type="dxa" w:w="1656"/>
             <w:tcMar>
-              <w:top w:w="35" w:type="dxa"/>
-              <w:bottom w:w="35" w:type="dxa"/>
+              <w:top w:w="55" w:type="dxa"/>
+              <w:bottom w:w="55" w:type="dxa"/>
               <w:left w:w="50" w:type="dxa"/>
               <w:right w:w="50" w:type="dxa"/>
             </w:tcMar>
@@ -1675,9 +1697,10 @@
                 <w:rFonts w:ascii="Segoe UI" w:hAnsi="Segoe UI" w:cs="Kalpurush"/>
                 <w:b w:val="0"/>
                 <w:i w:val="0"/>
-                <w:color w:val="1E293B"/>
+                <w:color w:val="94A3B8"/>
                 <w:sz w:val="15"/>
               </w:rPr>
+              <w:t>......................</w:t>
             </w:r>
           </w:p>
         </w:tc>
@@ -1687,8 +1710,8 @@
           <w:tcPr>
             <w:tcW w:type="dxa" w:w="605"/>
             <w:tcMar>
-              <w:top w:w="35" w:type="dxa"/>
-              <w:bottom w:w="35" w:type="dxa"/>
+              <w:top w:w="55" w:type="dxa"/>
+              <w:bottom w:w="55" w:type="dxa"/>
               <w:left w:w="50" w:type="dxa"/>
               <w:right w:w="50" w:type="dxa"/>
             </w:tcMar>
@@ -1721,8 +1744,8 @@
           <w:tcPr>
             <w:tcW w:type="dxa" w:w="6552"/>
             <w:tcMar>
-              <w:top w:w="35" w:type="dxa"/>
-              <w:bottom w:w="35" w:type="dxa"/>
+              <w:top w:w="55" w:type="dxa"/>
+              <w:bottom w:w="55" w:type="dxa"/>
               <w:left w:w="80" w:type="dxa"/>
               <w:right w:w="80" w:type="dxa"/>
             </w:tcMar>
@@ -1754,8 +1777,8 @@
           <w:tcPr>
             <w:tcW w:type="dxa" w:w="1800"/>
             <w:tcMar>
-              <w:top w:w="35" w:type="dxa"/>
-              <w:bottom w:w="35" w:type="dxa"/>
+              <w:top w:w="55" w:type="dxa"/>
+              <w:bottom w:w="55" w:type="dxa"/>
               <w:left w:w="80" w:type="dxa"/>
               <w:right w:w="80" w:type="dxa"/>
             </w:tcMar>
@@ -1777,9 +1800,10 @@
                 <w:rFonts w:ascii="Segoe UI" w:hAnsi="Segoe UI" w:cs="Kalpurush"/>
                 <w:b w:val="0"/>
                 <w:i w:val="0"/>
-                <w:color w:val="1E293B"/>
+                <w:color w:val="94A3B8"/>
                 <w:sz w:val="15"/>
               </w:rPr>
+              <w:t>..............................</w:t>
             </w:r>
           </w:p>
         </w:tc>
@@ -1787,8 +1811,8 @@
           <w:tcPr>
             <w:tcW w:type="dxa" w:w="1656"/>
             <w:tcMar>
-              <w:top w:w="35" w:type="dxa"/>
-              <w:bottom w:w="35" w:type="dxa"/>
+              <w:top w:w="55" w:type="dxa"/>
+              <w:bottom w:w="55" w:type="dxa"/>
               <w:left w:w="50" w:type="dxa"/>
               <w:right w:w="50" w:type="dxa"/>
             </w:tcMar>
@@ -1810,9 +1834,10 @@
                 <w:rFonts w:ascii="Segoe UI" w:hAnsi="Segoe UI" w:cs="Kalpurush"/>
                 <w:b w:val="0"/>
                 <w:i w:val="0"/>
-                <w:color w:val="1E293B"/>
+                <w:color w:val="94A3B8"/>
                 <w:sz w:val="15"/>
               </w:rPr>
+              <w:t>......................</w:t>
             </w:r>
           </w:p>
         </w:tc>
@@ -1822,8 +1847,8 @@
           <w:tcPr>
             <w:tcW w:type="dxa" w:w="605"/>
             <w:tcMar>
-              <w:top w:w="35" w:type="dxa"/>
-              <w:bottom w:w="35" w:type="dxa"/>
+              <w:top w:w="55" w:type="dxa"/>
+              <w:bottom w:w="55" w:type="dxa"/>
               <w:left w:w="50" w:type="dxa"/>
               <w:right w:w="50" w:type="dxa"/>
             </w:tcMar>
@@ -1856,8 +1881,8 @@
           <w:tcPr>
             <w:tcW w:type="dxa" w:w="6552"/>
             <w:tcMar>
-              <w:top w:w="35" w:type="dxa"/>
-              <w:bottom w:w="35" w:type="dxa"/>
+              <w:top w:w="55" w:type="dxa"/>
+              <w:bottom w:w="55" w:type="dxa"/>
               <w:left w:w="80" w:type="dxa"/>
               <w:right w:w="80" w:type="dxa"/>
             </w:tcMar>
@@ -1889,8 +1914,8 @@
           <w:tcPr>
             <w:tcW w:type="dxa" w:w="1800"/>
             <w:tcMar>
-              <w:top w:w="35" w:type="dxa"/>
-              <w:bottom w:w="35" w:type="dxa"/>
+              <w:top w:w="55" w:type="dxa"/>
+              <w:bottom w:w="55" w:type="dxa"/>
               <w:left w:w="80" w:type="dxa"/>
               <w:right w:w="80" w:type="dxa"/>
             </w:tcMar>
@@ -1912,9 +1937,10 @@
                 <w:rFonts w:ascii="Segoe UI" w:hAnsi="Segoe UI" w:cs="Kalpurush"/>
                 <w:b w:val="0"/>
                 <w:i w:val="0"/>
-                <w:color w:val="1E293B"/>
+                <w:color w:val="94A3B8"/>
                 <w:sz w:val="15"/>
               </w:rPr>
+              <w:t>..............................</w:t>
             </w:r>
           </w:p>
         </w:tc>
@@ -1922,8 +1948,8 @@
           <w:tcPr>
             <w:tcW w:type="dxa" w:w="1656"/>
             <w:tcMar>
-              <w:top w:w="35" w:type="dxa"/>
-              <w:bottom w:w="35" w:type="dxa"/>
+              <w:top w:w="55" w:type="dxa"/>
+              <w:bottom w:w="55" w:type="dxa"/>
               <w:left w:w="50" w:type="dxa"/>
               <w:right w:w="50" w:type="dxa"/>
             </w:tcMar>
@@ -1945,9 +1971,10 @@
                 <w:rFonts w:ascii="Segoe UI" w:hAnsi="Segoe UI" w:cs="Kalpurush"/>
                 <w:b w:val="0"/>
                 <w:i w:val="0"/>
-                <w:color w:val="1E293B"/>
+                <w:color w:val="94A3B8"/>
                 <w:sz w:val="15"/>
               </w:rPr>
+              <w:t>......................</w:t>
             </w:r>
           </w:p>
         </w:tc>
@@ -1957,8 +1984,8 @@
           <w:tcPr>
             <w:tcW w:type="dxa" w:w="605"/>
             <w:tcMar>
-              <w:top w:w="35" w:type="dxa"/>
-              <w:bottom w:w="35" w:type="dxa"/>
+              <w:top w:w="55" w:type="dxa"/>
+              <w:bottom w:w="55" w:type="dxa"/>
               <w:left w:w="50" w:type="dxa"/>
               <w:right w:w="50" w:type="dxa"/>
             </w:tcMar>
@@ -1991,8 +2018,8 @@
           <w:tcPr>
             <w:tcW w:type="dxa" w:w="6552"/>
             <w:tcMar>
-              <w:top w:w="35" w:type="dxa"/>
-              <w:bottom w:w="35" w:type="dxa"/>
+              <w:top w:w="55" w:type="dxa"/>
+              <w:bottom w:w="55" w:type="dxa"/>
               <w:left w:w="80" w:type="dxa"/>
               <w:right w:w="80" w:type="dxa"/>
             </w:tcMar>
@@ -2024,8 +2051,8 @@
           <w:tcPr>
             <w:tcW w:type="dxa" w:w="1800"/>
             <w:tcMar>
-              <w:top w:w="35" w:type="dxa"/>
-              <w:bottom w:w="35" w:type="dxa"/>
+              <w:top w:w="55" w:type="dxa"/>
+              <w:bottom w:w="55" w:type="dxa"/>
               <w:left w:w="80" w:type="dxa"/>
               <w:right w:w="80" w:type="dxa"/>
             </w:tcMar>
@@ -2047,9 +2074,10 @@
                 <w:rFonts w:ascii="Segoe UI" w:hAnsi="Segoe UI" w:cs="Kalpurush"/>
                 <w:b w:val="0"/>
                 <w:i w:val="0"/>
-                <w:color w:val="1E293B"/>
+                <w:color w:val="94A3B8"/>
                 <w:sz w:val="15"/>
               </w:rPr>
+              <w:t>..............................</w:t>
             </w:r>
           </w:p>
         </w:tc>
@@ -2057,8 +2085,8 @@
           <w:tcPr>
             <w:tcW w:type="dxa" w:w="1656"/>
             <w:tcMar>
-              <w:top w:w="35" w:type="dxa"/>
-              <w:bottom w:w="35" w:type="dxa"/>
+              <w:top w:w="55" w:type="dxa"/>
+              <w:bottom w:w="55" w:type="dxa"/>
               <w:left w:w="50" w:type="dxa"/>
               <w:right w:w="50" w:type="dxa"/>
             </w:tcMar>
@@ -2080,9 +2108,10 @@
                 <w:rFonts w:ascii="Segoe UI" w:hAnsi="Segoe UI" w:cs="Kalpurush"/>
                 <w:b w:val="0"/>
                 <w:i w:val="0"/>
-                <w:color w:val="1E293B"/>
+                <w:color w:val="94A3B8"/>
                 <w:sz w:val="15"/>
               </w:rPr>
+              <w:t>......................</w:t>
             </w:r>
           </w:p>
         </w:tc>
@@ -2092,8 +2121,8 @@
           <w:tcPr>
             <w:tcW w:type="dxa" w:w="605"/>
             <w:tcMar>
-              <w:top w:w="35" w:type="dxa"/>
-              <w:bottom w:w="35" w:type="dxa"/>
+              <w:top w:w="55" w:type="dxa"/>
+              <w:bottom w:w="55" w:type="dxa"/>
               <w:left w:w="50" w:type="dxa"/>
               <w:right w:w="50" w:type="dxa"/>
             </w:tcMar>
@@ -2126,8 +2155,8 @@
           <w:tcPr>
             <w:tcW w:type="dxa" w:w="6552"/>
             <w:tcMar>
-              <w:top w:w="35" w:type="dxa"/>
-              <w:bottom w:w="35" w:type="dxa"/>
+              <w:top w:w="55" w:type="dxa"/>
+              <w:bottom w:w="55" w:type="dxa"/>
               <w:left w:w="80" w:type="dxa"/>
               <w:right w:w="80" w:type="dxa"/>
             </w:tcMar>
@@ -2159,8 +2188,8 @@
           <w:tcPr>
             <w:tcW w:type="dxa" w:w="1800"/>
             <w:tcMar>
-              <w:top w:w="35" w:type="dxa"/>
-              <w:bottom w:w="35" w:type="dxa"/>
+              <w:top w:w="55" w:type="dxa"/>
+              <w:bottom w:w="55" w:type="dxa"/>
               <w:left w:w="80" w:type="dxa"/>
               <w:right w:w="80" w:type="dxa"/>
             </w:tcMar>
@@ -2182,9 +2211,10 @@
                 <w:rFonts w:ascii="Segoe UI" w:hAnsi="Segoe UI" w:cs="Kalpurush"/>
                 <w:b w:val="0"/>
                 <w:i w:val="0"/>
-                <w:color w:val="1E293B"/>
+                <w:color w:val="94A3B8"/>
                 <w:sz w:val="15"/>
               </w:rPr>
+              <w:t>..............................</w:t>
             </w:r>
           </w:p>
         </w:tc>
@@ -2192,8 +2222,8 @@
           <w:tcPr>
             <w:tcW w:type="dxa" w:w="1656"/>
             <w:tcMar>
-              <w:top w:w="35" w:type="dxa"/>
-              <w:bottom w:w="35" w:type="dxa"/>
+              <w:top w:w="55" w:type="dxa"/>
+              <w:bottom w:w="55" w:type="dxa"/>
               <w:left w:w="50" w:type="dxa"/>
               <w:right w:w="50" w:type="dxa"/>
             </w:tcMar>
@@ -2215,9 +2245,10 @@
                 <w:rFonts w:ascii="Segoe UI" w:hAnsi="Segoe UI" w:cs="Kalpurush"/>
                 <w:b w:val="0"/>
                 <w:i w:val="0"/>
-                <w:color w:val="1E293B"/>
+                <w:color w:val="94A3B8"/>
                 <w:sz w:val="15"/>
               </w:rPr>
+              <w:t>......................</w:t>
             </w:r>
           </w:p>
         </w:tc>
@@ -2227,8 +2258,8 @@
           <w:tcPr>
             <w:tcW w:type="dxa" w:w="605"/>
             <w:tcMar>
-              <w:top w:w="35" w:type="dxa"/>
-              <w:bottom w:w="35" w:type="dxa"/>
+              <w:top w:w="55" w:type="dxa"/>
+              <w:bottom w:w="55" w:type="dxa"/>
               <w:left w:w="50" w:type="dxa"/>
               <w:right w:w="50" w:type="dxa"/>
             </w:tcMar>
@@ -2261,8 +2292,8 @@
           <w:tcPr>
             <w:tcW w:type="dxa" w:w="6552"/>
             <w:tcMar>
-              <w:top w:w="35" w:type="dxa"/>
-              <w:bottom w:w="35" w:type="dxa"/>
+              <w:top w:w="55" w:type="dxa"/>
+              <w:bottom w:w="55" w:type="dxa"/>
               <w:left w:w="80" w:type="dxa"/>
               <w:right w:w="80" w:type="dxa"/>
             </w:tcMar>
@@ -2294,8 +2325,8 @@
           <w:tcPr>
             <w:tcW w:type="dxa" w:w="1800"/>
             <w:tcMar>
-              <w:top w:w="35" w:type="dxa"/>
-              <w:bottom w:w="35" w:type="dxa"/>
+              <w:top w:w="55" w:type="dxa"/>
+              <w:bottom w:w="55" w:type="dxa"/>
               <w:left w:w="80" w:type="dxa"/>
               <w:right w:w="80" w:type="dxa"/>
             </w:tcMar>
@@ -2317,9 +2348,10 @@
                 <w:rFonts w:ascii="Segoe UI" w:hAnsi="Segoe UI" w:cs="Kalpurush"/>
                 <w:b w:val="0"/>
                 <w:i w:val="0"/>
-                <w:color w:val="1E293B"/>
+                <w:color w:val="94A3B8"/>
                 <w:sz w:val="15"/>
               </w:rPr>
+              <w:t>..............................</w:t>
             </w:r>
           </w:p>
         </w:tc>
@@ -2327,8 +2359,8 @@
           <w:tcPr>
             <w:tcW w:type="dxa" w:w="1656"/>
             <w:tcMar>
-              <w:top w:w="35" w:type="dxa"/>
-              <w:bottom w:w="35" w:type="dxa"/>
+              <w:top w:w="55" w:type="dxa"/>
+              <w:bottom w:w="55" w:type="dxa"/>
               <w:left w:w="50" w:type="dxa"/>
               <w:right w:w="50" w:type="dxa"/>
             </w:tcMar>
@@ -2350,9 +2382,10 @@
                 <w:rFonts w:ascii="Segoe UI" w:hAnsi="Segoe UI" w:cs="Kalpurush"/>
                 <w:b w:val="0"/>
                 <w:i w:val="0"/>
-                <w:color w:val="1E293B"/>
+                <w:color w:val="94A3B8"/>
                 <w:sz w:val="15"/>
               </w:rPr>
+              <w:t>......................</w:t>
             </w:r>
           </w:p>
         </w:tc>
@@ -2362,8 +2395,8 @@
           <w:tcPr>
             <w:tcW w:type="dxa" w:w="605"/>
             <w:tcMar>
-              <w:top w:w="35" w:type="dxa"/>
-              <w:bottom w:w="35" w:type="dxa"/>
+              <w:top w:w="55" w:type="dxa"/>
+              <w:bottom w:w="55" w:type="dxa"/>
               <w:left w:w="50" w:type="dxa"/>
               <w:right w:w="50" w:type="dxa"/>
             </w:tcMar>
@@ -2396,8 +2429,8 @@
           <w:tcPr>
             <w:tcW w:type="dxa" w:w="6552"/>
             <w:tcMar>
-              <w:top w:w="35" w:type="dxa"/>
-              <w:bottom w:w="35" w:type="dxa"/>
+              <w:top w:w="55" w:type="dxa"/>
+              <w:bottom w:w="55" w:type="dxa"/>
               <w:left w:w="80" w:type="dxa"/>
               <w:right w:w="80" w:type="dxa"/>
             </w:tcMar>
@@ -2429,8 +2462,8 @@
           <w:tcPr>
             <w:tcW w:type="dxa" w:w="1800"/>
             <w:tcMar>
-              <w:top w:w="35" w:type="dxa"/>
-              <w:bottom w:w="35" w:type="dxa"/>
+              <w:top w:w="55" w:type="dxa"/>
+              <w:bottom w:w="55" w:type="dxa"/>
               <w:left w:w="80" w:type="dxa"/>
               <w:right w:w="80" w:type="dxa"/>
             </w:tcMar>
@@ -2452,9 +2485,10 @@
                 <w:rFonts w:ascii="Segoe UI" w:hAnsi="Segoe UI" w:cs="Kalpurush"/>
                 <w:b w:val="0"/>
                 <w:i w:val="0"/>
-                <w:color w:val="1E293B"/>
+                <w:color w:val="94A3B8"/>
                 <w:sz w:val="15"/>
               </w:rPr>
+              <w:t>..............................</w:t>
             </w:r>
           </w:p>
         </w:tc>
@@ -2462,8 +2496,8 @@
           <w:tcPr>
             <w:tcW w:type="dxa" w:w="1656"/>
             <w:tcMar>
-              <w:top w:w="35" w:type="dxa"/>
-              <w:bottom w:w="35" w:type="dxa"/>
+              <w:top w:w="55" w:type="dxa"/>
+              <w:bottom w:w="55" w:type="dxa"/>
               <w:left w:w="50" w:type="dxa"/>
               <w:right w:w="50" w:type="dxa"/>
             </w:tcMar>
@@ -2485,9 +2519,10 @@
                 <w:rFonts w:ascii="Segoe UI" w:hAnsi="Segoe UI" w:cs="Kalpurush"/>
                 <w:b w:val="0"/>
                 <w:i w:val="0"/>
-                <w:color w:val="1E293B"/>
+                <w:color w:val="94A3B8"/>
                 <w:sz w:val="15"/>
               </w:rPr>
+              <w:t>......................</w:t>
             </w:r>
           </w:p>
         </w:tc>
@@ -2497,8 +2532,8 @@
           <w:tcPr>
             <w:tcW w:type="dxa" w:w="605"/>
             <w:tcMar>
-              <w:top w:w="35" w:type="dxa"/>
-              <w:bottom w:w="35" w:type="dxa"/>
+              <w:top w:w="55" w:type="dxa"/>
+              <w:bottom w:w="55" w:type="dxa"/>
               <w:left w:w="50" w:type="dxa"/>
               <w:right w:w="50" w:type="dxa"/>
             </w:tcMar>
@@ -2531,8 +2566,8 @@
           <w:tcPr>
             <w:tcW w:type="dxa" w:w="6552"/>
             <w:tcMar>
-              <w:top w:w="35" w:type="dxa"/>
-              <w:bottom w:w="35" w:type="dxa"/>
+              <w:top w:w="55" w:type="dxa"/>
+              <w:bottom w:w="55" w:type="dxa"/>
               <w:left w:w="80" w:type="dxa"/>
               <w:right w:w="80" w:type="dxa"/>
             </w:tcMar>
@@ -2564,8 +2599,8 @@
           <w:tcPr>
             <w:tcW w:type="dxa" w:w="1800"/>
             <w:tcMar>
-              <w:top w:w="35" w:type="dxa"/>
-              <w:bottom w:w="35" w:type="dxa"/>
+              <w:top w:w="55" w:type="dxa"/>
+              <w:bottom w:w="55" w:type="dxa"/>
               <w:left w:w="80" w:type="dxa"/>
               <w:right w:w="80" w:type="dxa"/>
             </w:tcMar>
@@ -2587,9 +2622,10 @@
                 <w:rFonts w:ascii="Segoe UI" w:hAnsi="Segoe UI" w:cs="Kalpurush"/>
                 <w:b w:val="0"/>
                 <w:i w:val="0"/>
-                <w:color w:val="1E293B"/>
+                <w:color w:val="94A3B8"/>
                 <w:sz w:val="15"/>
               </w:rPr>
+              <w:t>..............................</w:t>
             </w:r>
           </w:p>
         </w:tc>
@@ -2597,8 +2633,8 @@
           <w:tcPr>
             <w:tcW w:type="dxa" w:w="1656"/>
             <w:tcMar>
-              <w:top w:w="35" w:type="dxa"/>
-              <w:bottom w:w="35" w:type="dxa"/>
+              <w:top w:w="55" w:type="dxa"/>
+              <w:bottom w:w="55" w:type="dxa"/>
               <w:left w:w="50" w:type="dxa"/>
               <w:right w:w="50" w:type="dxa"/>
             </w:tcMar>
@@ -2620,9 +2656,10 @@
                 <w:rFonts w:ascii="Segoe UI" w:hAnsi="Segoe UI" w:cs="Kalpurush"/>
                 <w:b w:val="0"/>
                 <w:i w:val="0"/>
-                <w:color w:val="1E293B"/>
+                <w:color w:val="94A3B8"/>
                 <w:sz w:val="15"/>
               </w:rPr>
+              <w:t>......................</w:t>
             </w:r>
           </w:p>
         </w:tc>
@@ -2632,8 +2669,8 @@
           <w:tcPr>
             <w:tcW w:type="dxa" w:w="605"/>
             <w:tcMar>
-              <w:top w:w="35" w:type="dxa"/>
-              <w:bottom w:w="35" w:type="dxa"/>
+              <w:top w:w="55" w:type="dxa"/>
+              <w:bottom w:w="55" w:type="dxa"/>
               <w:left w:w="50" w:type="dxa"/>
               <w:right w:w="50" w:type="dxa"/>
             </w:tcMar>
@@ -2666,8 +2703,8 @@
           <w:tcPr>
             <w:tcW w:type="dxa" w:w="6552"/>
             <w:tcMar>
-              <w:top w:w="35" w:type="dxa"/>
-              <w:bottom w:w="35" w:type="dxa"/>
+              <w:top w:w="55" w:type="dxa"/>
+              <w:bottom w:w="55" w:type="dxa"/>
               <w:left w:w="80" w:type="dxa"/>
               <w:right w:w="80" w:type="dxa"/>
             </w:tcMar>
@@ -2699,8 +2736,8 @@
           <w:tcPr>
             <w:tcW w:type="dxa" w:w="1800"/>
             <w:tcMar>
-              <w:top w:w="35" w:type="dxa"/>
-              <w:bottom w:w="35" w:type="dxa"/>
+              <w:top w:w="55" w:type="dxa"/>
+              <w:bottom w:w="55" w:type="dxa"/>
               <w:left w:w="80" w:type="dxa"/>
               <w:right w:w="80" w:type="dxa"/>
             </w:tcMar>
@@ -2722,9 +2759,10 @@
                 <w:rFonts w:ascii="Segoe UI" w:hAnsi="Segoe UI" w:cs="Kalpurush"/>
                 <w:b w:val="0"/>
                 <w:i w:val="0"/>
-                <w:color w:val="1E293B"/>
+                <w:color w:val="94A3B8"/>
                 <w:sz w:val="15"/>
               </w:rPr>
+              <w:t>..............................</w:t>
             </w:r>
           </w:p>
         </w:tc>
@@ -2732,8 +2770,8 @@
           <w:tcPr>
             <w:tcW w:type="dxa" w:w="1656"/>
             <w:tcMar>
-              <w:top w:w="35" w:type="dxa"/>
-              <w:bottom w:w="35" w:type="dxa"/>
+              <w:top w:w="55" w:type="dxa"/>
+              <w:bottom w:w="55" w:type="dxa"/>
               <w:left w:w="50" w:type="dxa"/>
               <w:right w:w="50" w:type="dxa"/>
             </w:tcMar>
@@ -2755,9 +2793,10 @@
                 <w:rFonts w:ascii="Segoe UI" w:hAnsi="Segoe UI" w:cs="Kalpurush"/>
                 <w:b w:val="0"/>
                 <w:i w:val="0"/>
-                <w:color w:val="1E293B"/>
+                <w:color w:val="94A3B8"/>
                 <w:sz w:val="15"/>
               </w:rPr>
+              <w:t>......................</w:t>
             </w:r>
           </w:p>
         </w:tc>
@@ -2768,8 +2807,8 @@
             <w:tcW w:type="dxa" w:w="5306"/>
             <w:gridSpan w:val="2"/>
             <w:tcMar>
-              <w:top w:w="50" w:type="dxa"/>
-              <w:bottom w:w="50" w:type="dxa"/>
+              <w:top w:w="65" w:type="dxa"/>
+              <w:bottom w:w="65" w:type="dxa"/>
               <w:left w:w="80" w:type="dxa"/>
               <w:right w:w="80" w:type="dxa"/>
             </w:tcMar>
@@ -2802,8 +2841,8 @@
           <w:tcPr>
             <w:tcW w:type="dxa" w:w="2653"/>
             <w:tcMar>
-              <w:top w:w="50" w:type="dxa"/>
-              <w:bottom w:w="50" w:type="dxa"/>
+              <w:top w:w="65" w:type="dxa"/>
+              <w:bottom w:w="65" w:type="dxa"/>
               <w:left w:w="80" w:type="dxa"/>
               <w:right w:w="80" w:type="dxa"/>
             </w:tcMar>
@@ -2828,7 +2867,7 @@
                 <w:color w:val="0369A1"/>
                 <w:sz w:val="16"/>
               </w:rPr>
-              <w:t>= TK</w:t>
+              <w:t xml:space="preserve">= TK            </w:t>
             </w:r>
           </w:p>
         </w:tc>
@@ -2836,8 +2875,8 @@
           <w:tcPr>
             <w:tcW w:type="dxa" w:w="2653"/>
             <w:tcMar>
-              <w:top w:w="50" w:type="dxa"/>
-              <w:bottom w:w="50" w:type="dxa"/>
+              <w:top w:w="65" w:type="dxa"/>
+              <w:bottom w:w="65" w:type="dxa"/>
               <w:left w:w="50" w:type="dxa"/>
               <w:right w:w="50" w:type="dxa"/>
             </w:tcMar>
@@ -2872,8 +2911,8 @@
             <w:tcW w:type="dxa" w:w="5306"/>
             <w:gridSpan w:val="2"/>
             <w:tcMar>
-              <w:top w:w="50" w:type="dxa"/>
-              <w:bottom w:w="50" w:type="dxa"/>
+              <w:top w:w="60" w:type="dxa"/>
+              <w:bottom w:w="60" w:type="dxa"/>
               <w:left w:w="80" w:type="dxa"/>
               <w:right w:w="80" w:type="dxa"/>
             </w:tcMar>
@@ -2906,8 +2945,8 @@
           <w:tcPr>
             <w:tcW w:type="dxa" w:w="2653"/>
             <w:tcMar>
-              <w:top w:w="50" w:type="dxa"/>
-              <w:bottom w:w="50" w:type="dxa"/>
+              <w:top w:w="60" w:type="dxa"/>
+              <w:bottom w:w="60" w:type="dxa"/>
               <w:left w:w="80" w:type="dxa"/>
               <w:right w:w="80" w:type="dxa"/>
             </w:tcMar>
@@ -2926,11 +2965,12 @@
             <w:r>
               <w:rPr>
                 <w:rFonts w:ascii="Segoe UI" w:hAnsi="Segoe UI" w:cs="Kalpurush"/>
-                <w:b/>
+                <w:b w:val="0"/>
                 <w:i w:val="0"/>
-                <w:color w:val="166534"/>
-                <w:sz w:val="16"/>
+                <w:color w:val="94A3B8"/>
+                <w:sz w:val="15"/>
               </w:rPr>
+              <w:t>..............................</w:t>
             </w:r>
           </w:p>
         </w:tc>
@@ -2938,8 +2978,8 @@
           <w:tcPr>
             <w:tcW w:type="dxa" w:w="2653"/>
             <w:tcMar>
-              <w:top w:w="50" w:type="dxa"/>
-              <w:bottom w:w="50" w:type="dxa"/>
+              <w:top w:w="60" w:type="dxa"/>
+              <w:bottom w:w="60" w:type="dxa"/>
               <w:left w:w="50" w:type="dxa"/>
               <w:right w:w="50" w:type="dxa"/>
             </w:tcMar>
@@ -2974,8 +3014,8 @@
             <w:tcW w:type="dxa" w:w="5306"/>
             <w:gridSpan w:val="2"/>
             <w:tcMar>
-              <w:top w:w="55" w:type="dxa"/>
-              <w:bottom w:w="55" w:type="dxa"/>
+              <w:top w:w="65" w:type="dxa"/>
+              <w:bottom w:w="65" w:type="dxa"/>
               <w:left w:w="80" w:type="dxa"/>
               <w:right w:w="80" w:type="dxa"/>
             </w:tcMar>
@@ -3008,8 +3048,8 @@
           <w:tcPr>
             <w:tcW w:type="dxa" w:w="2653"/>
             <w:tcMar>
-              <w:top w:w="55" w:type="dxa"/>
-              <w:bottom w:w="55" w:type="dxa"/>
+              <w:top w:w="65" w:type="dxa"/>
+              <w:bottom w:w="65" w:type="dxa"/>
               <w:left w:w="80" w:type="dxa"/>
               <w:right w:w="80" w:type="dxa"/>
             </w:tcMar>
@@ -3033,7 +3073,7 @@
                 <w:color w:val="DC2626"/>
                 <w:sz w:val="17"/>
               </w:rPr>
-              <w:t>= TK</w:t>
+              <w:t xml:space="preserve">= TK            </w:t>
             </w:r>
           </w:p>
         </w:tc>
@@ -3041,8 +3081,8 @@
           <w:tcPr>
             <w:tcW w:type="dxa" w:w="2653"/>
             <w:tcMar>
-              <w:top w:w="55" w:type="dxa"/>
-              <w:bottom w:w="55" w:type="dxa"/>
+              <w:top w:w="65" w:type="dxa"/>
+              <w:bottom w:w="65" w:type="dxa"/>
               <w:left w:w="50" w:type="dxa"/>
               <w:right w:w="50" w:type="dxa"/>
             </w:tcMar>
@@ -3074,7 +3114,7 @@
     </w:tbl>
     <w:p>
       <w:pPr>
-        <w:spacing w:before="80" w:after="160"/>
+        <w:spacing w:before="100" w:after="160"/>
       </w:pPr>
       <w:r>
         <w:rPr>
@@ -3091,7 +3131,7 @@
           <w:rFonts w:ascii="Segoe UI" w:hAnsi="Segoe UI" w:cs="Kalpurush"/>
           <w:b w:val="0"/>
           <w:i w:val="0"/>
-          <w:color w:val="475569"/>
+          <w:color w:val="94A3B8"/>
           <w:sz w:val="16"/>
         </w:rPr>
         <w:t>................................................................................................................................................................... টাকা মাত্র।</w:t>
@@ -3129,7 +3169,7 @@
                 <w:rFonts w:ascii="Segoe UI" w:hAnsi="Segoe UI" w:cs="Kalpurush"/>
                 <w:b w:val="0"/>
                 <w:i w:val="0"/>
-                <w:color w:val="475569"/>
+                <w:color w:val="94A3B8"/>
                 <w:sz w:val="16"/>
               </w:rPr>
               <w:t>...................................................</w:t>
@@ -3151,7 +3191,7 @@
                 <w:rFonts w:ascii="Segoe UI" w:hAnsi="Segoe UI" w:cs="Kalpurush"/>
                 <w:b w:val="0"/>
                 <w:i/>
-                <w:color w:val="475569"/>
+                <w:color w:val="64748B"/>
                 <w:sz w:val="14"/>
               </w:rPr>
               <w:t>(Prepared By)</w:t>
@@ -3177,7 +3217,7 @@
                 <w:rFonts w:ascii="Segoe UI" w:hAnsi="Segoe UI" w:cs="Kalpurush"/>
                 <w:b w:val="0"/>
                 <w:i w:val="0"/>
-                <w:color w:val="475569"/>
+                <w:color w:val="94A3B8"/>
                 <w:sz w:val="16"/>
               </w:rPr>
               <w:t>...................................................</w:t>
@@ -3199,7 +3239,7 @@
                 <w:rFonts w:ascii="Segoe UI" w:hAnsi="Segoe UI" w:cs="Kalpurush"/>
                 <w:b w:val="0"/>
                 <w:i/>
-                <w:color w:val="475569"/>
+                <w:color w:val="64748B"/>
                 <w:sz w:val="14"/>
               </w:rPr>
               <w:t>(Verified &amp; Checked By)</w:t>
@@ -3225,7 +3265,7 @@
                 <w:rFonts w:ascii="Segoe UI" w:hAnsi="Segoe UI" w:cs="Kalpurush"/>
                 <w:b w:val="0"/>
                 <w:i w:val="0"/>
-                <w:color w:val="475569"/>
+                <w:color w:val="94A3B8"/>
                 <w:sz w:val="16"/>
               </w:rPr>
               <w:t>...................................................</w:t>
@@ -3258,7 +3298,7 @@
                 <w:rFonts w:ascii="Segoe UI" w:hAnsi="Segoe UI" w:cs="Kalpurush"/>
                 <w:b w:val="0"/>
                 <w:i/>
-                <w:color w:val="475569"/>
+                <w:color w:val="64748B"/>
                 <w:sz w:val="14"/>
               </w:rPr>
               <w:t>স্বত্বাধিকারী / অনুমোদিত স্বাক্ষর</w:t>

</xml_diff>

<commit_message>
Update container expense form with 4 fields per line and visible table header title
</commit_message>
<xml_diff>
--- a/Container_Expense_Statement_Form.docx
+++ b/Container_Expense_Statement_Form.docx
@@ -208,8 +208,8 @@
           <w:tcPr>
             <w:tcW w:type="dxa" w:w="4464"/>
             <w:tcMar>
-              <w:top w:w="50" w:type="dxa"/>
-              <w:bottom w:w="50" w:type="dxa"/>
+              <w:top w:w="40" w:type="dxa"/>
+              <w:bottom w:w="40" w:type="dxa"/>
               <w:left w:w="80" w:type="dxa"/>
               <w:right w:w="80" w:type="dxa"/>
             </w:tcMar>
@@ -241,8 +241,8 @@
           <w:tcPr>
             <w:tcW w:type="dxa" w:w="2304"/>
             <w:tcMar>
-              <w:top w:w="50" w:type="dxa"/>
-              <w:bottom w:w="50" w:type="dxa"/>
+              <w:top w:w="40" w:type="dxa"/>
+              <w:bottom w:w="40" w:type="dxa"/>
               <w:left w:w="80" w:type="dxa"/>
               <w:right w:w="80" w:type="dxa"/>
             </w:tcMar>
@@ -275,8 +275,8 @@
           <w:tcPr>
             <w:tcW w:type="dxa" w:w="3845"/>
             <w:tcMar>
-              <w:top w:w="50" w:type="dxa"/>
-              <w:bottom w:w="50" w:type="dxa"/>
+              <w:top w:w="40" w:type="dxa"/>
+              <w:bottom w:w="40" w:type="dxa"/>
               <w:left w:w="80" w:type="dxa"/>
               <w:right w:w="80" w:type="dxa"/>
             </w:tcMar>
@@ -338,24 +338,25 @@
       <w:tr>
         <w:tc>
           <w:tcPr>
-            <w:tcW w:type="dxa" w:w="2520"/>
-            <w:tcMar>
-              <w:top w:w="65" w:type="dxa"/>
-              <w:bottom w:w="65" w:type="dxa"/>
-              <w:left w:w="80" w:type="dxa"/>
-              <w:right w:w="80" w:type="dxa"/>
-            </w:tcMar>
+            <w:tcW w:type="dxa" w:w="2650"/>
             <w:tcBorders>
               <w:top w:val="single" w:sz="4" w:space="0" w:color="CBD5E1"/>
               <w:bottom w:val="single" w:sz="4" w:space="0" w:color="CBD5E1"/>
               <w:left w:val="single" w:sz="4" w:space="0" w:color="CBD5E1"/>
               <w:right w:val="single" w:sz="4" w:space="0" w:color="CBD5E1"/>
             </w:tcBorders>
+            <w:tcMar>
+              <w:top w:w="45" w:type="dxa"/>
+              <w:bottom w:w="45" w:type="dxa"/>
+              <w:left w:w="60" w:type="dxa"/>
+              <w:right w:w="60" w:type="dxa"/>
+            </w:tcMar>
             <w:shd w:fill="F0F9FF"/>
           </w:tcPr>
           <w:p>
             <w:pPr>
               <w:spacing w:before="0" w:after="0"/>
+              <w:jc w:val="center"/>
             </w:pPr>
             <w:r>
               <w:rPr>
@@ -371,56 +372,25 @@
         </w:tc>
         <w:tc>
           <w:tcPr>
-            <w:tcW w:type="dxa" w:w="2779"/>
-            <w:tcMar>
-              <w:top w:w="65" w:type="dxa"/>
-              <w:bottom w:w="65" w:type="dxa"/>
-              <w:left w:w="80" w:type="dxa"/>
-              <w:right w:w="80" w:type="dxa"/>
-            </w:tcMar>
+            <w:tcW w:type="dxa" w:w="2650"/>
             <w:tcBorders>
               <w:top w:val="single" w:sz="4" w:space="0" w:color="CBD5E1"/>
               <w:bottom w:val="single" w:sz="4" w:space="0" w:color="CBD5E1"/>
               <w:left w:val="single" w:sz="4" w:space="0" w:color="CBD5E1"/>
               <w:right w:val="single" w:sz="4" w:space="0" w:color="CBD5E1"/>
             </w:tcBorders>
-          </w:tcPr>
-          <w:p>
-            <w:pPr>
-              <w:spacing w:before="0" w:after="0"/>
-            </w:pPr>
-            <w:r>
-              <w:rPr>
-                <w:rFonts w:ascii="Segoe UI" w:hAnsi="Segoe UI" w:cs="Kalpurush"/>
-                <w:b w:val="0"/>
-                <w:i w:val="0"/>
-                <w:color w:val="94A3B8"/>
-                <w:sz w:val="16"/>
-              </w:rPr>
-              <w:t>...............................................................</w:t>
-            </w:r>
-          </w:p>
-        </w:tc>
-        <w:tc>
-          <w:tcPr>
-            <w:tcW w:type="dxa" w:w="2520"/>
             <w:tcMar>
-              <w:top w:w="65" w:type="dxa"/>
-              <w:bottom w:w="65" w:type="dxa"/>
-              <w:left w:w="80" w:type="dxa"/>
-              <w:right w:w="80" w:type="dxa"/>
+              <w:top w:w="45" w:type="dxa"/>
+              <w:bottom w:w="45" w:type="dxa"/>
+              <w:left w:w="60" w:type="dxa"/>
+              <w:right w:w="60" w:type="dxa"/>
             </w:tcMar>
-            <w:tcBorders>
-              <w:top w:val="single" w:sz="4" w:space="0" w:color="CBD5E1"/>
-              <w:bottom w:val="single" w:sz="4" w:space="0" w:color="CBD5E1"/>
-              <w:left w:val="single" w:sz="4" w:space="0" w:color="CBD5E1"/>
-              <w:right w:val="single" w:sz="4" w:space="0" w:color="CBD5E1"/>
-            </w:tcBorders>
             <w:shd w:fill="F0F9FF"/>
           </w:tcPr>
           <w:p>
             <w:pPr>
               <w:spacing w:before="0" w:after="0"/>
+              <w:jc w:val="center"/>
             </w:pPr>
             <w:r>
               <w:rPr>
@@ -430,64 +400,31 @@
                 <w:color w:val="0369A1"/>
                 <w:sz w:val="16"/>
               </w:rPr>
-              <w:t>কন্টেইনার সাইজ:</w:t>
+              <w:t>কন্টেইনার সাইজ ফুট:</w:t>
             </w:r>
           </w:p>
         </w:tc>
         <w:tc>
           <w:tcPr>
-            <w:tcW w:type="dxa" w:w="2794"/>
-            <w:tcMar>
-              <w:top w:w="65" w:type="dxa"/>
-              <w:bottom w:w="65" w:type="dxa"/>
-              <w:left w:w="80" w:type="dxa"/>
-              <w:right w:w="80" w:type="dxa"/>
-            </w:tcMar>
+            <w:tcW w:type="dxa" w:w="2650"/>
             <w:tcBorders>
               <w:top w:val="single" w:sz="4" w:space="0" w:color="CBD5E1"/>
               <w:bottom w:val="single" w:sz="4" w:space="0" w:color="CBD5E1"/>
               <w:left w:val="single" w:sz="4" w:space="0" w:color="CBD5E1"/>
               <w:right w:val="single" w:sz="4" w:space="0" w:color="CBD5E1"/>
             </w:tcBorders>
-          </w:tcPr>
-          <w:p>
-            <w:pPr>
-              <w:spacing w:before="0" w:after="0"/>
-            </w:pPr>
-            <w:r>
-              <w:rPr>
-                <w:rFonts w:ascii="Segoe UI" w:hAnsi="Segoe UI" w:cs="Kalpurush"/>
-                <w:b/>
-                <w:i w:val="0"/>
-                <w:color w:val="1E293B"/>
-                <w:sz w:val="16"/>
-              </w:rPr>
-              <w:t>২০ ফুট [  ]   ৪০ ফুট [ ✓ ]</w:t>
-            </w:r>
-          </w:p>
-        </w:tc>
-      </w:tr>
-      <w:tr>
-        <w:tc>
-          <w:tcPr>
-            <w:tcW w:type="dxa" w:w="2520"/>
             <w:tcMar>
-              <w:top w:w="65" w:type="dxa"/>
-              <w:bottom w:w="65" w:type="dxa"/>
-              <w:left w:w="80" w:type="dxa"/>
-              <w:right w:w="80" w:type="dxa"/>
+              <w:top w:w="45" w:type="dxa"/>
+              <w:bottom w:w="45" w:type="dxa"/>
+              <w:left w:w="60" w:type="dxa"/>
+              <w:right w:w="60" w:type="dxa"/>
             </w:tcMar>
-            <w:tcBorders>
-              <w:top w:val="single" w:sz="4" w:space="0" w:color="CBD5E1"/>
-              <w:bottom w:val="single" w:sz="4" w:space="0" w:color="CBD5E1"/>
-              <w:left w:val="single" w:sz="4" w:space="0" w:color="CBD5E1"/>
-              <w:right w:val="single" w:sz="4" w:space="0" w:color="CBD5E1"/>
-            </w:tcBorders>
             <w:shd w:fill="F0F9FF"/>
           </w:tcPr>
           <w:p>
             <w:pPr>
               <w:spacing w:before="0" w:after="0"/>
+              <w:jc w:val="center"/>
             </w:pPr>
             <w:r>
               <w:rPr>
@@ -497,62 +434,31 @@
                 <w:color w:val="0369A1"/>
                 <w:sz w:val="16"/>
               </w:rPr>
-              <w:t>এল/সি নং (L/C No):</w:t>
+              <w:t>L/C No:</w:t>
             </w:r>
           </w:p>
         </w:tc>
         <w:tc>
           <w:tcPr>
-            <w:tcW w:type="dxa" w:w="2779"/>
-            <w:tcMar>
-              <w:top w:w="65" w:type="dxa"/>
-              <w:bottom w:w="65" w:type="dxa"/>
-              <w:left w:w="80" w:type="dxa"/>
-              <w:right w:w="80" w:type="dxa"/>
-            </w:tcMar>
+            <w:tcW w:type="dxa" w:w="2664"/>
             <w:tcBorders>
               <w:top w:val="single" w:sz="4" w:space="0" w:color="CBD5E1"/>
               <w:bottom w:val="single" w:sz="4" w:space="0" w:color="CBD5E1"/>
               <w:left w:val="single" w:sz="4" w:space="0" w:color="CBD5E1"/>
               <w:right w:val="single" w:sz="4" w:space="0" w:color="CBD5E1"/>
             </w:tcBorders>
-          </w:tcPr>
-          <w:p>
-            <w:pPr>
-              <w:spacing w:before="0" w:after="0"/>
-            </w:pPr>
-            <w:r>
-              <w:rPr>
-                <w:rFonts w:ascii="Segoe UI" w:hAnsi="Segoe UI" w:cs="Kalpurush"/>
-                <w:b w:val="0"/>
-                <w:i w:val="0"/>
-                <w:color w:val="94A3B8"/>
-                <w:sz w:val="16"/>
-              </w:rPr>
-              <w:t>...............................................................</w:t>
-            </w:r>
-          </w:p>
-        </w:tc>
-        <w:tc>
-          <w:tcPr>
-            <w:tcW w:type="dxa" w:w="2520"/>
             <w:tcMar>
-              <w:top w:w="65" w:type="dxa"/>
-              <w:bottom w:w="65" w:type="dxa"/>
-              <w:left w:w="80" w:type="dxa"/>
-              <w:right w:w="80" w:type="dxa"/>
+              <w:top w:w="45" w:type="dxa"/>
+              <w:bottom w:w="45" w:type="dxa"/>
+              <w:left w:w="60" w:type="dxa"/>
+              <w:right w:w="60" w:type="dxa"/>
             </w:tcMar>
-            <w:tcBorders>
-              <w:top w:val="single" w:sz="4" w:space="0" w:color="CBD5E1"/>
-              <w:bottom w:val="single" w:sz="4" w:space="0" w:color="CBD5E1"/>
-              <w:left w:val="single" w:sz="4" w:space="0" w:color="CBD5E1"/>
-              <w:right w:val="single" w:sz="4" w:space="0" w:color="CBD5E1"/>
-            </w:tcBorders>
             <w:shd w:fill="F0F9FF"/>
           </w:tcPr>
           <w:p>
             <w:pPr>
               <w:spacing w:before="0" w:after="0"/>
+              <w:jc w:val="center"/>
             </w:pPr>
             <w:r>
               <w:rPr>
@@ -566,35 +472,138 @@
             </w:r>
           </w:p>
         </w:tc>
+      </w:tr>
+      <w:tr>
         <w:tc>
           <w:tcPr>
-            <w:tcW w:type="dxa" w:w="2794"/>
-            <w:tcMar>
-              <w:top w:w="65" w:type="dxa"/>
-              <w:bottom w:w="65" w:type="dxa"/>
-              <w:left w:w="80" w:type="dxa"/>
-              <w:right w:w="80" w:type="dxa"/>
-            </w:tcMar>
+            <w:tcW w:type="dxa" w:w="2650"/>
             <w:tcBorders>
               <w:top w:val="single" w:sz="4" w:space="0" w:color="CBD5E1"/>
               <w:bottom w:val="single" w:sz="4" w:space="0" w:color="CBD5E1"/>
               <w:left w:val="single" w:sz="4" w:space="0" w:color="CBD5E1"/>
               <w:right w:val="single" w:sz="4" w:space="0" w:color="CBD5E1"/>
             </w:tcBorders>
+            <w:tcMar>
+              <w:top w:w="65" w:type="dxa"/>
+              <w:bottom w:w="65" w:type="dxa"/>
+              <w:left w:w="60" w:type="dxa"/>
+              <w:right w:w="60" w:type="dxa"/>
+            </w:tcMar>
+            <w:shd w:fill="FFFFFF"/>
           </w:tcPr>
           <w:p>
             <w:pPr>
               <w:spacing w:before="0" w:after="0"/>
+              <w:jc w:val="left"/>
             </w:pPr>
             <w:r>
               <w:rPr>
                 <w:rFonts w:ascii="Segoe UI" w:hAnsi="Segoe UI" w:cs="Kalpurush"/>
                 <w:b w:val="0"/>
                 <w:i w:val="0"/>
-                <w:color w:val="94A3B8"/>
+                <w:color w:val="1E293B"/>
                 <w:sz w:val="16"/>
               </w:rPr>
-              <w:t>$ .........................................................</w:t>
+            </w:r>
+          </w:p>
+        </w:tc>
+        <w:tc>
+          <w:tcPr>
+            <w:tcW w:type="dxa" w:w="2650"/>
+            <w:tcBorders>
+              <w:top w:val="single" w:sz="4" w:space="0" w:color="CBD5E1"/>
+              <w:bottom w:val="single" w:sz="4" w:space="0" w:color="CBD5E1"/>
+              <w:left w:val="single" w:sz="4" w:space="0" w:color="CBD5E1"/>
+              <w:right w:val="single" w:sz="4" w:space="0" w:color="CBD5E1"/>
+            </w:tcBorders>
+            <w:tcMar>
+              <w:top w:w="65" w:type="dxa"/>
+              <w:bottom w:w="65" w:type="dxa"/>
+              <w:left w:w="60" w:type="dxa"/>
+              <w:right w:w="60" w:type="dxa"/>
+            </w:tcMar>
+            <w:shd w:fill="FFFFFF"/>
+          </w:tcPr>
+          <w:p>
+            <w:pPr>
+              <w:spacing w:before="0" w:after="0"/>
+              <w:jc w:val="left"/>
+            </w:pPr>
+            <w:r>
+              <w:rPr>
+                <w:rFonts w:ascii="Segoe UI" w:hAnsi="Segoe UI" w:cs="Kalpurush"/>
+                <w:b w:val="0"/>
+                <w:i w:val="0"/>
+                <w:color w:val="1E293B"/>
+                <w:sz w:val="16"/>
+              </w:rPr>
+            </w:r>
+          </w:p>
+        </w:tc>
+        <w:tc>
+          <w:tcPr>
+            <w:tcW w:type="dxa" w:w="2650"/>
+            <w:tcBorders>
+              <w:top w:val="single" w:sz="4" w:space="0" w:color="CBD5E1"/>
+              <w:bottom w:val="single" w:sz="4" w:space="0" w:color="CBD5E1"/>
+              <w:left w:val="single" w:sz="4" w:space="0" w:color="CBD5E1"/>
+              <w:right w:val="single" w:sz="4" w:space="0" w:color="CBD5E1"/>
+            </w:tcBorders>
+            <w:tcMar>
+              <w:top w:w="65" w:type="dxa"/>
+              <w:bottom w:w="65" w:type="dxa"/>
+              <w:left w:w="60" w:type="dxa"/>
+              <w:right w:w="60" w:type="dxa"/>
+            </w:tcMar>
+            <w:shd w:fill="FFFFFF"/>
+          </w:tcPr>
+          <w:p>
+            <w:pPr>
+              <w:spacing w:before="0" w:after="0"/>
+              <w:jc w:val="left"/>
+            </w:pPr>
+            <w:r>
+              <w:rPr>
+                <w:rFonts w:ascii="Segoe UI" w:hAnsi="Segoe UI" w:cs="Kalpurush"/>
+                <w:b w:val="0"/>
+                <w:i w:val="0"/>
+                <w:color w:val="1E293B"/>
+                <w:sz w:val="16"/>
+              </w:rPr>
+            </w:r>
+          </w:p>
+        </w:tc>
+        <w:tc>
+          <w:tcPr>
+            <w:tcW w:type="dxa" w:w="2664"/>
+            <w:tcBorders>
+              <w:top w:val="single" w:sz="4" w:space="0" w:color="CBD5E1"/>
+              <w:bottom w:val="single" w:sz="4" w:space="0" w:color="CBD5E1"/>
+              <w:left w:val="single" w:sz="4" w:space="0" w:color="CBD5E1"/>
+              <w:right w:val="single" w:sz="4" w:space="0" w:color="CBD5E1"/>
+            </w:tcBorders>
+            <w:tcMar>
+              <w:top w:w="65" w:type="dxa"/>
+              <w:bottom w:w="65" w:type="dxa"/>
+              <w:left w:w="60" w:type="dxa"/>
+              <w:right w:w="60" w:type="dxa"/>
+            </w:tcMar>
+            <w:shd w:fill="FFFFFF"/>
+          </w:tcPr>
+          <w:p>
+            <w:pPr>
+              <w:spacing w:before="0" w:after="0"/>
+              <w:jc w:val="left"/>
+            </w:pPr>
+            <w:r>
+              <w:rPr>
+                <w:rFonts w:ascii="Segoe UI" w:hAnsi="Segoe UI" w:cs="Kalpurush"/>
+                <w:b w:val="0"/>
+                <w:i w:val="0"/>
+                <w:color w:val="1E293B"/>
+                <w:sz w:val="16"/>
+              </w:rPr>
+              <w:t xml:space="preserve">$ </w:t>
             </w:r>
           </w:p>
         </w:tc>
@@ -602,24 +611,25 @@
       <w:tr>
         <w:tc>
           <w:tcPr>
-            <w:tcW w:type="dxa" w:w="2520"/>
-            <w:tcMar>
-              <w:top w:w="65" w:type="dxa"/>
-              <w:bottom w:w="65" w:type="dxa"/>
-              <w:left w:w="80" w:type="dxa"/>
-              <w:right w:w="80" w:type="dxa"/>
-            </w:tcMar>
+            <w:tcW w:type="dxa" w:w="2650"/>
             <w:tcBorders>
               <w:top w:val="single" w:sz="4" w:space="0" w:color="CBD5E1"/>
               <w:bottom w:val="single" w:sz="4" w:space="0" w:color="CBD5E1"/>
               <w:left w:val="single" w:sz="4" w:space="0" w:color="CBD5E1"/>
               <w:right w:val="single" w:sz="4" w:space="0" w:color="CBD5E1"/>
             </w:tcBorders>
+            <w:tcMar>
+              <w:top w:w="45" w:type="dxa"/>
+              <w:bottom w:w="45" w:type="dxa"/>
+              <w:left w:w="60" w:type="dxa"/>
+              <w:right w:w="60" w:type="dxa"/>
+            </w:tcMar>
             <w:shd w:fill="F0F9FF"/>
           </w:tcPr>
           <w:p>
             <w:pPr>
               <w:spacing w:before="0" w:after="0"/>
+              <w:jc w:val="center"/>
             </w:pPr>
             <w:r>
               <w:rPr>
@@ -635,56 +645,25 @@
         </w:tc>
         <w:tc>
           <w:tcPr>
-            <w:tcW w:type="dxa" w:w="2779"/>
-            <w:tcMar>
-              <w:top w:w="65" w:type="dxa"/>
-              <w:bottom w:w="65" w:type="dxa"/>
-              <w:left w:w="80" w:type="dxa"/>
-              <w:right w:w="80" w:type="dxa"/>
-            </w:tcMar>
+            <w:tcW w:type="dxa" w:w="2650"/>
             <w:tcBorders>
               <w:top w:val="single" w:sz="4" w:space="0" w:color="CBD5E1"/>
               <w:bottom w:val="single" w:sz="4" w:space="0" w:color="CBD5E1"/>
               <w:left w:val="single" w:sz="4" w:space="0" w:color="CBD5E1"/>
               <w:right w:val="single" w:sz="4" w:space="0" w:color="CBD5E1"/>
             </w:tcBorders>
-          </w:tcPr>
-          <w:p>
-            <w:pPr>
-              <w:spacing w:before="0" w:after="0"/>
-            </w:pPr>
-            <w:r>
-              <w:rPr>
-                <w:rFonts w:ascii="Segoe UI" w:hAnsi="Segoe UI" w:cs="Kalpurush"/>
-                <w:b/>
-                <w:i w:val="0"/>
-                <w:color w:val="1E293B"/>
-                <w:sz w:val="16"/>
-              </w:rPr>
-              <w:t>...... / ...... / ২০......</w:t>
-            </w:r>
-          </w:p>
-        </w:tc>
-        <w:tc>
-          <w:tcPr>
-            <w:tcW w:type="dxa" w:w="2520"/>
             <w:tcMar>
-              <w:top w:w="65" w:type="dxa"/>
-              <w:bottom w:w="65" w:type="dxa"/>
-              <w:left w:w="80" w:type="dxa"/>
-              <w:right w:w="80" w:type="dxa"/>
+              <w:top w:w="45" w:type="dxa"/>
+              <w:bottom w:w="45" w:type="dxa"/>
+              <w:left w:w="60" w:type="dxa"/>
+              <w:right w:w="60" w:type="dxa"/>
             </w:tcMar>
-            <w:tcBorders>
-              <w:top w:val="single" w:sz="4" w:space="0" w:color="CBD5E1"/>
-              <w:bottom w:val="single" w:sz="4" w:space="0" w:color="CBD5E1"/>
-              <w:left w:val="single" w:sz="4" w:space="0" w:color="CBD5E1"/>
-              <w:right w:val="single" w:sz="4" w:space="0" w:color="CBD5E1"/>
-            </w:tcBorders>
             <w:shd w:fill="F0F9FF"/>
           </w:tcPr>
           <w:p>
             <w:pPr>
               <w:spacing w:before="0" w:after="0"/>
+              <w:jc w:val="center"/>
             </w:pPr>
             <w:r>
               <w:rPr>
@@ -700,58 +679,25 @@
         </w:tc>
         <w:tc>
           <w:tcPr>
-            <w:tcW w:type="dxa" w:w="2794"/>
-            <w:tcMar>
-              <w:top w:w="65" w:type="dxa"/>
-              <w:bottom w:w="65" w:type="dxa"/>
-              <w:left w:w="80" w:type="dxa"/>
-              <w:right w:w="80" w:type="dxa"/>
-            </w:tcMar>
+            <w:tcW w:type="dxa" w:w="2650"/>
             <w:tcBorders>
               <w:top w:val="single" w:sz="4" w:space="0" w:color="CBD5E1"/>
               <w:bottom w:val="single" w:sz="4" w:space="0" w:color="CBD5E1"/>
               <w:left w:val="single" w:sz="4" w:space="0" w:color="CBD5E1"/>
               <w:right w:val="single" w:sz="4" w:space="0" w:color="CBD5E1"/>
             </w:tcBorders>
-          </w:tcPr>
-          <w:p>
-            <w:pPr>
-              <w:spacing w:before="0" w:after="0"/>
-            </w:pPr>
-            <w:r>
-              <w:rPr>
-                <w:rFonts w:ascii="Segoe UI" w:hAnsi="Segoe UI" w:cs="Kalpurush"/>
-                <w:b/>
-                <w:i w:val="0"/>
-                <w:color w:val="1E293B"/>
-                <w:sz w:val="16"/>
-              </w:rPr>
-              <w:t>...... / ...... / ২০......</w:t>
-            </w:r>
-          </w:p>
-        </w:tc>
-      </w:tr>
-      <w:tr>
-        <w:tc>
-          <w:tcPr>
-            <w:tcW w:type="dxa" w:w="2520"/>
             <w:tcMar>
-              <w:top w:w="65" w:type="dxa"/>
-              <w:bottom w:w="65" w:type="dxa"/>
-              <w:left w:w="80" w:type="dxa"/>
-              <w:right w:w="80" w:type="dxa"/>
+              <w:top w:w="45" w:type="dxa"/>
+              <w:bottom w:w="45" w:type="dxa"/>
+              <w:left w:w="60" w:type="dxa"/>
+              <w:right w:w="60" w:type="dxa"/>
             </w:tcMar>
-            <w:tcBorders>
-              <w:top w:val="single" w:sz="4" w:space="0" w:color="CBD5E1"/>
-              <w:bottom w:val="single" w:sz="4" w:space="0" w:color="CBD5E1"/>
-              <w:left w:val="single" w:sz="4" w:space="0" w:color="CBD5E1"/>
-              <w:right w:val="single" w:sz="4" w:space="0" w:color="CBD5E1"/>
-            </w:tcBorders>
             <w:shd w:fill="F0F9FF"/>
           </w:tcPr>
           <w:p>
             <w:pPr>
               <w:spacing w:before="0" w:after="0"/>
+              <w:jc w:val="center"/>
             </w:pPr>
             <w:r>
               <w:rPr>
@@ -761,62 +707,31 @@
                 <w:color w:val="0369A1"/>
                 <w:sz w:val="16"/>
               </w:rPr>
-              <w:t>কোম্পানী / শিপার:</w:t>
+              <w:t>কোম্পানী:</w:t>
             </w:r>
           </w:p>
         </w:tc>
         <w:tc>
           <w:tcPr>
-            <w:tcW w:type="dxa" w:w="2779"/>
-            <w:tcMar>
-              <w:top w:w="65" w:type="dxa"/>
-              <w:bottom w:w="65" w:type="dxa"/>
-              <w:left w:w="80" w:type="dxa"/>
-              <w:right w:w="80" w:type="dxa"/>
-            </w:tcMar>
+            <w:tcW w:type="dxa" w:w="2664"/>
             <w:tcBorders>
               <w:top w:val="single" w:sz="4" w:space="0" w:color="CBD5E1"/>
               <w:bottom w:val="single" w:sz="4" w:space="0" w:color="CBD5E1"/>
               <w:left w:val="single" w:sz="4" w:space="0" w:color="CBD5E1"/>
               <w:right w:val="single" w:sz="4" w:space="0" w:color="CBD5E1"/>
             </w:tcBorders>
-          </w:tcPr>
-          <w:p>
-            <w:pPr>
-              <w:spacing w:before="0" w:after="0"/>
-            </w:pPr>
-            <w:r>
-              <w:rPr>
-                <w:rFonts w:ascii="Segoe UI" w:hAnsi="Segoe UI" w:cs="Kalpurush"/>
-                <w:b w:val="0"/>
-                <w:i w:val="0"/>
-                <w:color w:val="94A3B8"/>
-                <w:sz w:val="16"/>
-              </w:rPr>
-              <w:t>...............................................................</w:t>
-            </w:r>
-          </w:p>
-        </w:tc>
-        <w:tc>
-          <w:tcPr>
-            <w:tcW w:type="dxa" w:w="2520"/>
             <w:tcMar>
-              <w:top w:w="65" w:type="dxa"/>
-              <w:bottom w:w="65" w:type="dxa"/>
-              <w:left w:w="80" w:type="dxa"/>
-              <w:right w:w="80" w:type="dxa"/>
+              <w:top w:w="45" w:type="dxa"/>
+              <w:bottom w:w="45" w:type="dxa"/>
+              <w:left w:w="60" w:type="dxa"/>
+              <w:right w:w="60" w:type="dxa"/>
             </w:tcMar>
-            <w:tcBorders>
-              <w:top w:val="single" w:sz="4" w:space="0" w:color="CBD5E1"/>
-              <w:bottom w:val="single" w:sz="4" w:space="0" w:color="CBD5E1"/>
-              <w:left w:val="single" w:sz="4" w:space="0" w:color="CBD5E1"/>
-              <w:right w:val="single" w:sz="4" w:space="0" w:color="CBD5E1"/>
-            </w:tcBorders>
             <w:shd w:fill="F0F9FF"/>
           </w:tcPr>
           <w:p>
             <w:pPr>
               <w:spacing w:before="0" w:after="0"/>
+              <w:jc w:val="center"/>
             </w:pPr>
             <w:r>
               <w:rPr>
@@ -830,25 +745,29 @@
             </w:r>
           </w:p>
         </w:tc>
+      </w:tr>
+      <w:tr>
         <w:tc>
           <w:tcPr>
-            <w:tcW w:type="dxa" w:w="2794"/>
-            <w:tcMar>
-              <w:top w:w="65" w:type="dxa"/>
-              <w:bottom w:w="65" w:type="dxa"/>
-              <w:left w:w="80" w:type="dxa"/>
-              <w:right w:w="80" w:type="dxa"/>
-            </w:tcMar>
+            <w:tcW w:type="dxa" w:w="2650"/>
             <w:tcBorders>
               <w:top w:val="single" w:sz="4" w:space="0" w:color="CBD5E1"/>
               <w:bottom w:val="single" w:sz="4" w:space="0" w:color="CBD5E1"/>
               <w:left w:val="single" w:sz="4" w:space="0" w:color="CBD5E1"/>
               <w:right w:val="single" w:sz="4" w:space="0" w:color="CBD5E1"/>
             </w:tcBorders>
+            <w:tcMar>
+              <w:top w:w="65" w:type="dxa"/>
+              <w:bottom w:w="65" w:type="dxa"/>
+              <w:left w:w="60" w:type="dxa"/>
+              <w:right w:w="60" w:type="dxa"/>
+            </w:tcMar>
+            <w:shd w:fill="FFFFFF"/>
           </w:tcPr>
           <w:p>
             <w:pPr>
               <w:spacing w:before="0" w:after="0"/>
+              <w:jc w:val="center"/>
             </w:pPr>
             <w:r>
               <w:rPr>
@@ -858,7 +777,108 @@
                 <w:color w:val="1E293B"/>
                 <w:sz w:val="16"/>
               </w:rPr>
-              <w:t>চট্টগ্রাম বন্দর [  ]   কমলাপুর আইসিডি [ ✓ ]</w:t>
+              <w:t>......... /….... / ২০..........</w:t>
+            </w:r>
+          </w:p>
+        </w:tc>
+        <w:tc>
+          <w:tcPr>
+            <w:tcW w:type="dxa" w:w="2650"/>
+            <w:tcBorders>
+              <w:top w:val="single" w:sz="4" w:space="0" w:color="CBD5E1"/>
+              <w:bottom w:val="single" w:sz="4" w:space="0" w:color="CBD5E1"/>
+              <w:left w:val="single" w:sz="4" w:space="0" w:color="CBD5E1"/>
+              <w:right w:val="single" w:sz="4" w:space="0" w:color="CBD5E1"/>
+            </w:tcBorders>
+            <w:tcMar>
+              <w:top w:w="65" w:type="dxa"/>
+              <w:bottom w:w="65" w:type="dxa"/>
+              <w:left w:w="60" w:type="dxa"/>
+              <w:right w:w="60" w:type="dxa"/>
+            </w:tcMar>
+            <w:shd w:fill="FFFFFF"/>
+          </w:tcPr>
+          <w:p>
+            <w:pPr>
+              <w:spacing w:before="0" w:after="0"/>
+              <w:jc w:val="center"/>
+            </w:pPr>
+            <w:r>
+              <w:rPr>
+                <w:rFonts w:ascii="Segoe UI" w:hAnsi="Segoe UI" w:cs="Kalpurush"/>
+                <w:b/>
+                <w:i w:val="0"/>
+                <w:color w:val="1E293B"/>
+                <w:sz w:val="16"/>
+              </w:rPr>
+              <w:t>.......... / …….... / ২০........</w:t>
+            </w:r>
+          </w:p>
+        </w:tc>
+        <w:tc>
+          <w:tcPr>
+            <w:tcW w:type="dxa" w:w="2650"/>
+            <w:tcBorders>
+              <w:top w:val="single" w:sz="4" w:space="0" w:color="CBD5E1"/>
+              <w:bottom w:val="single" w:sz="4" w:space="0" w:color="CBD5E1"/>
+              <w:left w:val="single" w:sz="4" w:space="0" w:color="CBD5E1"/>
+              <w:right w:val="single" w:sz="4" w:space="0" w:color="CBD5E1"/>
+            </w:tcBorders>
+            <w:tcMar>
+              <w:top w:w="65" w:type="dxa"/>
+              <w:bottom w:w="65" w:type="dxa"/>
+              <w:left w:w="60" w:type="dxa"/>
+              <w:right w:w="60" w:type="dxa"/>
+            </w:tcMar>
+            <w:shd w:fill="FFFFFF"/>
+          </w:tcPr>
+          <w:p>
+            <w:pPr>
+              <w:spacing w:before="0" w:after="0"/>
+              <w:jc w:val="left"/>
+            </w:pPr>
+            <w:r>
+              <w:rPr>
+                <w:rFonts w:ascii="Segoe UI" w:hAnsi="Segoe UI" w:cs="Kalpurush"/>
+                <w:b w:val="0"/>
+                <w:i w:val="0"/>
+                <w:color w:val="1E293B"/>
+                <w:sz w:val="16"/>
+              </w:rPr>
+            </w:r>
+          </w:p>
+        </w:tc>
+        <w:tc>
+          <w:tcPr>
+            <w:tcW w:type="dxa" w:w="2664"/>
+            <w:tcBorders>
+              <w:top w:val="single" w:sz="4" w:space="0" w:color="CBD5E1"/>
+              <w:bottom w:val="single" w:sz="4" w:space="0" w:color="CBD5E1"/>
+              <w:left w:val="single" w:sz="4" w:space="0" w:color="CBD5E1"/>
+              <w:right w:val="single" w:sz="4" w:space="0" w:color="CBD5E1"/>
+            </w:tcBorders>
+            <w:tcMar>
+              <w:top w:w="65" w:type="dxa"/>
+              <w:bottom w:w="65" w:type="dxa"/>
+              <w:left w:w="60" w:type="dxa"/>
+              <w:right w:w="60" w:type="dxa"/>
+            </w:tcMar>
+            <w:shd w:fill="FFFFFF"/>
+          </w:tcPr>
+          <w:p>
+            <w:pPr>
+              <w:spacing w:before="0" w:after="0"/>
+              <w:jc w:val="center"/>
+            </w:pPr>
+            <w:r>
+              <w:rPr>
+                <w:rFonts w:ascii="Segoe UI" w:hAnsi="Segoe UI" w:cs="Kalpurush"/>
+                <w:b/>
+                <w:i w:val="0"/>
+                <w:color w:val="1E293B"/>
+                <w:sz w:val="16"/>
+              </w:rPr>
+              <w:t>চট্টগ্রাম বন্দর [  ]   কমলাপুর আইসিডি [  ]</w:t>
             </w:r>
           </w:p>
         </w:tc>
@@ -877,27 +897,26 @@
         <w:tblLook w:firstColumn="1" w:firstRow="1" w:lastColumn="0" w:lastRow="0" w:noHBand="0" w:noVBand="1" w:val="04A0"/>
       </w:tblPr>
       <w:tblGrid>
-        <w:gridCol w:w="2653"/>
-        <w:gridCol w:w="2653"/>
-        <w:gridCol w:w="2653"/>
-        <w:gridCol w:w="2653"/>
+        <w:gridCol w:w="3538"/>
+        <w:gridCol w:w="3538"/>
+        <w:gridCol w:w="3538"/>
       </w:tblGrid>
       <w:tr>
         <w:tc>
           <w:tcPr>
-            <w:tcW w:type="dxa" w:w="605"/>
+            <w:tcW w:type="dxa" w:w="648"/>
             <w:tcMar>
-              <w:top w:w="80" w:type="dxa"/>
-              <w:bottom w:w="80" w:type="dxa"/>
+              <w:top w:w="70" w:type="dxa"/>
+              <w:bottom w:w="70" w:type="dxa"/>
               <w:left w:w="80" w:type="dxa"/>
               <w:right w:w="80" w:type="dxa"/>
             </w:tcMar>
-            <w:shd w:fill="0369A1"/>
+            <w:shd w:fill="E0F2FE"/>
             <w:tcBorders>
               <w:top w:val="single" w:sz="6" w:space="0" w:color="0369A1"/>
               <w:bottom w:val="single" w:sz="6" w:space="0" w:color="0369A1"/>
-              <w:left w:val="single" w:sz="6" w:space="0" w:color="0369A1"/>
-              <w:right w:val="single" w:sz="6" w:space="0" w:color="0369A1"/>
+              <w:left w:val="single" w:sz="6" w:space="0" w:color="CBD5E1"/>
+              <w:right w:val="single" w:sz="6" w:space="0" w:color="CBD5E1"/>
             </w:tcBorders>
           </w:tcPr>
           <w:p>
@@ -910,8 +929,8 @@
                 <w:rFonts w:ascii="Segoe UI" w:hAnsi="Segoe UI" w:cs="Kalpurush"/>
                 <w:b/>
                 <w:i w:val="0"/>
-                <w:color w:val="FFFFFF"/>
-                <w:sz w:val="16"/>
+                <w:color w:val="0369A1"/>
+                <w:sz w:val="17"/>
               </w:rPr>
               <w:t>ক্র.</w:t>
             </w:r>
@@ -919,19 +938,19 @@
         </w:tc>
         <w:tc>
           <w:tcPr>
-            <w:tcW w:type="dxa" w:w="6552"/>
+            <w:tcW w:type="dxa" w:w="7949"/>
             <w:tcMar>
-              <w:top w:w="80" w:type="dxa"/>
-              <w:bottom w:w="80" w:type="dxa"/>
+              <w:top w:w="70" w:type="dxa"/>
+              <w:bottom w:w="70" w:type="dxa"/>
               <w:left w:w="80" w:type="dxa"/>
               <w:right w:w="80" w:type="dxa"/>
             </w:tcMar>
-            <w:shd w:fill="0369A1"/>
+            <w:shd w:fill="E0F2FE"/>
             <w:tcBorders>
               <w:top w:val="single" w:sz="6" w:space="0" w:color="0369A1"/>
               <w:bottom w:val="single" w:sz="6" w:space="0" w:color="0369A1"/>
-              <w:left w:val="single" w:sz="6" w:space="0" w:color="0369A1"/>
-              <w:right w:val="single" w:sz="6" w:space="0" w:color="0369A1"/>
+              <w:left w:val="single" w:sz="6" w:space="0" w:color="CBD5E1"/>
+              <w:right w:val="single" w:sz="6" w:space="0" w:color="CBD5E1"/>
             </w:tcBorders>
           </w:tcPr>
           <w:p>
@@ -944,8 +963,8 @@
                 <w:rFonts w:ascii="Segoe UI" w:hAnsi="Segoe UI" w:cs="Kalpurush"/>
                 <w:b/>
                 <w:i w:val="0"/>
-                <w:color w:val="FFFFFF"/>
-                <w:sz w:val="16"/>
+                <w:color w:val="0369A1"/>
+                <w:sz w:val="17"/>
               </w:rPr>
               <w:t>খরচের খাত ও কাজের বিবরণ (Expense Particulars)</w:t>
             </w:r>
@@ -953,19 +972,19 @@
         </w:tc>
         <w:tc>
           <w:tcPr>
-            <w:tcW w:type="dxa" w:w="1800"/>
+            <w:tcW w:type="dxa" w:w="2016"/>
             <w:tcMar>
-              <w:top w:w="80" w:type="dxa"/>
-              <w:bottom w:w="80" w:type="dxa"/>
+              <w:top w:w="70" w:type="dxa"/>
+              <w:bottom w:w="70" w:type="dxa"/>
               <w:left w:w="80" w:type="dxa"/>
               <w:right w:w="80" w:type="dxa"/>
             </w:tcMar>
-            <w:shd w:fill="0369A1"/>
+            <w:shd w:fill="E0F2FE"/>
             <w:tcBorders>
               <w:top w:val="single" w:sz="6" w:space="0" w:color="0369A1"/>
               <w:bottom w:val="single" w:sz="6" w:space="0" w:color="0369A1"/>
-              <w:left w:val="single" w:sz="6" w:space="0" w:color="0369A1"/>
-              <w:right w:val="single" w:sz="6" w:space="0" w:color="0369A1"/>
+              <w:left w:val="single" w:sz="6" w:space="0" w:color="CBD5E1"/>
+              <w:right w:val="single" w:sz="6" w:space="0" w:color="CBD5E1"/>
             </w:tcBorders>
           </w:tcPr>
           <w:p>
@@ -978,44 +997,10 @@
                 <w:rFonts w:ascii="Segoe UI" w:hAnsi="Segoe UI" w:cs="Kalpurush"/>
                 <w:b/>
                 <w:i w:val="0"/>
-                <w:color w:val="FFFFFF"/>
-                <w:sz w:val="16"/>
+                <w:color w:val="0369A1"/>
+                <w:sz w:val="17"/>
               </w:rPr>
               <w:t>পরিমাণ (টাকা)</w:t>
-            </w:r>
-          </w:p>
-        </w:tc>
-        <w:tc>
-          <w:tcPr>
-            <w:tcW w:type="dxa" w:w="1656"/>
-            <w:tcMar>
-              <w:top w:w="80" w:type="dxa"/>
-              <w:bottom w:w="80" w:type="dxa"/>
-              <w:left w:w="80" w:type="dxa"/>
-              <w:right w:w="80" w:type="dxa"/>
-            </w:tcMar>
-            <w:shd w:fill="0369A1"/>
-            <w:tcBorders>
-              <w:top w:val="single" w:sz="6" w:space="0" w:color="0369A1"/>
-              <w:bottom w:val="single" w:sz="6" w:space="0" w:color="0369A1"/>
-              <w:left w:val="single" w:sz="6" w:space="0" w:color="0369A1"/>
-              <w:right w:val="single" w:sz="6" w:space="0" w:color="0369A1"/>
-            </w:tcBorders>
-          </w:tcPr>
-          <w:p>
-            <w:pPr>
-              <w:spacing w:before="0" w:after="0"/>
-              <w:jc w:val="center"/>
-            </w:pPr>
-            <w:r>
-              <w:rPr>
-                <w:rFonts w:ascii="Segoe UI" w:hAnsi="Segoe UI" w:cs="Kalpurush"/>
-                <w:b/>
-                <w:i w:val="0"/>
-                <w:color w:val="FFFFFF"/>
-                <w:sz w:val="16"/>
-              </w:rPr>
-              <w:t>মন্তব্য / ভাউচার</w:t>
             </w:r>
           </w:p>
         </w:tc>
@@ -1023,12 +1008,12 @@
       <w:tr>
         <w:tc>
           <w:tcPr>
-            <w:tcW w:type="dxa" w:w="605"/>
+            <w:tcW w:type="dxa" w:w="648"/>
             <w:tcMar>
-              <w:top w:w="55" w:type="dxa"/>
-              <w:bottom w:w="55" w:type="dxa"/>
-              <w:left w:w="50" w:type="dxa"/>
-              <w:right w:w="50" w:type="dxa"/>
+              <w:top w:w="45" w:type="dxa"/>
+              <w:bottom w:w="45" w:type="dxa"/>
+              <w:left w:w="40" w:type="dxa"/>
+              <w:right w:w="40" w:type="dxa"/>
             </w:tcMar>
             <w:shd w:fill="FFFFFF"/>
             <w:tcBorders>
@@ -1049,7 +1034,7 @@
                 <w:b/>
                 <w:i w:val="0"/>
                 <w:color w:val="0369A1"/>
-                <w:sz w:val="15"/>
+                <w:sz w:val="16"/>
               </w:rPr>
               <w:t>১</w:t>
             </w:r>
@@ -1057,10 +1042,10 @@
         </w:tc>
         <w:tc>
           <w:tcPr>
-            <w:tcW w:type="dxa" w:w="6552"/>
+            <w:tcW w:type="dxa" w:w="7949"/>
             <w:tcMar>
-              <w:top w:w="55" w:type="dxa"/>
-              <w:bottom w:w="55" w:type="dxa"/>
+              <w:top w:w="45" w:type="dxa"/>
+              <w:bottom w:w="45" w:type="dxa"/>
               <w:left w:w="80" w:type="dxa"/>
               <w:right w:w="80" w:type="dxa"/>
             </w:tcMar>
@@ -1082,20 +1067,20 @@
                 <w:b w:val="0"/>
                 <w:i w:val="0"/>
                 <w:color w:val="1E293B"/>
-                <w:sz w:val="15"/>
+                <w:sz w:val="16"/>
               </w:rPr>
-              <w:t>UAE প্রাথমিক খরচ (বকশিশ, চা-নাস্তা, স্কেল / ওয়েব্রিজ ফি ও এডভান্স/AD সমন্বয়)</w:t>
+              <w:t>UAE প্রাথমিক খরচ (বকশিশ, চা-নাস্তা, স্কেল / রুম ভাড়া/খাওয়া:  AED=</w:t>
             </w:r>
           </w:p>
         </w:tc>
         <w:tc>
           <w:tcPr>
-            <w:tcW w:type="dxa" w:w="1800"/>
+            <w:tcW w:type="dxa" w:w="2016"/>
             <w:tcMar>
-              <w:top w:w="55" w:type="dxa"/>
-              <w:bottom w:w="55" w:type="dxa"/>
-              <w:left w:w="80" w:type="dxa"/>
-              <w:right w:w="80" w:type="dxa"/>
+              <w:top w:w="45" w:type="dxa"/>
+              <w:bottom w:w="45" w:type="dxa"/>
+              <w:left w:w="60" w:type="dxa"/>
+              <w:right w:w="60" w:type="dxa"/>
             </w:tcMar>
             <w:shd w:fill="FFFFFF"/>
             <w:tcBorders>
@@ -1115,44 +1100,9 @@
                 <w:rFonts w:ascii="Segoe UI" w:hAnsi="Segoe UI" w:cs="Kalpurush"/>
                 <w:b w:val="0"/>
                 <w:i w:val="0"/>
-                <w:color w:val="94A3B8"/>
-                <w:sz w:val="15"/>
+                <w:color w:val="1E293B"/>
+                <w:sz w:val="16"/>
               </w:rPr>
-              <w:t>..............................</w:t>
-            </w:r>
-          </w:p>
-        </w:tc>
-        <w:tc>
-          <w:tcPr>
-            <w:tcW w:type="dxa" w:w="1656"/>
-            <w:tcMar>
-              <w:top w:w="55" w:type="dxa"/>
-              <w:bottom w:w="55" w:type="dxa"/>
-              <w:left w:w="50" w:type="dxa"/>
-              <w:right w:w="50" w:type="dxa"/>
-            </w:tcMar>
-            <w:shd w:fill="FFFFFF"/>
-            <w:tcBorders>
-              <w:top w:val="single" w:sz="4" w:space="0" w:color="CBD5E1"/>
-              <w:bottom w:val="single" w:sz="4" w:space="0" w:color="CBD5E1"/>
-              <w:left w:val="single" w:sz="4" w:space="0" w:color="CBD5E1"/>
-              <w:right w:val="single" w:sz="4" w:space="0" w:color="CBD5E1"/>
-            </w:tcBorders>
-          </w:tcPr>
-          <w:p>
-            <w:pPr>
-              <w:spacing w:before="0" w:after="0"/>
-              <w:jc w:val="center"/>
-            </w:pPr>
-            <w:r>
-              <w:rPr>
-                <w:rFonts w:ascii="Segoe UI" w:hAnsi="Segoe UI" w:cs="Kalpurush"/>
-                <w:b w:val="0"/>
-                <w:i w:val="0"/>
-                <w:color w:val="94A3B8"/>
-                <w:sz w:val="15"/>
-              </w:rPr>
-              <w:t>......................</w:t>
             </w:r>
           </w:p>
         </w:tc>
@@ -1160,12 +1110,12 @@
       <w:tr>
         <w:tc>
           <w:tcPr>
-            <w:tcW w:type="dxa" w:w="605"/>
+            <w:tcW w:type="dxa" w:w="648"/>
             <w:tcMar>
-              <w:top w:w="55" w:type="dxa"/>
-              <w:bottom w:w="55" w:type="dxa"/>
-              <w:left w:w="50" w:type="dxa"/>
-              <w:right w:w="50" w:type="dxa"/>
+              <w:top w:w="45" w:type="dxa"/>
+              <w:bottom w:w="45" w:type="dxa"/>
+              <w:left w:w="40" w:type="dxa"/>
+              <w:right w:w="40" w:type="dxa"/>
             </w:tcMar>
             <w:shd w:fill="F8FAFC"/>
             <w:tcBorders>
@@ -1186,7 +1136,7 @@
                 <w:b/>
                 <w:i w:val="0"/>
                 <w:color w:val="0369A1"/>
-                <w:sz w:val="15"/>
+                <w:sz w:val="16"/>
               </w:rPr>
               <w:t>২</w:t>
             </w:r>
@@ -1194,10 +1144,10 @@
         </w:tc>
         <w:tc>
           <w:tcPr>
-            <w:tcW w:type="dxa" w:w="6552"/>
+            <w:tcW w:type="dxa" w:w="7949"/>
             <w:tcMar>
-              <w:top w:w="55" w:type="dxa"/>
-              <w:bottom w:w="55" w:type="dxa"/>
+              <w:top w:w="45" w:type="dxa"/>
+              <w:bottom w:w="45" w:type="dxa"/>
               <w:left w:w="80" w:type="dxa"/>
               <w:right w:w="80" w:type="dxa"/>
             </w:tcMar>
@@ -1219,20 +1169,20 @@
                 <w:b w:val="0"/>
                 <w:i w:val="0"/>
                 <w:color w:val="1E293B"/>
-                <w:sz w:val="15"/>
+                <w:sz w:val="16"/>
               </w:rPr>
-              <w:t>UAE লোডিং, শিপিং লাইন চার্জ, L/C কমিশন ও বৈদেশিক ব্যাংক পেমেন্ট</w:t>
+              <w:t>UAE লোডিং, শিপিং লাইন চার্জ, L/C কমিশন/ ঠেলা ফোর্ট</w:t>
             </w:r>
           </w:p>
         </w:tc>
         <w:tc>
           <w:tcPr>
-            <w:tcW w:type="dxa" w:w="1800"/>
+            <w:tcW w:type="dxa" w:w="2016"/>
             <w:tcMar>
-              <w:top w:w="55" w:type="dxa"/>
-              <w:bottom w:w="55" w:type="dxa"/>
-              <w:left w:w="80" w:type="dxa"/>
-              <w:right w:w="80" w:type="dxa"/>
+              <w:top w:w="45" w:type="dxa"/>
+              <w:bottom w:w="45" w:type="dxa"/>
+              <w:left w:w="60" w:type="dxa"/>
+              <w:right w:w="60" w:type="dxa"/>
             </w:tcMar>
             <w:shd w:fill="F8FAFC"/>
             <w:tcBorders>
@@ -1252,44 +1202,9 @@
                 <w:rFonts w:ascii="Segoe UI" w:hAnsi="Segoe UI" w:cs="Kalpurush"/>
                 <w:b w:val="0"/>
                 <w:i w:val="0"/>
-                <w:color w:val="94A3B8"/>
-                <w:sz w:val="15"/>
+                <w:color w:val="1E293B"/>
+                <w:sz w:val="16"/>
               </w:rPr>
-              <w:t>..............................</w:t>
-            </w:r>
-          </w:p>
-        </w:tc>
-        <w:tc>
-          <w:tcPr>
-            <w:tcW w:type="dxa" w:w="1656"/>
-            <w:tcMar>
-              <w:top w:w="55" w:type="dxa"/>
-              <w:bottom w:w="55" w:type="dxa"/>
-              <w:left w:w="50" w:type="dxa"/>
-              <w:right w:w="50" w:type="dxa"/>
-            </w:tcMar>
-            <w:shd w:fill="F8FAFC"/>
-            <w:tcBorders>
-              <w:top w:val="single" w:sz="4" w:space="0" w:color="CBD5E1"/>
-              <w:bottom w:val="single" w:sz="4" w:space="0" w:color="CBD5E1"/>
-              <w:left w:val="single" w:sz="4" w:space="0" w:color="CBD5E1"/>
-              <w:right w:val="single" w:sz="4" w:space="0" w:color="CBD5E1"/>
-            </w:tcBorders>
-          </w:tcPr>
-          <w:p>
-            <w:pPr>
-              <w:spacing w:before="0" w:after="0"/>
-              <w:jc w:val="center"/>
-            </w:pPr>
-            <w:r>
-              <w:rPr>
-                <w:rFonts w:ascii="Segoe UI" w:hAnsi="Segoe UI" w:cs="Kalpurush"/>
-                <w:b w:val="0"/>
-                <w:i w:val="0"/>
-                <w:color w:val="94A3B8"/>
-                <w:sz w:val="15"/>
-              </w:rPr>
-              <w:t>......................</w:t>
             </w:r>
           </w:p>
         </w:tc>
@@ -1297,12 +1212,12 @@
       <w:tr>
         <w:tc>
           <w:tcPr>
-            <w:tcW w:type="dxa" w:w="605"/>
+            <w:tcW w:type="dxa" w:w="648"/>
             <w:tcMar>
-              <w:top w:w="55" w:type="dxa"/>
-              <w:bottom w:w="55" w:type="dxa"/>
-              <w:left w:w="50" w:type="dxa"/>
-              <w:right w:w="50" w:type="dxa"/>
+              <w:top w:w="45" w:type="dxa"/>
+              <w:bottom w:w="45" w:type="dxa"/>
+              <w:left w:w="40" w:type="dxa"/>
+              <w:right w:w="40" w:type="dxa"/>
             </w:tcMar>
             <w:shd w:fill="FFFFFF"/>
             <w:tcBorders>
@@ -1323,7 +1238,7 @@
                 <w:b/>
                 <w:i w:val="0"/>
                 <w:color w:val="0369A1"/>
-                <w:sz w:val="15"/>
+                <w:sz w:val="16"/>
               </w:rPr>
               <w:t>৩</w:t>
             </w:r>
@@ -1331,10 +1246,10 @@
         </w:tc>
         <w:tc>
           <w:tcPr>
-            <w:tcW w:type="dxa" w:w="6552"/>
+            <w:tcW w:type="dxa" w:w="7949"/>
             <w:tcMar>
-              <w:top w:w="55" w:type="dxa"/>
-              <w:bottom w:w="55" w:type="dxa"/>
+              <w:top w:w="45" w:type="dxa"/>
+              <w:bottom w:w="45" w:type="dxa"/>
               <w:left w:w="80" w:type="dxa"/>
               <w:right w:w="80" w:type="dxa"/>
             </w:tcMar>
@@ -1356,20 +1271,20 @@
                 <w:b w:val="0"/>
                 <w:i w:val="0"/>
                 <w:color w:val="1E293B"/>
-                <w:sz w:val="15"/>
+                <w:sz w:val="16"/>
               </w:rPr>
-              <w:t>ব্যাংক চার্জ ও মার্জিন (ইসলামী ব্যাংক L/C মার্জিন / আরিয়ান বা অন্যান্য ফি)</w:t>
+              <w:t>ইসলামী ব্যাংক L/C (আরিয়ান বা অন্যান্য)</w:t>
             </w:r>
           </w:p>
         </w:tc>
         <w:tc>
           <w:tcPr>
-            <w:tcW w:type="dxa" w:w="1800"/>
+            <w:tcW w:type="dxa" w:w="2016"/>
             <w:tcMar>
-              <w:top w:w="55" w:type="dxa"/>
-              <w:bottom w:w="55" w:type="dxa"/>
-              <w:left w:w="80" w:type="dxa"/>
-              <w:right w:w="80" w:type="dxa"/>
+              <w:top w:w="45" w:type="dxa"/>
+              <w:bottom w:w="45" w:type="dxa"/>
+              <w:left w:w="60" w:type="dxa"/>
+              <w:right w:w="60" w:type="dxa"/>
             </w:tcMar>
             <w:shd w:fill="FFFFFF"/>
             <w:tcBorders>
@@ -1389,44 +1304,9 @@
                 <w:rFonts w:ascii="Segoe UI" w:hAnsi="Segoe UI" w:cs="Kalpurush"/>
                 <w:b w:val="0"/>
                 <w:i w:val="0"/>
-                <w:color w:val="94A3B8"/>
-                <w:sz w:val="15"/>
+                <w:color w:val="1E293B"/>
+                <w:sz w:val="16"/>
               </w:rPr>
-              <w:t>..............................</w:t>
-            </w:r>
-          </w:p>
-        </w:tc>
-        <w:tc>
-          <w:tcPr>
-            <w:tcW w:type="dxa" w:w="1656"/>
-            <w:tcMar>
-              <w:top w:w="55" w:type="dxa"/>
-              <w:bottom w:w="55" w:type="dxa"/>
-              <w:left w:w="50" w:type="dxa"/>
-              <w:right w:w="50" w:type="dxa"/>
-            </w:tcMar>
-            <w:shd w:fill="FFFFFF"/>
-            <w:tcBorders>
-              <w:top w:val="single" w:sz="4" w:space="0" w:color="CBD5E1"/>
-              <w:bottom w:val="single" w:sz="4" w:space="0" w:color="CBD5E1"/>
-              <w:left w:val="single" w:sz="4" w:space="0" w:color="CBD5E1"/>
-              <w:right w:val="single" w:sz="4" w:space="0" w:color="CBD5E1"/>
-            </w:tcBorders>
-          </w:tcPr>
-          <w:p>
-            <w:pPr>
-              <w:spacing w:before="0" w:after="0"/>
-              <w:jc w:val="center"/>
-            </w:pPr>
-            <w:r>
-              <w:rPr>
-                <w:rFonts w:ascii="Segoe UI" w:hAnsi="Segoe UI" w:cs="Kalpurush"/>
-                <w:b w:val="0"/>
-                <w:i w:val="0"/>
-                <w:color w:val="94A3B8"/>
-                <w:sz w:val="15"/>
-              </w:rPr>
-              <w:t>......................</w:t>
             </w:r>
           </w:p>
         </w:tc>
@@ -1434,12 +1314,12 @@
       <w:tr>
         <w:tc>
           <w:tcPr>
-            <w:tcW w:type="dxa" w:w="605"/>
+            <w:tcW w:type="dxa" w:w="648"/>
             <w:tcMar>
-              <w:top w:w="55" w:type="dxa"/>
-              <w:bottom w:w="55" w:type="dxa"/>
-              <w:left w:w="50" w:type="dxa"/>
-              <w:right w:w="50" w:type="dxa"/>
+              <w:top w:w="45" w:type="dxa"/>
+              <w:bottom w:w="45" w:type="dxa"/>
+              <w:left w:w="40" w:type="dxa"/>
+              <w:right w:w="40" w:type="dxa"/>
             </w:tcMar>
             <w:shd w:fill="F8FAFC"/>
             <w:tcBorders>
@@ -1460,7 +1340,7 @@
                 <w:b/>
                 <w:i w:val="0"/>
                 <w:color w:val="0369A1"/>
-                <w:sz w:val="15"/>
+                <w:sz w:val="16"/>
               </w:rPr>
               <w:t>৪</w:t>
             </w:r>
@@ -1468,10 +1348,10 @@
         </w:tc>
         <w:tc>
           <w:tcPr>
-            <w:tcW w:type="dxa" w:w="6552"/>
+            <w:tcW w:type="dxa" w:w="7949"/>
             <w:tcMar>
-              <w:top w:w="55" w:type="dxa"/>
-              <w:bottom w:w="55" w:type="dxa"/>
+              <w:top w:w="45" w:type="dxa"/>
+              <w:bottom w:w="45" w:type="dxa"/>
               <w:left w:w="80" w:type="dxa"/>
               <w:right w:w="80" w:type="dxa"/>
             </w:tcMar>
@@ -1493,20 +1373,20 @@
                 <w:b w:val="0"/>
                 <w:i w:val="0"/>
                 <w:color w:val="1E293B"/>
-                <w:sz w:val="15"/>
+                <w:sz w:val="16"/>
               </w:rPr>
-              <w:t>কাস্টমস ক্লিয়ারেন্স সার্টিফিকেট ফি (খালেক বা নাসির এজেন্ট)</w:t>
+              <w:t xml:space="preserve">কাস্টমস ক্লিয়ারেন্স সার্টিফিকেট ফি </w:t>
             </w:r>
           </w:p>
         </w:tc>
         <w:tc>
           <w:tcPr>
-            <w:tcW w:type="dxa" w:w="1800"/>
+            <w:tcW w:type="dxa" w:w="2016"/>
             <w:tcMar>
-              <w:top w:w="55" w:type="dxa"/>
-              <w:bottom w:w="55" w:type="dxa"/>
-              <w:left w:w="80" w:type="dxa"/>
-              <w:right w:w="80" w:type="dxa"/>
+              <w:top w:w="45" w:type="dxa"/>
+              <w:bottom w:w="45" w:type="dxa"/>
+              <w:left w:w="60" w:type="dxa"/>
+              <w:right w:w="60" w:type="dxa"/>
             </w:tcMar>
             <w:shd w:fill="F8FAFC"/>
             <w:tcBorders>
@@ -1526,44 +1406,9 @@
                 <w:rFonts w:ascii="Segoe UI" w:hAnsi="Segoe UI" w:cs="Kalpurush"/>
                 <w:b w:val="0"/>
                 <w:i w:val="0"/>
-                <w:color w:val="94A3B8"/>
-                <w:sz w:val="15"/>
+                <w:color w:val="1E293B"/>
+                <w:sz w:val="16"/>
               </w:rPr>
-              <w:t>..............................</w:t>
-            </w:r>
-          </w:p>
-        </w:tc>
-        <w:tc>
-          <w:tcPr>
-            <w:tcW w:type="dxa" w:w="1656"/>
-            <w:tcMar>
-              <w:top w:w="55" w:type="dxa"/>
-              <w:bottom w:w="55" w:type="dxa"/>
-              <w:left w:w="50" w:type="dxa"/>
-              <w:right w:w="50" w:type="dxa"/>
-            </w:tcMar>
-            <w:shd w:fill="F8FAFC"/>
-            <w:tcBorders>
-              <w:top w:val="single" w:sz="4" w:space="0" w:color="CBD5E1"/>
-              <w:bottom w:val="single" w:sz="4" w:space="0" w:color="CBD5E1"/>
-              <w:left w:val="single" w:sz="4" w:space="0" w:color="CBD5E1"/>
-              <w:right w:val="single" w:sz="4" w:space="0" w:color="CBD5E1"/>
-            </w:tcBorders>
-          </w:tcPr>
-          <w:p>
-            <w:pPr>
-              <w:spacing w:before="0" w:after="0"/>
-              <w:jc w:val="center"/>
-            </w:pPr>
-            <w:r>
-              <w:rPr>
-                <w:rFonts w:ascii="Segoe UI" w:hAnsi="Segoe UI" w:cs="Kalpurush"/>
-                <w:b w:val="0"/>
-                <w:i w:val="0"/>
-                <w:color w:val="94A3B8"/>
-                <w:sz w:val="15"/>
-              </w:rPr>
-              <w:t>......................</w:t>
             </w:r>
           </w:p>
         </w:tc>
@@ -1571,12 +1416,12 @@
       <w:tr>
         <w:tc>
           <w:tcPr>
-            <w:tcW w:type="dxa" w:w="605"/>
+            <w:tcW w:type="dxa" w:w="648"/>
             <w:tcMar>
-              <w:top w:w="55" w:type="dxa"/>
-              <w:bottom w:w="55" w:type="dxa"/>
-              <w:left w:w="50" w:type="dxa"/>
-              <w:right w:w="50" w:type="dxa"/>
+              <w:top w:w="45" w:type="dxa"/>
+              <w:bottom w:w="45" w:type="dxa"/>
+              <w:left w:w="40" w:type="dxa"/>
+              <w:right w:w="40" w:type="dxa"/>
             </w:tcMar>
             <w:shd w:fill="FFFFFF"/>
             <w:tcBorders>
@@ -1597,7 +1442,7 @@
                 <w:b/>
                 <w:i w:val="0"/>
                 <w:color w:val="0369A1"/>
-                <w:sz w:val="15"/>
+                <w:sz w:val="16"/>
               </w:rPr>
               <w:t>৫</w:t>
             </w:r>
@@ -1605,10 +1450,10 @@
         </w:tc>
         <w:tc>
           <w:tcPr>
-            <w:tcW w:type="dxa" w:w="6552"/>
+            <w:tcW w:type="dxa" w:w="7949"/>
             <w:tcMar>
-              <w:top w:w="55" w:type="dxa"/>
-              <w:bottom w:w="55" w:type="dxa"/>
+              <w:top w:w="45" w:type="dxa"/>
+              <w:bottom w:w="45" w:type="dxa"/>
               <w:left w:w="80" w:type="dxa"/>
               <w:right w:w="80" w:type="dxa"/>
             </w:tcMar>
@@ -1630,20 +1475,20 @@
                 <w:b w:val="0"/>
                 <w:i w:val="0"/>
                 <w:color w:val="1E293B"/>
-                <w:sz w:val="15"/>
+                <w:sz w:val="16"/>
               </w:rPr>
-              <w:t>পোর্ট ইয়ার্ড কন্টেইনার মুভমেন্ট / ঠেলা ও গেট পারমিশন চার্জ</w:t>
+              <w:t>কন্টেইনার ঠেলা ও গেট পারমিশন চার্জ</w:t>
             </w:r>
           </w:p>
         </w:tc>
         <w:tc>
           <w:tcPr>
-            <w:tcW w:type="dxa" w:w="1800"/>
+            <w:tcW w:type="dxa" w:w="2016"/>
             <w:tcMar>
-              <w:top w:w="55" w:type="dxa"/>
-              <w:bottom w:w="55" w:type="dxa"/>
-              <w:left w:w="80" w:type="dxa"/>
-              <w:right w:w="80" w:type="dxa"/>
+              <w:top w:w="45" w:type="dxa"/>
+              <w:bottom w:w="45" w:type="dxa"/>
+              <w:left w:w="60" w:type="dxa"/>
+              <w:right w:w="60" w:type="dxa"/>
             </w:tcMar>
             <w:shd w:fill="FFFFFF"/>
             <w:tcBorders>
@@ -1663,44 +1508,9 @@
                 <w:rFonts w:ascii="Segoe UI" w:hAnsi="Segoe UI" w:cs="Kalpurush"/>
                 <w:b w:val="0"/>
                 <w:i w:val="0"/>
-                <w:color w:val="94A3B8"/>
-                <w:sz w:val="15"/>
+                <w:color w:val="1E293B"/>
+                <w:sz w:val="16"/>
               </w:rPr>
-              <w:t>..............................</w:t>
-            </w:r>
-          </w:p>
-        </w:tc>
-        <w:tc>
-          <w:tcPr>
-            <w:tcW w:type="dxa" w:w="1656"/>
-            <w:tcMar>
-              <w:top w:w="55" w:type="dxa"/>
-              <w:bottom w:w="55" w:type="dxa"/>
-              <w:left w:w="50" w:type="dxa"/>
-              <w:right w:w="50" w:type="dxa"/>
-            </w:tcMar>
-            <w:shd w:fill="FFFFFF"/>
-            <w:tcBorders>
-              <w:top w:val="single" w:sz="4" w:space="0" w:color="CBD5E1"/>
-              <w:bottom w:val="single" w:sz="4" w:space="0" w:color="CBD5E1"/>
-              <w:left w:val="single" w:sz="4" w:space="0" w:color="CBD5E1"/>
-              <w:right w:val="single" w:sz="4" w:space="0" w:color="CBD5E1"/>
-            </w:tcBorders>
-          </w:tcPr>
-          <w:p>
-            <w:pPr>
-              <w:spacing w:before="0" w:after="0"/>
-              <w:jc w:val="center"/>
-            </w:pPr>
-            <w:r>
-              <w:rPr>
-                <w:rFonts w:ascii="Segoe UI" w:hAnsi="Segoe UI" w:cs="Kalpurush"/>
-                <w:b w:val="0"/>
-                <w:i w:val="0"/>
-                <w:color w:val="94A3B8"/>
-                <w:sz w:val="15"/>
-              </w:rPr>
-              <w:t>......................</w:t>
             </w:r>
           </w:p>
         </w:tc>
@@ -1708,12 +1518,12 @@
       <w:tr>
         <w:tc>
           <w:tcPr>
-            <w:tcW w:type="dxa" w:w="605"/>
+            <w:tcW w:type="dxa" w:w="648"/>
             <w:tcMar>
-              <w:top w:w="55" w:type="dxa"/>
-              <w:bottom w:w="55" w:type="dxa"/>
-              <w:left w:w="50" w:type="dxa"/>
-              <w:right w:w="50" w:type="dxa"/>
+              <w:top w:w="45" w:type="dxa"/>
+              <w:bottom w:w="45" w:type="dxa"/>
+              <w:left w:w="40" w:type="dxa"/>
+              <w:right w:w="40" w:type="dxa"/>
             </w:tcMar>
             <w:shd w:fill="F8FAFC"/>
             <w:tcBorders>
@@ -1734,7 +1544,7 @@
                 <w:b/>
                 <w:i w:val="0"/>
                 <w:color w:val="0369A1"/>
-                <w:sz w:val="15"/>
+                <w:sz w:val="16"/>
               </w:rPr>
               <w:t>৬</w:t>
             </w:r>
@@ -1742,10 +1552,10 @@
         </w:tc>
         <w:tc>
           <w:tcPr>
-            <w:tcW w:type="dxa" w:w="6552"/>
+            <w:tcW w:type="dxa" w:w="7949"/>
             <w:tcMar>
-              <w:top w:w="55" w:type="dxa"/>
-              <w:bottom w:w="55" w:type="dxa"/>
+              <w:top w:w="45" w:type="dxa"/>
+              <w:bottom w:w="45" w:type="dxa"/>
               <w:left w:w="80" w:type="dxa"/>
               <w:right w:w="80" w:type="dxa"/>
             </w:tcMar>
@@ -1767,20 +1577,20 @@
                 <w:b w:val="0"/>
                 <w:i w:val="0"/>
                 <w:color w:val="1E293B"/>
-                <w:sz w:val="15"/>
+                <w:sz w:val="16"/>
               </w:rPr>
-              <w:t>কাস্টমস পরীক্ষণ (Customs Examination) ও ঢাকা যাতায়াত খরচ</w:t>
+              <w:t>কাস্টমস পরীক্ষণ ও ঢাকা যাতায়াত খরচ</w:t>
             </w:r>
           </w:p>
         </w:tc>
         <w:tc>
           <w:tcPr>
-            <w:tcW w:type="dxa" w:w="1800"/>
+            <w:tcW w:type="dxa" w:w="2016"/>
             <w:tcMar>
-              <w:top w:w="55" w:type="dxa"/>
-              <w:bottom w:w="55" w:type="dxa"/>
-              <w:left w:w="80" w:type="dxa"/>
-              <w:right w:w="80" w:type="dxa"/>
+              <w:top w:w="45" w:type="dxa"/>
+              <w:bottom w:w="45" w:type="dxa"/>
+              <w:left w:w="60" w:type="dxa"/>
+              <w:right w:w="60" w:type="dxa"/>
             </w:tcMar>
             <w:shd w:fill="F8FAFC"/>
             <w:tcBorders>
@@ -1800,44 +1610,9 @@
                 <w:rFonts w:ascii="Segoe UI" w:hAnsi="Segoe UI" w:cs="Kalpurush"/>
                 <w:b w:val="0"/>
                 <w:i w:val="0"/>
-                <w:color w:val="94A3B8"/>
-                <w:sz w:val="15"/>
+                <w:color w:val="1E293B"/>
+                <w:sz w:val="16"/>
               </w:rPr>
-              <w:t>..............................</w:t>
-            </w:r>
-          </w:p>
-        </w:tc>
-        <w:tc>
-          <w:tcPr>
-            <w:tcW w:type="dxa" w:w="1656"/>
-            <w:tcMar>
-              <w:top w:w="55" w:type="dxa"/>
-              <w:bottom w:w="55" w:type="dxa"/>
-              <w:left w:w="50" w:type="dxa"/>
-              <w:right w:w="50" w:type="dxa"/>
-            </w:tcMar>
-            <w:shd w:fill="F8FAFC"/>
-            <w:tcBorders>
-              <w:top w:val="single" w:sz="4" w:space="0" w:color="CBD5E1"/>
-              <w:bottom w:val="single" w:sz="4" w:space="0" w:color="CBD5E1"/>
-              <w:left w:val="single" w:sz="4" w:space="0" w:color="CBD5E1"/>
-              <w:right w:val="single" w:sz="4" w:space="0" w:color="CBD5E1"/>
-            </w:tcBorders>
-          </w:tcPr>
-          <w:p>
-            <w:pPr>
-              <w:spacing w:before="0" w:after="0"/>
-              <w:jc w:val="center"/>
-            </w:pPr>
-            <w:r>
-              <w:rPr>
-                <w:rFonts w:ascii="Segoe UI" w:hAnsi="Segoe UI" w:cs="Kalpurush"/>
-                <w:b w:val="0"/>
-                <w:i w:val="0"/>
-                <w:color w:val="94A3B8"/>
-                <w:sz w:val="15"/>
-              </w:rPr>
-              <w:t>......................</w:t>
             </w:r>
           </w:p>
         </w:tc>
@@ -1845,12 +1620,12 @@
       <w:tr>
         <w:tc>
           <w:tcPr>
-            <w:tcW w:type="dxa" w:w="605"/>
+            <w:tcW w:type="dxa" w:w="648"/>
             <w:tcMar>
-              <w:top w:w="55" w:type="dxa"/>
-              <w:bottom w:w="55" w:type="dxa"/>
-              <w:left w:w="50" w:type="dxa"/>
-              <w:right w:w="50" w:type="dxa"/>
+              <w:top w:w="45" w:type="dxa"/>
+              <w:bottom w:w="45" w:type="dxa"/>
+              <w:left w:w="40" w:type="dxa"/>
+              <w:right w:w="40" w:type="dxa"/>
             </w:tcMar>
             <w:shd w:fill="FFFFFF"/>
             <w:tcBorders>
@@ -1871,7 +1646,7 @@
                 <w:b/>
                 <w:i w:val="0"/>
                 <w:color w:val="0369A1"/>
-                <w:sz w:val="15"/>
+                <w:sz w:val="16"/>
               </w:rPr>
               <w:t>৭</w:t>
             </w:r>
@@ -1879,10 +1654,10 @@
         </w:tc>
         <w:tc>
           <w:tcPr>
-            <w:tcW w:type="dxa" w:w="6552"/>
+            <w:tcW w:type="dxa" w:w="7949"/>
             <w:tcMar>
-              <w:top w:w="55" w:type="dxa"/>
-              <w:bottom w:w="55" w:type="dxa"/>
+              <w:top w:w="45" w:type="dxa"/>
+              <w:bottom w:w="45" w:type="dxa"/>
               <w:left w:w="80" w:type="dxa"/>
               <w:right w:w="80" w:type="dxa"/>
             </w:tcMar>
@@ -1904,20 +1679,20 @@
                 <w:b w:val="0"/>
                 <w:i w:val="0"/>
                 <w:color w:val="1E293B"/>
-                <w:sz w:val="15"/>
+                <w:sz w:val="16"/>
               </w:rPr>
-              <w:t>গোডাউন যাতায়াত ও খালাস তদারকি চা-নাস্তা খরচ</w:t>
+              <w:t>গোডাউন যাতায়াত ও চা-নাস্তা খরচ</w:t>
             </w:r>
           </w:p>
         </w:tc>
         <w:tc>
           <w:tcPr>
-            <w:tcW w:type="dxa" w:w="1800"/>
+            <w:tcW w:type="dxa" w:w="2016"/>
             <w:tcMar>
-              <w:top w:w="55" w:type="dxa"/>
-              <w:bottom w:w="55" w:type="dxa"/>
-              <w:left w:w="80" w:type="dxa"/>
-              <w:right w:w="80" w:type="dxa"/>
+              <w:top w:w="45" w:type="dxa"/>
+              <w:bottom w:w="45" w:type="dxa"/>
+              <w:left w:w="60" w:type="dxa"/>
+              <w:right w:w="60" w:type="dxa"/>
             </w:tcMar>
             <w:shd w:fill="FFFFFF"/>
             <w:tcBorders>
@@ -1937,44 +1712,9 @@
                 <w:rFonts w:ascii="Segoe UI" w:hAnsi="Segoe UI" w:cs="Kalpurush"/>
                 <w:b w:val="0"/>
                 <w:i w:val="0"/>
-                <w:color w:val="94A3B8"/>
-                <w:sz w:val="15"/>
+                <w:color w:val="1E293B"/>
+                <w:sz w:val="16"/>
               </w:rPr>
-              <w:t>..............................</w:t>
-            </w:r>
-          </w:p>
-        </w:tc>
-        <w:tc>
-          <w:tcPr>
-            <w:tcW w:type="dxa" w:w="1656"/>
-            <w:tcMar>
-              <w:top w:w="55" w:type="dxa"/>
-              <w:bottom w:w="55" w:type="dxa"/>
-              <w:left w:w="50" w:type="dxa"/>
-              <w:right w:w="50" w:type="dxa"/>
-            </w:tcMar>
-            <w:shd w:fill="FFFFFF"/>
-            <w:tcBorders>
-              <w:top w:val="single" w:sz="4" w:space="0" w:color="CBD5E1"/>
-              <w:bottom w:val="single" w:sz="4" w:space="0" w:color="CBD5E1"/>
-              <w:left w:val="single" w:sz="4" w:space="0" w:color="CBD5E1"/>
-              <w:right w:val="single" w:sz="4" w:space="0" w:color="CBD5E1"/>
-            </w:tcBorders>
-          </w:tcPr>
-          <w:p>
-            <w:pPr>
-              <w:spacing w:before="0" w:after="0"/>
-              <w:jc w:val="center"/>
-            </w:pPr>
-            <w:r>
-              <w:rPr>
-                <w:rFonts w:ascii="Segoe UI" w:hAnsi="Segoe UI" w:cs="Kalpurush"/>
-                <w:b w:val="0"/>
-                <w:i w:val="0"/>
-                <w:color w:val="94A3B8"/>
-                <w:sz w:val="15"/>
-              </w:rPr>
-              <w:t>......................</w:t>
             </w:r>
           </w:p>
         </w:tc>
@@ -1982,12 +1722,12 @@
       <w:tr>
         <w:tc>
           <w:tcPr>
-            <w:tcW w:type="dxa" w:w="605"/>
+            <w:tcW w:type="dxa" w:w="648"/>
             <w:tcMar>
-              <w:top w:w="55" w:type="dxa"/>
-              <w:bottom w:w="55" w:type="dxa"/>
-              <w:left w:w="50" w:type="dxa"/>
-              <w:right w:w="50" w:type="dxa"/>
+              <w:top w:w="45" w:type="dxa"/>
+              <w:bottom w:w="45" w:type="dxa"/>
+              <w:left w:w="40" w:type="dxa"/>
+              <w:right w:w="40" w:type="dxa"/>
             </w:tcMar>
             <w:shd w:fill="F8FAFC"/>
             <w:tcBorders>
@@ -2008,7 +1748,7 @@
                 <w:b/>
                 <w:i w:val="0"/>
                 <w:color w:val="0369A1"/>
-                <w:sz w:val="15"/>
+                <w:sz w:val="16"/>
               </w:rPr>
               <w:t>৮</w:t>
             </w:r>
@@ -2016,10 +1756,10 @@
         </w:tc>
         <w:tc>
           <w:tcPr>
-            <w:tcW w:type="dxa" w:w="6552"/>
+            <w:tcW w:type="dxa" w:w="7949"/>
             <w:tcMar>
-              <w:top w:w="55" w:type="dxa"/>
-              <w:bottom w:w="55" w:type="dxa"/>
+              <w:top w:w="45" w:type="dxa"/>
+              <w:bottom w:w="45" w:type="dxa"/>
               <w:left w:w="80" w:type="dxa"/>
               <w:right w:w="80" w:type="dxa"/>
             </w:tcMar>
@@ -2041,20 +1781,20 @@
                 <w:b w:val="0"/>
                 <w:i w:val="0"/>
                 <w:color w:val="1E293B"/>
-                <w:sz w:val="15"/>
+                <w:sz w:val="16"/>
               </w:rPr>
-              <w:t>লোকাল পরিবহন কাভার্ড ভ্যান ভাড়া, খালাস লেবার ও ক্রেন চার্জ</w:t>
+              <w:t>কাভার্ড ভ্যান ভাড়া, লেবার ও ক্রেন চার্জ</w:t>
             </w:r>
           </w:p>
         </w:tc>
         <w:tc>
           <w:tcPr>
-            <w:tcW w:type="dxa" w:w="1800"/>
+            <w:tcW w:type="dxa" w:w="2016"/>
             <w:tcMar>
-              <w:top w:w="55" w:type="dxa"/>
-              <w:bottom w:w="55" w:type="dxa"/>
-              <w:left w:w="80" w:type="dxa"/>
-              <w:right w:w="80" w:type="dxa"/>
+              <w:top w:w="45" w:type="dxa"/>
+              <w:bottom w:w="45" w:type="dxa"/>
+              <w:left w:w="60" w:type="dxa"/>
+              <w:right w:w="60" w:type="dxa"/>
             </w:tcMar>
             <w:shd w:fill="F8FAFC"/>
             <w:tcBorders>
@@ -2074,44 +1814,9 @@
                 <w:rFonts w:ascii="Segoe UI" w:hAnsi="Segoe UI" w:cs="Kalpurush"/>
                 <w:b w:val="0"/>
                 <w:i w:val="0"/>
-                <w:color w:val="94A3B8"/>
-                <w:sz w:val="15"/>
+                <w:color w:val="1E293B"/>
+                <w:sz w:val="16"/>
               </w:rPr>
-              <w:t>..............................</w:t>
-            </w:r>
-          </w:p>
-        </w:tc>
-        <w:tc>
-          <w:tcPr>
-            <w:tcW w:type="dxa" w:w="1656"/>
-            <w:tcMar>
-              <w:top w:w="55" w:type="dxa"/>
-              <w:bottom w:w="55" w:type="dxa"/>
-              <w:left w:w="50" w:type="dxa"/>
-              <w:right w:w="50" w:type="dxa"/>
-            </w:tcMar>
-            <w:shd w:fill="F8FAFC"/>
-            <w:tcBorders>
-              <w:top w:val="single" w:sz="4" w:space="0" w:color="CBD5E1"/>
-              <w:bottom w:val="single" w:sz="4" w:space="0" w:color="CBD5E1"/>
-              <w:left w:val="single" w:sz="4" w:space="0" w:color="CBD5E1"/>
-              <w:right w:val="single" w:sz="4" w:space="0" w:color="CBD5E1"/>
-            </w:tcBorders>
-          </w:tcPr>
-          <w:p>
-            <w:pPr>
-              <w:spacing w:before="0" w:after="0"/>
-              <w:jc w:val="center"/>
-            </w:pPr>
-            <w:r>
-              <w:rPr>
-                <w:rFonts w:ascii="Segoe UI" w:hAnsi="Segoe UI" w:cs="Kalpurush"/>
-                <w:b w:val="0"/>
-                <w:i w:val="0"/>
-                <w:color w:val="94A3B8"/>
-                <w:sz w:val="15"/>
-              </w:rPr>
-              <w:t>......................</w:t>
             </w:r>
           </w:p>
         </w:tc>
@@ -2119,12 +1824,12 @@
       <w:tr>
         <w:tc>
           <w:tcPr>
-            <w:tcW w:type="dxa" w:w="605"/>
+            <w:tcW w:type="dxa" w:w="648"/>
             <w:tcMar>
-              <w:top w:w="55" w:type="dxa"/>
-              <w:bottom w:w="55" w:type="dxa"/>
-              <w:left w:w="50" w:type="dxa"/>
-              <w:right w:w="50" w:type="dxa"/>
+              <w:top w:w="45" w:type="dxa"/>
+              <w:bottom w:w="45" w:type="dxa"/>
+              <w:left w:w="40" w:type="dxa"/>
+              <w:right w:w="40" w:type="dxa"/>
             </w:tcMar>
             <w:shd w:fill="FFFFFF"/>
             <w:tcBorders>
@@ -2145,7 +1850,7 @@
                 <w:b/>
                 <w:i w:val="0"/>
                 <w:color w:val="0369A1"/>
-                <w:sz w:val="15"/>
+                <w:sz w:val="16"/>
               </w:rPr>
               <w:t>৯</w:t>
             </w:r>
@@ -2153,10 +1858,10 @@
         </w:tc>
         <w:tc>
           <w:tcPr>
-            <w:tcW w:type="dxa" w:w="6552"/>
+            <w:tcW w:type="dxa" w:w="7949"/>
             <w:tcMar>
-              <w:top w:w="55" w:type="dxa"/>
-              <w:bottom w:w="55" w:type="dxa"/>
+              <w:top w:w="45" w:type="dxa"/>
+              <w:bottom w:w="45" w:type="dxa"/>
               <w:left w:w="80" w:type="dxa"/>
               <w:right w:w="80" w:type="dxa"/>
             </w:tcMar>
@@ -2178,20 +1883,20 @@
                 <w:b w:val="0"/>
                 <w:i w:val="0"/>
                 <w:color w:val="1E293B"/>
-                <w:sz w:val="15"/>
+                <w:sz w:val="16"/>
               </w:rPr>
-              <w:t>অস্থায়ী গোডাউন ভাড়া (আম্বিয়া আনিস + জাহেদ আনিস স্পেস বাবদ)</w:t>
+              <w:t>গোডাউন ভাড়া (জাবেদ আলি + জাহিদ আলি) বাবদ খরচ</w:t>
             </w:r>
           </w:p>
         </w:tc>
         <w:tc>
           <w:tcPr>
-            <w:tcW w:type="dxa" w:w="1800"/>
+            <w:tcW w:type="dxa" w:w="2016"/>
             <w:tcMar>
-              <w:top w:w="55" w:type="dxa"/>
-              <w:bottom w:w="55" w:type="dxa"/>
-              <w:left w:w="80" w:type="dxa"/>
-              <w:right w:w="80" w:type="dxa"/>
+              <w:top w:w="45" w:type="dxa"/>
+              <w:bottom w:w="45" w:type="dxa"/>
+              <w:left w:w="60" w:type="dxa"/>
+              <w:right w:w="60" w:type="dxa"/>
             </w:tcMar>
             <w:shd w:fill="FFFFFF"/>
             <w:tcBorders>
@@ -2211,44 +1916,9 @@
                 <w:rFonts w:ascii="Segoe UI" w:hAnsi="Segoe UI" w:cs="Kalpurush"/>
                 <w:b w:val="0"/>
                 <w:i w:val="0"/>
-                <w:color w:val="94A3B8"/>
-                <w:sz w:val="15"/>
+                <w:color w:val="1E293B"/>
+                <w:sz w:val="16"/>
               </w:rPr>
-              <w:t>..............................</w:t>
-            </w:r>
-          </w:p>
-        </w:tc>
-        <w:tc>
-          <w:tcPr>
-            <w:tcW w:type="dxa" w:w="1656"/>
-            <w:tcMar>
-              <w:top w:w="55" w:type="dxa"/>
-              <w:bottom w:w="55" w:type="dxa"/>
-              <w:left w:w="50" w:type="dxa"/>
-              <w:right w:w="50" w:type="dxa"/>
-            </w:tcMar>
-            <w:shd w:fill="FFFFFF"/>
-            <w:tcBorders>
-              <w:top w:val="single" w:sz="4" w:space="0" w:color="CBD5E1"/>
-              <w:bottom w:val="single" w:sz="4" w:space="0" w:color="CBD5E1"/>
-              <w:left w:val="single" w:sz="4" w:space="0" w:color="CBD5E1"/>
-              <w:right w:val="single" w:sz="4" w:space="0" w:color="CBD5E1"/>
-            </w:tcBorders>
-          </w:tcPr>
-          <w:p>
-            <w:pPr>
-              <w:spacing w:before="0" w:after="0"/>
-              <w:jc w:val="center"/>
-            </w:pPr>
-            <w:r>
-              <w:rPr>
-                <w:rFonts w:ascii="Segoe UI" w:hAnsi="Segoe UI" w:cs="Kalpurush"/>
-                <w:b w:val="0"/>
-                <w:i w:val="0"/>
-                <w:color w:val="94A3B8"/>
-                <w:sz w:val="15"/>
-              </w:rPr>
-              <w:t>......................</w:t>
             </w:r>
           </w:p>
         </w:tc>
@@ -2256,12 +1926,12 @@
       <w:tr>
         <w:tc>
           <w:tcPr>
-            <w:tcW w:type="dxa" w:w="605"/>
+            <w:tcW w:type="dxa" w:w="648"/>
             <w:tcMar>
-              <w:top w:w="55" w:type="dxa"/>
-              <w:bottom w:w="55" w:type="dxa"/>
-              <w:left w:w="50" w:type="dxa"/>
-              <w:right w:w="50" w:type="dxa"/>
+              <w:top w:w="45" w:type="dxa"/>
+              <w:bottom w:w="45" w:type="dxa"/>
+              <w:left w:w="40" w:type="dxa"/>
+              <w:right w:w="40" w:type="dxa"/>
             </w:tcMar>
             <w:shd w:fill="F8FAFC"/>
             <w:tcBorders>
@@ -2282,7 +1952,7 @@
                 <w:b/>
                 <w:i w:val="0"/>
                 <w:color w:val="0369A1"/>
-                <w:sz w:val="15"/>
+                <w:sz w:val="16"/>
               </w:rPr>
               <w:t>১০</w:t>
             </w:r>
@@ -2290,10 +1960,10 @@
         </w:tc>
         <w:tc>
           <w:tcPr>
-            <w:tcW w:type="dxa" w:w="6552"/>
+            <w:tcW w:type="dxa" w:w="7949"/>
             <w:tcMar>
-              <w:top w:w="55" w:type="dxa"/>
-              <w:bottom w:w="55" w:type="dxa"/>
+              <w:top w:w="45" w:type="dxa"/>
+              <w:bottom w:w="45" w:type="dxa"/>
               <w:left w:w="80" w:type="dxa"/>
               <w:right w:w="80" w:type="dxa"/>
             </w:tcMar>
@@ -2315,20 +1985,20 @@
                 <w:b w:val="0"/>
                 <w:i w:val="0"/>
                 <w:color w:val="1E293B"/>
-                <w:sz w:val="15"/>
+                <w:sz w:val="16"/>
               </w:rPr>
-              <w:t>C&amp;F কমিশন, বন্দর মাশুল (Port Bill), শিপিং বিল, ডক লেবার বিল ও হ্যান্ডলিং চার্জ</w:t>
+              <w:t>C&amp;F কমিশন / পোর্ট বিল / শিপিং বিল / লেবার বিল DK ও হ্যান্ডলিং চার্জ</w:t>
             </w:r>
           </w:p>
         </w:tc>
         <w:tc>
           <w:tcPr>
-            <w:tcW w:type="dxa" w:w="1800"/>
+            <w:tcW w:type="dxa" w:w="2016"/>
             <w:tcMar>
-              <w:top w:w="55" w:type="dxa"/>
-              <w:bottom w:w="55" w:type="dxa"/>
-              <w:left w:w="80" w:type="dxa"/>
-              <w:right w:w="80" w:type="dxa"/>
+              <w:top w:w="45" w:type="dxa"/>
+              <w:bottom w:w="45" w:type="dxa"/>
+              <w:left w:w="60" w:type="dxa"/>
+              <w:right w:w="60" w:type="dxa"/>
             </w:tcMar>
             <w:shd w:fill="F8FAFC"/>
             <w:tcBorders>
@@ -2348,44 +2018,9 @@
                 <w:rFonts w:ascii="Segoe UI" w:hAnsi="Segoe UI" w:cs="Kalpurush"/>
                 <w:b w:val="0"/>
                 <w:i w:val="0"/>
-                <w:color w:val="94A3B8"/>
-                <w:sz w:val="15"/>
+                <w:color w:val="1E293B"/>
+                <w:sz w:val="16"/>
               </w:rPr>
-              <w:t>..............................</w:t>
-            </w:r>
-          </w:p>
-        </w:tc>
-        <w:tc>
-          <w:tcPr>
-            <w:tcW w:type="dxa" w:w="1656"/>
-            <w:tcMar>
-              <w:top w:w="55" w:type="dxa"/>
-              <w:bottom w:w="55" w:type="dxa"/>
-              <w:left w:w="50" w:type="dxa"/>
-              <w:right w:w="50" w:type="dxa"/>
-            </w:tcMar>
-            <w:shd w:fill="F8FAFC"/>
-            <w:tcBorders>
-              <w:top w:val="single" w:sz="4" w:space="0" w:color="CBD5E1"/>
-              <w:bottom w:val="single" w:sz="4" w:space="0" w:color="CBD5E1"/>
-              <w:left w:val="single" w:sz="4" w:space="0" w:color="CBD5E1"/>
-              <w:right w:val="single" w:sz="4" w:space="0" w:color="CBD5E1"/>
-            </w:tcBorders>
-          </w:tcPr>
-          <w:p>
-            <w:pPr>
-              <w:spacing w:before="0" w:after="0"/>
-              <w:jc w:val="center"/>
-            </w:pPr>
-            <w:r>
-              <w:rPr>
-                <w:rFonts w:ascii="Segoe UI" w:hAnsi="Segoe UI" w:cs="Kalpurush"/>
-                <w:b w:val="0"/>
-                <w:i w:val="0"/>
-                <w:color w:val="94A3B8"/>
-                <w:sz w:val="15"/>
-              </w:rPr>
-              <w:t>......................</w:t>
             </w:r>
           </w:p>
         </w:tc>
@@ -2393,12 +2028,12 @@
       <w:tr>
         <w:tc>
           <w:tcPr>
-            <w:tcW w:type="dxa" w:w="605"/>
+            <w:tcW w:type="dxa" w:w="648"/>
             <w:tcMar>
-              <w:top w:w="55" w:type="dxa"/>
-              <w:bottom w:w="55" w:type="dxa"/>
-              <w:left w:w="50" w:type="dxa"/>
-              <w:right w:w="50" w:type="dxa"/>
+              <w:top w:w="45" w:type="dxa"/>
+              <w:bottom w:w="45" w:type="dxa"/>
+              <w:left w:w="40" w:type="dxa"/>
+              <w:right w:w="40" w:type="dxa"/>
             </w:tcMar>
             <w:shd w:fill="FFFFFF"/>
             <w:tcBorders>
@@ -2419,7 +2054,7 @@
                 <w:b/>
                 <w:i w:val="0"/>
                 <w:color w:val="0369A1"/>
-                <w:sz w:val="15"/>
+                <w:sz w:val="16"/>
               </w:rPr>
               <w:t>১১</w:t>
             </w:r>
@@ -2427,10 +2062,10 @@
         </w:tc>
         <w:tc>
           <w:tcPr>
-            <w:tcW w:type="dxa" w:w="6552"/>
+            <w:tcW w:type="dxa" w:w="7949"/>
             <w:tcMar>
-              <w:top w:w="55" w:type="dxa"/>
-              <w:bottom w:w="55" w:type="dxa"/>
+              <w:top w:w="45" w:type="dxa"/>
+              <w:bottom w:w="45" w:type="dxa"/>
               <w:left w:w="80" w:type="dxa"/>
               <w:right w:w="80" w:type="dxa"/>
             </w:tcMar>
@@ -2452,20 +2087,20 @@
                 <w:b w:val="0"/>
                 <w:i w:val="0"/>
                 <w:color w:val="1E293B"/>
-                <w:sz w:val="15"/>
+                <w:sz w:val="16"/>
               </w:rPr>
-              <w:t>ঘাট খেয়া পারাপার ও চ্যানেল পরিবহন খরচ</w:t>
+              <w:t>ভ্যাট (VAT)</w:t>
             </w:r>
           </w:p>
         </w:tc>
         <w:tc>
           <w:tcPr>
-            <w:tcW w:type="dxa" w:w="1800"/>
+            <w:tcW w:type="dxa" w:w="2016"/>
             <w:tcMar>
-              <w:top w:w="55" w:type="dxa"/>
-              <w:bottom w:w="55" w:type="dxa"/>
-              <w:left w:w="80" w:type="dxa"/>
-              <w:right w:w="80" w:type="dxa"/>
+              <w:top w:w="45" w:type="dxa"/>
+              <w:bottom w:w="45" w:type="dxa"/>
+              <w:left w:w="60" w:type="dxa"/>
+              <w:right w:w="60" w:type="dxa"/>
             </w:tcMar>
             <w:shd w:fill="FFFFFF"/>
             <w:tcBorders>
@@ -2485,44 +2120,9 @@
                 <w:rFonts w:ascii="Segoe UI" w:hAnsi="Segoe UI" w:cs="Kalpurush"/>
                 <w:b w:val="0"/>
                 <w:i w:val="0"/>
-                <w:color w:val="94A3B8"/>
-                <w:sz w:val="15"/>
+                <w:color w:val="1E293B"/>
+                <w:sz w:val="16"/>
               </w:rPr>
-              <w:t>..............................</w:t>
-            </w:r>
-          </w:p>
-        </w:tc>
-        <w:tc>
-          <w:tcPr>
-            <w:tcW w:type="dxa" w:w="1656"/>
-            <w:tcMar>
-              <w:top w:w="55" w:type="dxa"/>
-              <w:bottom w:w="55" w:type="dxa"/>
-              <w:left w:w="50" w:type="dxa"/>
-              <w:right w:w="50" w:type="dxa"/>
-            </w:tcMar>
-            <w:shd w:fill="FFFFFF"/>
-            <w:tcBorders>
-              <w:top w:val="single" w:sz="4" w:space="0" w:color="CBD5E1"/>
-              <w:bottom w:val="single" w:sz="4" w:space="0" w:color="CBD5E1"/>
-              <w:left w:val="single" w:sz="4" w:space="0" w:color="CBD5E1"/>
-              <w:right w:val="single" w:sz="4" w:space="0" w:color="CBD5E1"/>
-            </w:tcBorders>
-          </w:tcPr>
-          <w:p>
-            <w:pPr>
-              <w:spacing w:before="0" w:after="0"/>
-              <w:jc w:val="center"/>
-            </w:pPr>
-            <w:r>
-              <w:rPr>
-                <w:rFonts w:ascii="Segoe UI" w:hAnsi="Segoe UI" w:cs="Kalpurush"/>
-                <w:b w:val="0"/>
-                <w:i w:val="0"/>
-                <w:color w:val="94A3B8"/>
-                <w:sz w:val="15"/>
-              </w:rPr>
-              <w:t>......................</w:t>
             </w:r>
           </w:p>
         </w:tc>
@@ -2530,12 +2130,12 @@
       <w:tr>
         <w:tc>
           <w:tcPr>
-            <w:tcW w:type="dxa" w:w="605"/>
+            <w:tcW w:type="dxa" w:w="648"/>
             <w:tcMar>
-              <w:top w:w="55" w:type="dxa"/>
-              <w:bottom w:w="55" w:type="dxa"/>
-              <w:left w:w="50" w:type="dxa"/>
-              <w:right w:w="50" w:type="dxa"/>
+              <w:top w:w="45" w:type="dxa"/>
+              <w:bottom w:w="45" w:type="dxa"/>
+              <w:left w:w="40" w:type="dxa"/>
+              <w:right w:w="40" w:type="dxa"/>
             </w:tcMar>
             <w:shd w:fill="F8FAFC"/>
             <w:tcBorders>
@@ -2556,7 +2156,7 @@
                 <w:b/>
                 <w:i w:val="0"/>
                 <w:color w:val="0369A1"/>
-                <w:sz w:val="15"/>
+                <w:sz w:val="16"/>
               </w:rPr>
               <w:t>১২</w:t>
             </w:r>
@@ -2564,10 +2164,10 @@
         </w:tc>
         <w:tc>
           <w:tcPr>
-            <w:tcW w:type="dxa" w:w="6552"/>
+            <w:tcW w:type="dxa" w:w="7949"/>
             <w:tcMar>
-              <w:top w:w="55" w:type="dxa"/>
-              <w:bottom w:w="55" w:type="dxa"/>
+              <w:top w:w="45" w:type="dxa"/>
+              <w:bottom w:w="45" w:type="dxa"/>
               <w:left w:w="80" w:type="dxa"/>
               <w:right w:w="80" w:type="dxa"/>
             </w:tcMar>
@@ -2589,20 +2189,19 @@
                 <w:b w:val="0"/>
                 <w:i w:val="0"/>
                 <w:color w:val="1E293B"/>
-                <w:sz w:val="15"/>
+                <w:sz w:val="16"/>
               </w:rPr>
-              <w:t>বিবিধ আনুষঙ্গিক খরচ (অন্যান্য)</w:t>
             </w:r>
           </w:p>
         </w:tc>
         <w:tc>
           <w:tcPr>
-            <w:tcW w:type="dxa" w:w="1800"/>
+            <w:tcW w:type="dxa" w:w="2016"/>
             <w:tcMar>
-              <w:top w:w="55" w:type="dxa"/>
-              <w:bottom w:w="55" w:type="dxa"/>
-              <w:left w:w="80" w:type="dxa"/>
-              <w:right w:w="80" w:type="dxa"/>
+              <w:top w:w="45" w:type="dxa"/>
+              <w:bottom w:w="45" w:type="dxa"/>
+              <w:left w:w="60" w:type="dxa"/>
+              <w:right w:w="60" w:type="dxa"/>
             </w:tcMar>
             <w:shd w:fill="F8FAFC"/>
             <w:tcBorders>
@@ -2622,44 +2221,9 @@
                 <w:rFonts w:ascii="Segoe UI" w:hAnsi="Segoe UI" w:cs="Kalpurush"/>
                 <w:b w:val="0"/>
                 <w:i w:val="0"/>
-                <w:color w:val="94A3B8"/>
-                <w:sz w:val="15"/>
+                <w:color w:val="1E293B"/>
+                <w:sz w:val="16"/>
               </w:rPr>
-              <w:t>..............................</w:t>
-            </w:r>
-          </w:p>
-        </w:tc>
-        <w:tc>
-          <w:tcPr>
-            <w:tcW w:type="dxa" w:w="1656"/>
-            <w:tcMar>
-              <w:top w:w="55" w:type="dxa"/>
-              <w:bottom w:w="55" w:type="dxa"/>
-              <w:left w:w="50" w:type="dxa"/>
-              <w:right w:w="50" w:type="dxa"/>
-            </w:tcMar>
-            <w:shd w:fill="F8FAFC"/>
-            <w:tcBorders>
-              <w:top w:val="single" w:sz="4" w:space="0" w:color="CBD5E1"/>
-              <w:bottom w:val="single" w:sz="4" w:space="0" w:color="CBD5E1"/>
-              <w:left w:val="single" w:sz="4" w:space="0" w:color="CBD5E1"/>
-              <w:right w:val="single" w:sz="4" w:space="0" w:color="CBD5E1"/>
-            </w:tcBorders>
-          </w:tcPr>
-          <w:p>
-            <w:pPr>
-              <w:spacing w:before="0" w:after="0"/>
-              <w:jc w:val="center"/>
-            </w:pPr>
-            <w:r>
-              <w:rPr>
-                <w:rFonts w:ascii="Segoe UI" w:hAnsi="Segoe UI" w:cs="Kalpurush"/>
-                <w:b w:val="0"/>
-                <w:i w:val="0"/>
-                <w:color w:val="94A3B8"/>
-                <w:sz w:val="15"/>
-              </w:rPr>
-              <w:t>......................</w:t>
             </w:r>
           </w:p>
         </w:tc>
@@ -2667,12 +2231,12 @@
       <w:tr>
         <w:tc>
           <w:tcPr>
-            <w:tcW w:type="dxa" w:w="605"/>
+            <w:tcW w:type="dxa" w:w="648"/>
             <w:tcMar>
-              <w:top w:w="55" w:type="dxa"/>
-              <w:bottom w:w="55" w:type="dxa"/>
-              <w:left w:w="50" w:type="dxa"/>
-              <w:right w:w="50" w:type="dxa"/>
+              <w:top w:w="45" w:type="dxa"/>
+              <w:bottom w:w="45" w:type="dxa"/>
+              <w:left w:w="40" w:type="dxa"/>
+              <w:right w:w="40" w:type="dxa"/>
             </w:tcMar>
             <w:shd w:fill="FFFFFF"/>
             <w:tcBorders>
@@ -2693,7 +2257,7 @@
                 <w:b/>
                 <w:i w:val="0"/>
                 <w:color w:val="0369A1"/>
-                <w:sz w:val="15"/>
+                <w:sz w:val="16"/>
               </w:rPr>
               <w:t>১৩</w:t>
             </w:r>
@@ -2701,10 +2265,10 @@
         </w:tc>
         <w:tc>
           <w:tcPr>
-            <w:tcW w:type="dxa" w:w="6552"/>
+            <w:tcW w:type="dxa" w:w="7949"/>
             <w:tcMar>
-              <w:top w:w="55" w:type="dxa"/>
-              <w:bottom w:w="55" w:type="dxa"/>
+              <w:top w:w="45" w:type="dxa"/>
+              <w:bottom w:w="45" w:type="dxa"/>
               <w:left w:w="80" w:type="dxa"/>
               <w:right w:w="80" w:type="dxa"/>
             </w:tcMar>
@@ -2726,20 +2290,19 @@
                 <w:b w:val="0"/>
                 <w:i w:val="0"/>
                 <w:color w:val="1E293B"/>
-                <w:sz w:val="15"/>
+                <w:sz w:val="16"/>
               </w:rPr>
-              <w:t>অতিরিক্ত খাত (প্রয়োজন অনুযায়ী কাস্টম এন্ট্রি)</w:t>
             </w:r>
           </w:p>
         </w:tc>
         <w:tc>
           <w:tcPr>
-            <w:tcW w:type="dxa" w:w="1800"/>
+            <w:tcW w:type="dxa" w:w="2016"/>
             <w:tcMar>
-              <w:top w:w="55" w:type="dxa"/>
-              <w:bottom w:w="55" w:type="dxa"/>
-              <w:left w:w="80" w:type="dxa"/>
-              <w:right w:w="80" w:type="dxa"/>
+              <w:top w:w="45" w:type="dxa"/>
+              <w:bottom w:w="45" w:type="dxa"/>
+              <w:left w:w="60" w:type="dxa"/>
+              <w:right w:w="60" w:type="dxa"/>
             </w:tcMar>
             <w:shd w:fill="FFFFFF"/>
             <w:tcBorders>
@@ -2759,21 +2322,123 @@
                 <w:rFonts w:ascii="Segoe UI" w:hAnsi="Segoe UI" w:cs="Kalpurush"/>
                 <w:b w:val="0"/>
                 <w:i w:val="0"/>
-                <w:color w:val="94A3B8"/>
-                <w:sz w:val="15"/>
+                <w:color w:val="1E293B"/>
+                <w:sz w:val="16"/>
               </w:rPr>
-              <w:t>..............................</w:t>
+            </w:r>
+          </w:p>
+        </w:tc>
+      </w:tr>
+      <w:tr>
+        <w:tc>
+          <w:tcPr>
+            <w:tcW w:type="dxa" w:w="648"/>
+            <w:tcMar>
+              <w:top w:w="45" w:type="dxa"/>
+              <w:bottom w:w="45" w:type="dxa"/>
+              <w:left w:w="40" w:type="dxa"/>
+              <w:right w:w="40" w:type="dxa"/>
+            </w:tcMar>
+            <w:shd w:fill="F8FAFC"/>
+            <w:tcBorders>
+              <w:top w:val="single" w:sz="4" w:space="0" w:color="CBD5E1"/>
+              <w:bottom w:val="single" w:sz="4" w:space="0" w:color="CBD5E1"/>
+              <w:left w:val="single" w:sz="4" w:space="0" w:color="CBD5E1"/>
+              <w:right w:val="single" w:sz="4" w:space="0" w:color="CBD5E1"/>
+            </w:tcBorders>
+          </w:tcPr>
+          <w:p>
+            <w:pPr>
+              <w:spacing w:before="0" w:after="0"/>
+              <w:jc w:val="center"/>
+            </w:pPr>
+            <w:r>
+              <w:rPr>
+                <w:rFonts w:ascii="Segoe UI" w:hAnsi="Segoe UI" w:cs="Kalpurush"/>
+                <w:b/>
+                <w:i w:val="0"/>
+                <w:color w:val="0369A1"/>
+                <w:sz w:val="16"/>
+              </w:rPr>
+              <w:t>১৪</w:t>
             </w:r>
           </w:p>
         </w:tc>
         <w:tc>
           <w:tcPr>
-            <w:tcW w:type="dxa" w:w="1656"/>
+            <w:tcW w:type="dxa" w:w="7949"/>
             <w:tcMar>
-              <w:top w:w="55" w:type="dxa"/>
-              <w:bottom w:w="55" w:type="dxa"/>
-              <w:left w:w="50" w:type="dxa"/>
-              <w:right w:w="50" w:type="dxa"/>
+              <w:top w:w="45" w:type="dxa"/>
+              <w:bottom w:w="45" w:type="dxa"/>
+              <w:left w:w="80" w:type="dxa"/>
+              <w:right w:w="80" w:type="dxa"/>
+            </w:tcMar>
+            <w:shd w:fill="F8FAFC"/>
+            <w:tcBorders>
+              <w:top w:val="single" w:sz="4" w:space="0" w:color="CBD5E1"/>
+              <w:bottom w:val="single" w:sz="4" w:space="0" w:color="CBD5E1"/>
+              <w:left w:val="single" w:sz="4" w:space="0" w:color="CBD5E1"/>
+              <w:right w:val="single" w:sz="4" w:space="0" w:color="CBD5E1"/>
+            </w:tcBorders>
+          </w:tcPr>
+          <w:p>
+            <w:pPr>
+              <w:spacing w:before="0" w:after="0"/>
+            </w:pPr>
+            <w:r>
+              <w:rPr>
+                <w:rFonts w:ascii="Segoe UI" w:hAnsi="Segoe UI" w:cs="Kalpurush"/>
+                <w:b w:val="0"/>
+                <w:i w:val="0"/>
+                <w:color w:val="1E293B"/>
+                <w:sz w:val="16"/>
+              </w:rPr>
+            </w:r>
+          </w:p>
+        </w:tc>
+        <w:tc>
+          <w:tcPr>
+            <w:tcW w:type="dxa" w:w="2016"/>
+            <w:tcMar>
+              <w:top w:w="45" w:type="dxa"/>
+              <w:bottom w:w="45" w:type="dxa"/>
+              <w:left w:w="60" w:type="dxa"/>
+              <w:right w:w="60" w:type="dxa"/>
+            </w:tcMar>
+            <w:shd w:fill="F8FAFC"/>
+            <w:tcBorders>
+              <w:top w:val="single" w:sz="4" w:space="0" w:color="CBD5E1"/>
+              <w:bottom w:val="single" w:sz="4" w:space="0" w:color="CBD5E1"/>
+              <w:left w:val="single" w:sz="4" w:space="0" w:color="CBD5E1"/>
+              <w:right w:val="single" w:sz="4" w:space="0" w:color="CBD5E1"/>
+            </w:tcBorders>
+          </w:tcPr>
+          <w:p>
+            <w:pPr>
+              <w:spacing w:before="0" w:after="0"/>
+              <w:jc w:val="right"/>
+            </w:pPr>
+            <w:r>
+              <w:rPr>
+                <w:rFonts w:ascii="Segoe UI" w:hAnsi="Segoe UI" w:cs="Kalpurush"/>
+                <w:b w:val="0"/>
+                <w:i w:val="0"/>
+                <w:color w:val="1E293B"/>
+                <w:sz w:val="16"/>
+              </w:rPr>
+            </w:r>
+          </w:p>
+        </w:tc>
+      </w:tr>
+      <w:tr>
+        <w:tc>
+          <w:tcPr>
+            <w:tcW w:type="dxa" w:w="648"/>
+            <w:tcMar>
+              <w:top w:w="45" w:type="dxa"/>
+              <w:bottom w:w="45" w:type="dxa"/>
+              <w:left w:w="40" w:type="dxa"/>
+              <w:right w:w="40" w:type="dxa"/>
             </w:tcMar>
             <w:shd w:fill="FFFFFF"/>
             <w:tcBorders>
@@ -2791,12 +2456,77 @@
             <w:r>
               <w:rPr>
                 <w:rFonts w:ascii="Segoe UI" w:hAnsi="Segoe UI" w:cs="Kalpurush"/>
+                <w:b/>
+                <w:i w:val="0"/>
+                <w:color w:val="0369A1"/>
+                <w:sz w:val="16"/>
+              </w:rPr>
+              <w:t>১৫</w:t>
+            </w:r>
+          </w:p>
+        </w:tc>
+        <w:tc>
+          <w:tcPr>
+            <w:tcW w:type="dxa" w:w="7949"/>
+            <w:tcMar>
+              <w:top w:w="45" w:type="dxa"/>
+              <w:bottom w:w="45" w:type="dxa"/>
+              <w:left w:w="80" w:type="dxa"/>
+              <w:right w:w="80" w:type="dxa"/>
+            </w:tcMar>
+            <w:shd w:fill="FFFFFF"/>
+            <w:tcBorders>
+              <w:top w:val="single" w:sz="4" w:space="0" w:color="CBD5E1"/>
+              <w:bottom w:val="single" w:sz="4" w:space="0" w:color="CBD5E1"/>
+              <w:left w:val="single" w:sz="4" w:space="0" w:color="CBD5E1"/>
+              <w:right w:val="single" w:sz="4" w:space="0" w:color="CBD5E1"/>
+            </w:tcBorders>
+          </w:tcPr>
+          <w:p>
+            <w:pPr>
+              <w:spacing w:before="0" w:after="0"/>
+            </w:pPr>
+            <w:r>
+              <w:rPr>
+                <w:rFonts w:ascii="Segoe UI" w:hAnsi="Segoe UI" w:cs="Kalpurush"/>
                 <w:b w:val="0"/>
                 <w:i w:val="0"/>
-                <w:color w:val="94A3B8"/>
-                <w:sz w:val="15"/>
+                <w:color w:val="1E293B"/>
+                <w:sz w:val="16"/>
               </w:rPr>
-              <w:t>......................</w:t>
+            </w:r>
+          </w:p>
+        </w:tc>
+        <w:tc>
+          <w:tcPr>
+            <w:tcW w:type="dxa" w:w="2016"/>
+            <w:tcMar>
+              <w:top w:w="45" w:type="dxa"/>
+              <w:bottom w:w="45" w:type="dxa"/>
+              <w:left w:w="60" w:type="dxa"/>
+              <w:right w:w="60" w:type="dxa"/>
+            </w:tcMar>
+            <w:shd w:fill="FFFFFF"/>
+            <w:tcBorders>
+              <w:top w:val="single" w:sz="4" w:space="0" w:color="CBD5E1"/>
+              <w:bottom w:val="single" w:sz="4" w:space="0" w:color="CBD5E1"/>
+              <w:left w:val="single" w:sz="4" w:space="0" w:color="CBD5E1"/>
+              <w:right w:val="single" w:sz="4" w:space="0" w:color="CBD5E1"/>
+            </w:tcBorders>
+          </w:tcPr>
+          <w:p>
+            <w:pPr>
+              <w:spacing w:before="0" w:after="0"/>
+              <w:jc w:val="right"/>
+            </w:pPr>
+            <w:r>
+              <w:rPr>
+                <w:rFonts w:ascii="Segoe UI" w:hAnsi="Segoe UI" w:cs="Kalpurush"/>
+                <w:b w:val="0"/>
+                <w:i w:val="0"/>
+                <w:color w:val="1E293B"/>
+                <w:sz w:val="16"/>
+              </w:rPr>
             </w:r>
           </w:p>
         </w:tc>
@@ -2804,18 +2534,119 @@
       <w:tr>
         <w:tc>
           <w:tcPr>
-            <w:tcW w:type="dxa" w:w="5306"/>
+            <w:tcW w:type="dxa" w:w="648"/>
+            <w:tcMar>
+              <w:top w:w="45" w:type="dxa"/>
+              <w:bottom w:w="45" w:type="dxa"/>
+              <w:left w:w="40" w:type="dxa"/>
+              <w:right w:w="40" w:type="dxa"/>
+            </w:tcMar>
+            <w:shd w:fill="F8FAFC"/>
+            <w:tcBorders>
+              <w:top w:val="single" w:sz="4" w:space="0" w:color="CBD5E1"/>
+              <w:bottom w:val="single" w:sz="4" w:space="0" w:color="CBD5E1"/>
+              <w:left w:val="single" w:sz="4" w:space="0" w:color="CBD5E1"/>
+              <w:right w:val="single" w:sz="4" w:space="0" w:color="CBD5E1"/>
+            </w:tcBorders>
+          </w:tcPr>
+          <w:p>
+            <w:pPr>
+              <w:spacing w:before="0" w:after="0"/>
+              <w:jc w:val="center"/>
+            </w:pPr>
+            <w:r>
+              <w:rPr>
+                <w:rFonts w:ascii="Segoe UI" w:hAnsi="Segoe UI" w:cs="Kalpurush"/>
+                <w:b/>
+                <w:i w:val="0"/>
+                <w:color w:val="0369A1"/>
+                <w:sz w:val="16"/>
+              </w:rPr>
+              <w:t>১৬</w:t>
+            </w:r>
+          </w:p>
+        </w:tc>
+        <w:tc>
+          <w:tcPr>
+            <w:tcW w:type="dxa" w:w="7949"/>
+            <w:tcMar>
+              <w:top w:w="45" w:type="dxa"/>
+              <w:bottom w:w="45" w:type="dxa"/>
+              <w:left w:w="80" w:type="dxa"/>
+              <w:right w:w="80" w:type="dxa"/>
+            </w:tcMar>
+            <w:shd w:fill="F8FAFC"/>
+            <w:tcBorders>
+              <w:top w:val="single" w:sz="4" w:space="0" w:color="CBD5E1"/>
+              <w:bottom w:val="single" w:sz="4" w:space="0" w:color="CBD5E1"/>
+              <w:left w:val="single" w:sz="4" w:space="0" w:color="CBD5E1"/>
+              <w:right w:val="single" w:sz="4" w:space="0" w:color="CBD5E1"/>
+            </w:tcBorders>
+          </w:tcPr>
+          <w:p>
+            <w:pPr>
+              <w:spacing w:before="0" w:after="0"/>
+            </w:pPr>
+            <w:r>
+              <w:rPr>
+                <w:rFonts w:ascii="Segoe UI" w:hAnsi="Segoe UI" w:cs="Kalpurush"/>
+                <w:b w:val="0"/>
+                <w:i w:val="0"/>
+                <w:color w:val="1E293B"/>
+                <w:sz w:val="16"/>
+              </w:rPr>
+            </w:r>
+          </w:p>
+        </w:tc>
+        <w:tc>
+          <w:tcPr>
+            <w:tcW w:type="dxa" w:w="2016"/>
+            <w:tcMar>
+              <w:top w:w="45" w:type="dxa"/>
+              <w:bottom w:w="45" w:type="dxa"/>
+              <w:left w:w="60" w:type="dxa"/>
+              <w:right w:w="60" w:type="dxa"/>
+            </w:tcMar>
+            <w:shd w:fill="F8FAFC"/>
+            <w:tcBorders>
+              <w:top w:val="single" w:sz="4" w:space="0" w:color="CBD5E1"/>
+              <w:bottom w:val="single" w:sz="4" w:space="0" w:color="CBD5E1"/>
+              <w:left w:val="single" w:sz="4" w:space="0" w:color="CBD5E1"/>
+              <w:right w:val="single" w:sz="4" w:space="0" w:color="CBD5E1"/>
+            </w:tcBorders>
+          </w:tcPr>
+          <w:p>
+            <w:pPr>
+              <w:spacing w:before="0" w:after="0"/>
+              <w:jc w:val="right"/>
+            </w:pPr>
+            <w:r>
+              <w:rPr>
+                <w:rFonts w:ascii="Segoe UI" w:hAnsi="Segoe UI" w:cs="Kalpurush"/>
+                <w:b w:val="0"/>
+                <w:i w:val="0"/>
+                <w:color w:val="1E293B"/>
+                <w:sz w:val="16"/>
+              </w:rPr>
+            </w:r>
+          </w:p>
+        </w:tc>
+      </w:tr>
+      <w:tr>
+        <w:tc>
+          <w:tcPr>
+            <w:tcW w:type="dxa" w:w="7076"/>
             <w:gridSpan w:val="2"/>
             <w:tcMar>
-              <w:top w:w="65" w:type="dxa"/>
-              <w:bottom w:w="65" w:type="dxa"/>
+              <w:top w:w="60" w:type="dxa"/>
+              <w:bottom w:w="60" w:type="dxa"/>
               <w:left w:w="80" w:type="dxa"/>
               <w:right w:w="80" w:type="dxa"/>
             </w:tcMar>
             <w:shd w:fill="E0F2FE"/>
             <w:tcBorders>
               <w:top w:val="single" w:sz="6" w:space="0" w:color="0369A1"/>
-              <w:bottom w:val="single" w:sz="6" w:space="0" w:color="94A3B8"/>
+              <w:bottom w:val="single" w:sz="6" w:space="0" w:color="0369A1"/>
               <w:left w:val="single" w:sz="6" w:space="0" w:color="CBD5E1"/>
               <w:right w:val="single" w:sz="6" w:space="0" w:color="CBD5E1"/>
             </w:tcBorders>
@@ -2831,7 +2662,7 @@
                 <w:b/>
                 <w:i w:val="0"/>
                 <w:color w:val="0369A1"/>
-                <w:sz w:val="16"/>
+                <w:sz w:val="17"/>
               </w:rPr>
               <w:t>প্রতি কন্টেইনার সর্বমোট খালাস খরচ (TOTAL EXPENSES):</w:t>
             </w:r>
@@ -2839,17 +2670,17 @@
         </w:tc>
         <w:tc>
           <w:tcPr>
-            <w:tcW w:type="dxa" w:w="2653"/>
+            <w:tcW w:type="dxa" w:w="3538"/>
             <w:tcMar>
-              <w:top w:w="65" w:type="dxa"/>
-              <w:bottom w:w="65" w:type="dxa"/>
-              <w:left w:w="80" w:type="dxa"/>
-              <w:right w:w="80" w:type="dxa"/>
+              <w:top w:w="60" w:type="dxa"/>
+              <w:bottom w:w="60" w:type="dxa"/>
+              <w:left w:w="60" w:type="dxa"/>
+              <w:right w:w="60" w:type="dxa"/>
             </w:tcMar>
             <w:shd w:fill="E0F2FE"/>
             <w:tcBorders>
               <w:top w:val="single" w:sz="6" w:space="0" w:color="0369A1"/>
-              <w:bottom w:val="single" w:sz="6" w:space="0" w:color="94A3B8"/>
+              <w:bottom w:val="single" w:sz="6" w:space="0" w:color="0369A1"/>
               <w:left w:val="single" w:sz="6" w:space="0" w:color="CBD5E1"/>
               <w:right w:val="single" w:sz="6" w:space="0" w:color="CBD5E1"/>
             </w:tcBorders>
@@ -2865,248 +2696,9 @@
                 <w:b/>
                 <w:i w:val="0"/>
                 <w:color w:val="0369A1"/>
-                <w:sz w:val="16"/>
-              </w:rPr>
-              <w:t xml:space="preserve">= TK            </w:t>
-            </w:r>
-          </w:p>
-        </w:tc>
-        <w:tc>
-          <w:tcPr>
-            <w:tcW w:type="dxa" w:w="2653"/>
-            <w:tcMar>
-              <w:top w:w="65" w:type="dxa"/>
-              <w:bottom w:w="65" w:type="dxa"/>
-              <w:left w:w="50" w:type="dxa"/>
-              <w:right w:w="50" w:type="dxa"/>
-            </w:tcMar>
-            <w:shd w:fill="E0F2FE"/>
-            <w:tcBorders>
-              <w:top w:val="single" w:sz="6" w:space="0" w:color="0369A1"/>
-              <w:bottom w:val="single" w:sz="6" w:space="0" w:color="94A3B8"/>
-              <w:left w:val="single" w:sz="6" w:space="0" w:color="CBD5E1"/>
-              <w:right w:val="single" w:sz="6" w:space="0" w:color="CBD5E1"/>
-            </w:tcBorders>
-          </w:tcPr>
-          <w:p>
-            <w:pPr>
-              <w:jc w:val="center"/>
-            </w:pPr>
-            <w:r>
-              <w:rPr>
-                <w:rFonts w:ascii="Segoe UI" w:hAnsi="Segoe UI" w:cs="Kalpurush"/>
-                <w:b/>
-                <w:i w:val="0"/>
-                <w:color w:val="0369A1"/>
-                <w:sz w:val="14"/>
-              </w:rPr>
-              <w:t>সর্বমোট ব্যয়</w:t>
-            </w:r>
-          </w:p>
-        </w:tc>
-      </w:tr>
-      <w:tr>
-        <w:tc>
-          <w:tcPr>
-            <w:tcW w:type="dxa" w:w="5306"/>
-            <w:gridSpan w:val="2"/>
-            <w:tcMar>
-              <w:top w:w="60" w:type="dxa"/>
-              <w:bottom w:w="60" w:type="dxa"/>
-              <w:left w:w="80" w:type="dxa"/>
-              <w:right w:w="80" w:type="dxa"/>
-            </w:tcMar>
-            <w:shd w:fill="F0FDF4"/>
-            <w:tcBorders>
-              <w:top w:val="single" w:sz="4" w:space="0" w:color="94A3B8"/>
-              <w:bottom w:val="single" w:sz="4" w:space="0" w:color="94A3B8"/>
-              <w:left w:val="single" w:sz="4" w:space="0" w:color="CBD5E1"/>
-              <w:right w:val="single" w:sz="4" w:space="0" w:color="CBD5E1"/>
-            </w:tcBorders>
-          </w:tcPr>
-          <w:p>
-            <w:pPr>
-              <w:spacing w:before="0" w:after="0"/>
-              <w:jc w:val="right"/>
-            </w:pPr>
-            <w:r>
-              <w:rPr>
-                <w:rFonts w:ascii="Segoe UI" w:hAnsi="Segoe UI" w:cs="Kalpurush"/>
-                <w:b/>
-                <w:i w:val="0"/>
-                <w:color w:val="166534"/>
-                <w:sz w:val="16"/>
-              </w:rPr>
-              <w:t>বাদ: প্রাপ্ত নগদ / ব্যাংক অগ্রিম জমা (Less: Advance Received):</w:t>
-            </w:r>
-          </w:p>
-        </w:tc>
-        <w:tc>
-          <w:tcPr>
-            <w:tcW w:type="dxa" w:w="2653"/>
-            <w:tcMar>
-              <w:top w:w="60" w:type="dxa"/>
-              <w:bottom w:w="60" w:type="dxa"/>
-              <w:left w:w="80" w:type="dxa"/>
-              <w:right w:w="80" w:type="dxa"/>
-            </w:tcMar>
-            <w:shd w:fill="F0FDF4"/>
-            <w:tcBorders>
-              <w:top w:val="single" w:sz="4" w:space="0" w:color="94A3B8"/>
-              <w:bottom w:val="single" w:sz="4" w:space="0" w:color="94A3B8"/>
-              <w:left w:val="single" w:sz="4" w:space="0" w:color="CBD5E1"/>
-              <w:right w:val="single" w:sz="4" w:space="0" w:color="CBD5E1"/>
-            </w:tcBorders>
-          </w:tcPr>
-          <w:p>
-            <w:pPr>
-              <w:jc w:val="right"/>
-            </w:pPr>
-            <w:r>
-              <w:rPr>
-                <w:rFonts w:ascii="Segoe UI" w:hAnsi="Segoe UI" w:cs="Kalpurush"/>
-                <w:b w:val="0"/>
-                <w:i w:val="0"/>
-                <w:color w:val="94A3B8"/>
-                <w:sz w:val="15"/>
-              </w:rPr>
-              <w:t>..............................</w:t>
-            </w:r>
-          </w:p>
-        </w:tc>
-        <w:tc>
-          <w:tcPr>
-            <w:tcW w:type="dxa" w:w="2653"/>
-            <w:tcMar>
-              <w:top w:w="60" w:type="dxa"/>
-              <w:bottom w:w="60" w:type="dxa"/>
-              <w:left w:w="50" w:type="dxa"/>
-              <w:right w:w="50" w:type="dxa"/>
-            </w:tcMar>
-            <w:shd w:fill="F0FDF4"/>
-            <w:tcBorders>
-              <w:top w:val="single" w:sz="4" w:space="0" w:color="94A3B8"/>
-              <w:bottom w:val="single" w:sz="4" w:space="0" w:color="94A3B8"/>
-              <w:left w:val="single" w:sz="4" w:space="0" w:color="CBD5E1"/>
-              <w:right w:val="single" w:sz="4" w:space="0" w:color="CBD5E1"/>
-            </w:tcBorders>
-          </w:tcPr>
-          <w:p>
-            <w:pPr>
-              <w:jc w:val="center"/>
-            </w:pPr>
-            <w:r>
-              <w:rPr>
-                <w:rFonts w:ascii="Segoe UI" w:hAnsi="Segoe UI" w:cs="Kalpurush"/>
-                <w:b/>
-                <w:i w:val="0"/>
-                <w:color w:val="166534"/>
-                <w:sz w:val="14"/>
-              </w:rPr>
-              <w:t>জমা / ক্রেডিট (+)</w:t>
-            </w:r>
-          </w:p>
-        </w:tc>
-      </w:tr>
-      <w:tr>
-        <w:tc>
-          <w:tcPr>
-            <w:tcW w:type="dxa" w:w="5306"/>
-            <w:gridSpan w:val="2"/>
-            <w:tcMar>
-              <w:top w:w="65" w:type="dxa"/>
-              <w:bottom w:w="65" w:type="dxa"/>
-              <w:left w:w="80" w:type="dxa"/>
-              <w:right w:w="80" w:type="dxa"/>
-            </w:tcMar>
-            <w:shd w:fill="FEF2F2"/>
-            <w:tcBorders>
-              <w:top w:val="single" w:sz="6" w:space="0" w:color="94A3B8"/>
-              <w:bottom w:val="single" w:sz="6" w:space="0" w:color="DC2626"/>
-              <w:left w:val="single" w:sz="6" w:space="0" w:color="CBD5E1"/>
-              <w:right w:val="single" w:sz="6" w:space="0" w:color="CBD5E1"/>
-            </w:tcBorders>
-          </w:tcPr>
-          <w:p>
-            <w:pPr>
-              <w:spacing w:before="0" w:after="0"/>
-              <w:jc w:val="right"/>
-            </w:pPr>
-            <w:r>
-              <w:rPr>
-                <w:rFonts w:ascii="Segoe UI" w:hAnsi="Segoe UI" w:cs="Kalpurush"/>
-                <w:b/>
-                <w:i w:val="0"/>
-                <w:color w:val="DC2626"/>
-                <w:sz w:val="17"/>
-              </w:rPr>
-              <w:t>সর্বমোট নিট অবশিষ্ট বকেয়া / ব্যালেন্স (TOTAL NET BALANCE DUE):</w:t>
-            </w:r>
-          </w:p>
-        </w:tc>
-        <w:tc>
-          <w:tcPr>
-            <w:tcW w:type="dxa" w:w="2653"/>
-            <w:tcMar>
-              <w:top w:w="65" w:type="dxa"/>
-              <w:bottom w:w="65" w:type="dxa"/>
-              <w:left w:w="80" w:type="dxa"/>
-              <w:right w:w="80" w:type="dxa"/>
-            </w:tcMar>
-            <w:shd w:fill="FEF2F2"/>
-            <w:tcBorders>
-              <w:top w:val="single" w:sz="6" w:space="0" w:color="94A3B8"/>
-              <w:bottom w:val="single" w:sz="6" w:space="0" w:color="DC2626"/>
-              <w:left w:val="single" w:sz="6" w:space="0" w:color="CBD5E1"/>
-              <w:right w:val="single" w:sz="6" w:space="0" w:color="CBD5E1"/>
-            </w:tcBorders>
-          </w:tcPr>
-          <w:p>
-            <w:pPr>
-              <w:jc w:val="right"/>
-            </w:pPr>
-            <w:r>
-              <w:rPr>
-                <w:rFonts w:ascii="Segoe UI" w:hAnsi="Segoe UI" w:cs="Kalpurush"/>
-                <w:b/>
-                <w:i w:val="0"/>
-                <w:color w:val="DC2626"/>
                 <w:sz w:val="17"/>
               </w:rPr>
               <w:t xml:space="preserve">= TK            </w:t>
-            </w:r>
-          </w:p>
-        </w:tc>
-        <w:tc>
-          <w:tcPr>
-            <w:tcW w:type="dxa" w:w="2653"/>
-            <w:tcMar>
-              <w:top w:w="65" w:type="dxa"/>
-              <w:bottom w:w="65" w:type="dxa"/>
-              <w:left w:w="50" w:type="dxa"/>
-              <w:right w:w="50" w:type="dxa"/>
-            </w:tcMar>
-            <w:shd w:fill="FEF2F2"/>
-            <w:tcBorders>
-              <w:top w:val="single" w:sz="6" w:space="0" w:color="94A3B8"/>
-              <w:bottom w:val="single" w:sz="6" w:space="0" w:color="DC2626"/>
-              <w:left w:val="single" w:sz="6" w:space="0" w:color="CBD5E1"/>
-              <w:right w:val="single" w:sz="6" w:space="0" w:color="CBD5E1"/>
-            </w:tcBorders>
-          </w:tcPr>
-          <w:p>
-            <w:pPr>
-              <w:jc w:val="center"/>
-            </w:pPr>
-            <w:r>
-              <w:rPr>
-                <w:rFonts w:ascii="Segoe UI" w:hAnsi="Segoe UI" w:cs="Kalpurush"/>
-                <w:b/>
-                <w:i w:val="0"/>
-                <w:color w:val="DC2626"/>
-                <w:sz w:val="14"/>
-              </w:rPr>
-              <w:t>নিট বকেয়া (-)</w:t>
             </w:r>
           </w:p>
         </w:tc>
@@ -3114,7 +2706,7 @@
     </w:tbl>
     <w:p>
       <w:pPr>
-        <w:spacing w:before="100" w:after="160"/>
+        <w:spacing w:before="120" w:after="160"/>
       </w:pPr>
       <w:r>
         <w:rPr>
@@ -3122,7 +2714,7 @@
           <w:b/>
           <w:i w:val="0"/>
           <w:color w:val="0369A1"/>
-          <w:sz w:val="16"/>
+          <w:sz w:val="17"/>
         </w:rPr>
         <w:t xml:space="preserve">কথায় (In Words): </w:t>
       </w:r>
@@ -3134,7 +2726,7 @@
           <w:color w:val="94A3B8"/>
           <w:sz w:val="16"/>
         </w:rPr>
-        <w:t>................................................................................................................................................................... টাকা মাত্র।</w:t>
+        <w:t>.......................................................................................................................................................................................................... টাকা মাত্র।</w:t>
       </w:r>
     </w:p>
     <w:tbl>

</xml_diff>